<commit_message>
Atualização da Documentação Terceira Edição e Implementação do check password pra ver a senha
</commit_message>
<xml_diff>
--- a/Documentação/Terceira Edição/TCC - Documentação.docx
+++ b/Documentação/Terceira Edição/TCC - Documentação.docx
@@ -607,7 +607,21 @@
         <w:rPr>
           <w:szCs w:val="24"/>
         </w:rPr>
-        <w:t xml:space="preserve"> Escola Técnica Estadual Ilza Nascimento Pintus como requisito para conclusão do curso de Desenvolvimento de Sistemas</w:t>
+        <w:t xml:space="preserve"> Escola Técnica Estadual Ilza Nascimento </w:t>
+      </w:r>
+      <w:proofErr w:type="spellStart"/>
+      <w:r>
+        <w:rPr>
+          <w:szCs w:val="24"/>
+        </w:rPr>
+        <w:t>Pintus</w:t>
+      </w:r>
+      <w:proofErr w:type="spellEnd"/>
+      <w:r>
+        <w:rPr>
+          <w:szCs w:val="24"/>
+        </w:rPr>
+        <w:t xml:space="preserve"> como requisito para conclusão do curso de Desenvolvimento de Sistemas</w:t>
       </w:r>
     </w:p>
     <w:p>
@@ -631,7 +645,21 @@
         <w:rPr>
           <w:szCs w:val="24"/>
         </w:rPr>
-        <w:t>Orientador: Prof. Cláudio Lopes Ferrini Garcia</w:t>
+        <w:t xml:space="preserve">Orientador: Prof. Cláudio Lopes </w:t>
+      </w:r>
+      <w:proofErr w:type="spellStart"/>
+      <w:r>
+        <w:rPr>
+          <w:szCs w:val="24"/>
+        </w:rPr>
+        <w:t>Ferrini</w:t>
+      </w:r>
+      <w:proofErr w:type="spellEnd"/>
+      <w:r>
+        <w:rPr>
+          <w:szCs w:val="24"/>
+        </w:rPr>
+        <w:t xml:space="preserve"> Garcia</w:t>
       </w:r>
     </w:p>
     <w:p>
@@ -872,7 +900,49 @@
         <w:rPr>
           <w:szCs w:val="24"/>
         </w:rPr>
-        <w:t xml:space="preserve">o exploratório, o descritivo e o aplicado, combinando pesquisas bibliográficas com o desenvolvimento incremental do sistema. O projeto adota tecnologias como Node.js com Express.js no back-end, HTML, CSS e JavaScript no front-end, e MySQL como banco de dados. </w:t>
+        <w:t xml:space="preserve">o exploratório, o descritivo e o aplicado, combinando pesquisas bibliográficas com o desenvolvimento incremental do sistema. O projeto adota tecnologias como Node.js com Express.js no </w:t>
+      </w:r>
+      <w:proofErr w:type="spellStart"/>
+      <w:r>
+        <w:rPr>
+          <w:szCs w:val="24"/>
+        </w:rPr>
+        <w:t>back-end</w:t>
+      </w:r>
+      <w:proofErr w:type="spellEnd"/>
+      <w:r>
+        <w:rPr>
+          <w:szCs w:val="24"/>
+        </w:rPr>
+        <w:t xml:space="preserve">, HTML, CSS e </w:t>
+      </w:r>
+      <w:proofErr w:type="spellStart"/>
+      <w:r>
+        <w:rPr>
+          <w:szCs w:val="24"/>
+        </w:rPr>
+        <w:t>JavaScript</w:t>
+      </w:r>
+      <w:proofErr w:type="spellEnd"/>
+      <w:r>
+        <w:rPr>
+          <w:szCs w:val="24"/>
+        </w:rPr>
+        <w:t xml:space="preserve"> no front-</w:t>
+      </w:r>
+      <w:proofErr w:type="spellStart"/>
+      <w:r>
+        <w:rPr>
+          <w:szCs w:val="24"/>
+        </w:rPr>
+        <w:t>end</w:t>
+      </w:r>
+      <w:proofErr w:type="spellEnd"/>
+      <w:r>
+        <w:rPr>
+          <w:szCs w:val="24"/>
+        </w:rPr>
+        <w:t xml:space="preserve">, e MySQL como banco de dados. </w:t>
       </w:r>
       <w:r>
         <w:rPr>
@@ -1592,6 +1662,148 @@
           <w:bCs/>
           <w:szCs w:val="24"/>
         </w:rPr>
+        <w:t>7</w:t>
+      </w:r>
+    </w:p>
+    <w:p>
+      <w:pPr>
+        <w:spacing w:line="360" w:lineRule="auto"/>
+        <w:rPr>
+          <w:b/>
+          <w:bCs/>
+          <w:szCs w:val="24"/>
+        </w:rPr>
+      </w:pPr>
+      <w:r>
+        <w:rPr>
+          <w:b/>
+          <w:bCs/>
+          <w:szCs w:val="24"/>
+        </w:rPr>
+        <w:t>8 DIAGRAMA DE CASOS DE USO</w:t>
+      </w:r>
+      <w:r>
+        <w:rPr>
+          <w:b/>
+          <w:bCs/>
+          <w:szCs w:val="24"/>
+        </w:rPr>
+        <w:ptab w:relativeTo="margin" w:alignment="right" w:leader="dot"/>
+      </w:r>
+      <w:r>
+        <w:rPr>
+          <w:b/>
+          <w:bCs/>
+          <w:szCs w:val="24"/>
+        </w:rPr>
+        <w:t>1</w:t>
+      </w:r>
+      <w:r>
+        <w:rPr>
+          <w:b/>
+          <w:bCs/>
+          <w:szCs w:val="24"/>
+        </w:rPr>
+        <w:t>5</w:t>
+      </w:r>
+    </w:p>
+    <w:p>
+      <w:pPr>
+        <w:spacing w:line="360" w:lineRule="auto"/>
+        <w:rPr>
+          <w:b/>
+          <w:bCs/>
+          <w:szCs w:val="24"/>
+        </w:rPr>
+      </w:pPr>
+      <w:r>
+        <w:rPr>
+          <w:b/>
+          <w:bCs/>
+          <w:szCs w:val="24"/>
+        </w:rPr>
+        <w:t>9 TECNOLOGIAS ADOTADAS</w:t>
+      </w:r>
+      <w:r>
+        <w:rPr>
+          <w:b/>
+          <w:bCs/>
+          <w:szCs w:val="24"/>
+        </w:rPr>
+        <w:ptab w:relativeTo="margin" w:alignment="right" w:leader="dot"/>
+      </w:r>
+      <w:r>
+        <w:rPr>
+          <w:b/>
+          <w:bCs/>
+          <w:szCs w:val="24"/>
+        </w:rPr>
+        <w:t>1</w:t>
+      </w:r>
+      <w:r>
+        <w:rPr>
+          <w:b/>
+          <w:bCs/>
+          <w:szCs w:val="24"/>
+        </w:rPr>
+        <w:t>6</w:t>
+      </w:r>
+    </w:p>
+    <w:p>
+      <w:pPr>
+        <w:spacing w:line="360" w:lineRule="auto"/>
+        <w:rPr>
+          <w:b/>
+          <w:bCs/>
+          <w:szCs w:val="24"/>
+        </w:rPr>
+      </w:pPr>
+      <w:r>
+        <w:rPr>
+          <w:b/>
+          <w:bCs/>
+          <w:szCs w:val="24"/>
+        </w:rPr>
+        <w:t>10</w:t>
+      </w:r>
+      <w:r>
+        <w:rPr>
+          <w:b/>
+          <w:bCs/>
+          <w:szCs w:val="24"/>
+        </w:rPr>
+        <w:t xml:space="preserve"> </w:t>
+      </w:r>
+      <w:r>
+        <w:rPr>
+          <w:b/>
+          <w:bCs/>
+          <w:szCs w:val="24"/>
+        </w:rPr>
+        <w:t>MODELO DO BANCO DE DADOS</w:t>
+      </w:r>
+      <w:r>
+        <w:rPr>
+          <w:b/>
+          <w:bCs/>
+          <w:szCs w:val="24"/>
+        </w:rPr>
+        <w:ptab w:relativeTo="margin" w:alignment="right" w:leader="dot"/>
+      </w:r>
+      <w:r>
+        <w:rPr>
+          <w:b/>
+          <w:bCs/>
+          <w:szCs w:val="24"/>
+        </w:rPr>
+        <w:t>1</w:t>
+      </w:r>
+      <w:r>
+        <w:rPr>
+          <w:b/>
+          <w:bCs/>
+          <w:szCs w:val="24"/>
+        </w:rPr>
         <w:t>8</w:t>
       </w:r>
     </w:p>
@@ -1610,7 +1822,15 @@
           <w:bCs/>
           <w:szCs w:val="24"/>
         </w:rPr>
-        <w:t>8 DIAGRAMA DE CASOS DE USO</w:t>
+        <w:t xml:space="preserve">11 </w:t>
+      </w:r>
+      <w:r>
+        <w:rPr>
+          <w:b/>
+          <w:bCs/>
+          <w:szCs w:val="24"/>
+        </w:rPr>
+        <w:t>CRONOGRAMA</w:t>
       </w:r>
       <w:r>
         <w:rPr>
@@ -1626,25 +1846,41 @@
           <w:bCs/>
           <w:szCs w:val="24"/>
         </w:rPr>
-        <w:t>11</w:t>
-      </w:r>
-    </w:p>
-    <w:p>
-      <w:pPr>
-        <w:spacing w:line="360" w:lineRule="auto"/>
-        <w:rPr>
-          <w:b/>
-          <w:bCs/>
-          <w:szCs w:val="24"/>
-        </w:rPr>
-      </w:pPr>
-      <w:r>
-        <w:rPr>
-          <w:b/>
-          <w:bCs/>
-          <w:szCs w:val="24"/>
-        </w:rPr>
-        <w:t>9 TECNOLOGIAS ADOTADAS</w:t>
+        <w:t>21</w:t>
+      </w:r>
+    </w:p>
+    <w:p>
+      <w:pPr>
+        <w:spacing w:line="360" w:lineRule="auto"/>
+        <w:rPr>
+          <w:b/>
+          <w:bCs/>
+          <w:szCs w:val="24"/>
+        </w:rPr>
+      </w:pPr>
+      <w:r>
+        <w:rPr>
+          <w:b/>
+          <w:bCs/>
+          <w:szCs w:val="24"/>
+        </w:rPr>
+        <w:t>12</w:t>
+      </w:r>
+      <w:r>
+        <w:rPr>
+          <w:b/>
+          <w:bCs/>
+          <w:szCs w:val="24"/>
+        </w:rPr>
+        <w:t xml:space="preserve"> </w:t>
+      </w:r>
+      <w:r>
+        <w:rPr>
+          <w:b/>
+          <w:bCs/>
+          <w:szCs w:val="24"/>
+        </w:rPr>
+        <w:t>IDENTIDADE VISUAL</w:t>
       </w:r>
       <w:r>
         <w:rPr>
@@ -1660,25 +1896,67 @@
           <w:bCs/>
           <w:szCs w:val="24"/>
         </w:rPr>
-        <w:t>12</w:t>
-      </w:r>
-    </w:p>
-    <w:p>
-      <w:pPr>
-        <w:spacing w:line="360" w:lineRule="auto"/>
-        <w:rPr>
-          <w:b/>
-          <w:bCs/>
-          <w:szCs w:val="24"/>
-        </w:rPr>
-      </w:pPr>
-      <w:r>
-        <w:rPr>
-          <w:b/>
-          <w:bCs/>
-          <w:szCs w:val="24"/>
-        </w:rPr>
-        <w:t>10</w:t>
+        <w:t>22</w:t>
+      </w:r>
+    </w:p>
+    <w:p>
+      <w:pPr>
+        <w:spacing w:line="360" w:lineRule="auto"/>
+        <w:rPr>
+          <w:b/>
+          <w:bCs/>
+          <w:szCs w:val="24"/>
+        </w:rPr>
+      </w:pPr>
+      <w:r>
+        <w:rPr>
+          <w:b/>
+          <w:bCs/>
+          <w:szCs w:val="24"/>
+        </w:rPr>
+        <w:t>13 WIREFRAMES</w:t>
+      </w:r>
+      <w:r>
+        <w:rPr>
+          <w:b/>
+          <w:bCs/>
+          <w:szCs w:val="24"/>
+        </w:rPr>
+        <w:t xml:space="preserve"> E PROTOTIPAÇÃO</w:t>
+      </w:r>
+      <w:r>
+        <w:rPr>
+          <w:b/>
+          <w:bCs/>
+          <w:szCs w:val="24"/>
+        </w:rPr>
+        <w:ptab w:relativeTo="margin" w:alignment="right" w:leader="dot"/>
+      </w:r>
+      <w:r>
+        <w:rPr>
+          <w:b/>
+          <w:bCs/>
+          <w:szCs w:val="24"/>
+        </w:rPr>
+        <w:t>23</w:t>
+      </w:r>
+    </w:p>
+    <w:p>
+      <w:pPr>
+        <w:spacing w:line="360" w:lineRule="auto"/>
+        <w:rPr>
+          <w:b/>
+          <w:bCs/>
+          <w:szCs w:val="24"/>
+        </w:rPr>
+      </w:pPr>
+      <w:r>
+        <w:rPr>
+          <w:b/>
+          <w:bCs/>
+          <w:szCs w:val="24"/>
+        </w:rPr>
+        <w:t>14</w:t>
       </w:r>
       <w:r>
         <w:rPr>
@@ -1694,7 +1972,15 @@
           <w:bCs/>
           <w:szCs w:val="24"/>
         </w:rPr>
-        <w:t>MODELO DO BANCO DE DADOS</w:t>
+        <w:t xml:space="preserve">RESULTADOS </w:t>
+      </w:r>
+      <w:r>
+        <w:rPr>
+          <w:b/>
+          <w:bCs/>
+          <w:szCs w:val="24"/>
+        </w:rPr>
+        <w:t>OBTIDOS</w:t>
       </w:r>
       <w:r>
         <w:rPr>
@@ -1710,33 +1996,25 @@
           <w:bCs/>
           <w:szCs w:val="24"/>
         </w:rPr>
-        <w:t>14</w:t>
-      </w:r>
-    </w:p>
-    <w:p>
-      <w:pPr>
-        <w:spacing w:line="360" w:lineRule="auto"/>
-        <w:rPr>
-          <w:b/>
-          <w:bCs/>
-          <w:szCs w:val="24"/>
-        </w:rPr>
-      </w:pPr>
-      <w:r>
-        <w:rPr>
-          <w:b/>
-          <w:bCs/>
-          <w:szCs w:val="24"/>
-        </w:rPr>
-        <w:t xml:space="preserve">11 </w:t>
-      </w:r>
-      <w:r>
-        <w:rPr>
-          <w:b/>
-          <w:bCs/>
-          <w:szCs w:val="24"/>
-        </w:rPr>
-        <w:t>CRONOGRAMA</w:t>
+        <w:t>24</w:t>
+      </w:r>
+    </w:p>
+    <w:p>
+      <w:pPr>
+        <w:spacing w:line="360" w:lineRule="auto"/>
+        <w:rPr>
+          <w:b/>
+          <w:bCs/>
+          <w:szCs w:val="24"/>
+        </w:rPr>
+      </w:pPr>
+      <w:r>
+        <w:rPr>
+          <w:b/>
+          <w:bCs/>
+          <w:szCs w:val="24"/>
+        </w:rPr>
+        <w:t>15 PRÓXIMOS PASSOS</w:t>
       </w:r>
       <w:r>
         <w:rPr>
@@ -1752,41 +2030,25 @@
           <w:bCs/>
           <w:szCs w:val="24"/>
         </w:rPr>
-        <w:t>15</w:t>
-      </w:r>
-    </w:p>
-    <w:p>
-      <w:pPr>
-        <w:spacing w:line="360" w:lineRule="auto"/>
-        <w:rPr>
-          <w:b/>
-          <w:bCs/>
-          <w:szCs w:val="24"/>
-        </w:rPr>
-      </w:pPr>
-      <w:r>
-        <w:rPr>
-          <w:b/>
-          <w:bCs/>
-          <w:szCs w:val="24"/>
-        </w:rPr>
-        <w:t>12</w:t>
-      </w:r>
-      <w:r>
-        <w:rPr>
-          <w:b/>
-          <w:bCs/>
-          <w:szCs w:val="24"/>
-        </w:rPr>
-        <w:t xml:space="preserve"> </w:t>
-      </w:r>
-      <w:r>
-        <w:rPr>
-          <w:b/>
-          <w:bCs/>
-          <w:szCs w:val="24"/>
-        </w:rPr>
-        <w:t>IDENTIDADE VISUAL</w:t>
+        <w:t>25</w:t>
+      </w:r>
+    </w:p>
+    <w:p>
+      <w:pPr>
+        <w:spacing w:line="360" w:lineRule="auto"/>
+        <w:rPr>
+          <w:b/>
+          <w:bCs/>
+          <w:szCs w:val="24"/>
+        </w:rPr>
+      </w:pPr>
+      <w:r>
+        <w:rPr>
+          <w:b/>
+          <w:bCs/>
+          <w:szCs w:val="24"/>
+        </w:rPr>
+        <w:t>16 REFERÊNCIAS</w:t>
       </w:r>
       <w:r>
         <w:rPr>
@@ -1802,167 +2064,7 @@
           <w:bCs/>
           <w:szCs w:val="24"/>
         </w:rPr>
-        <w:t>16</w:t>
-      </w:r>
-    </w:p>
-    <w:p>
-      <w:pPr>
-        <w:spacing w:line="360" w:lineRule="auto"/>
-        <w:rPr>
-          <w:b/>
-          <w:bCs/>
-          <w:szCs w:val="24"/>
-        </w:rPr>
-      </w:pPr>
-      <w:r>
-        <w:rPr>
-          <w:b/>
-          <w:bCs/>
-          <w:szCs w:val="24"/>
-        </w:rPr>
-        <w:t>13 WIREFRAMES</w:t>
-      </w:r>
-      <w:r>
-        <w:rPr>
-          <w:b/>
-          <w:bCs/>
-          <w:szCs w:val="24"/>
-        </w:rPr>
-        <w:t xml:space="preserve"> E PROTOTIPAÇÃO</w:t>
-      </w:r>
-      <w:r>
-        <w:rPr>
-          <w:b/>
-          <w:bCs/>
-          <w:szCs w:val="24"/>
-        </w:rPr>
-        <w:ptab w:relativeTo="margin" w:alignment="right" w:leader="dot"/>
-      </w:r>
-      <w:r>
-        <w:rPr>
-          <w:b/>
-          <w:bCs/>
-          <w:szCs w:val="24"/>
-        </w:rPr>
-        <w:t>17</w:t>
-      </w:r>
-    </w:p>
-    <w:p>
-      <w:pPr>
-        <w:spacing w:line="360" w:lineRule="auto"/>
-        <w:rPr>
-          <w:b/>
-          <w:bCs/>
-          <w:szCs w:val="24"/>
-        </w:rPr>
-      </w:pPr>
-      <w:r>
-        <w:rPr>
-          <w:b/>
-          <w:bCs/>
-          <w:szCs w:val="24"/>
-        </w:rPr>
-        <w:t>14</w:t>
-      </w:r>
-      <w:r>
-        <w:rPr>
-          <w:b/>
-          <w:bCs/>
-          <w:szCs w:val="24"/>
-        </w:rPr>
-        <w:t xml:space="preserve"> </w:t>
-      </w:r>
-      <w:r>
-        <w:rPr>
-          <w:b/>
-          <w:bCs/>
-          <w:szCs w:val="24"/>
-        </w:rPr>
-        <w:t>RESULTADOS ESPERADOS</w:t>
-      </w:r>
-      <w:r>
-        <w:rPr>
-          <w:b/>
-          <w:bCs/>
-          <w:szCs w:val="24"/>
-        </w:rPr>
-        <w:ptab w:relativeTo="margin" w:alignment="right" w:leader="dot"/>
-      </w:r>
-      <w:r>
-        <w:rPr>
-          <w:b/>
-          <w:bCs/>
-          <w:szCs w:val="24"/>
-        </w:rPr>
-        <w:t>18</w:t>
-      </w:r>
-    </w:p>
-    <w:p>
-      <w:pPr>
-        <w:spacing w:line="360" w:lineRule="auto"/>
-        <w:rPr>
-          <w:b/>
-          <w:bCs/>
-          <w:szCs w:val="24"/>
-        </w:rPr>
-      </w:pPr>
-      <w:r>
-        <w:rPr>
-          <w:b/>
-          <w:bCs/>
-          <w:szCs w:val="24"/>
-        </w:rPr>
-        <w:t>15 PRÓXIMOS PASSOS</w:t>
-      </w:r>
-      <w:r>
-        <w:rPr>
-          <w:b/>
-          <w:bCs/>
-          <w:szCs w:val="24"/>
-        </w:rPr>
-        <w:ptab w:relativeTo="margin" w:alignment="right" w:leader="dot"/>
-      </w:r>
-      <w:r>
-        <w:rPr>
-          <w:b/>
-          <w:bCs/>
-          <w:szCs w:val="24"/>
-        </w:rPr>
-        <w:t>19</w:t>
-      </w:r>
-    </w:p>
-    <w:p>
-      <w:pPr>
-        <w:spacing w:line="360" w:lineRule="auto"/>
-        <w:rPr>
-          <w:b/>
-          <w:bCs/>
-          <w:szCs w:val="24"/>
-        </w:rPr>
-      </w:pPr>
-      <w:r>
-        <w:rPr>
-          <w:b/>
-          <w:bCs/>
-          <w:szCs w:val="24"/>
-        </w:rPr>
-        <w:t>16 REFERÊNCIAS</w:t>
-      </w:r>
-      <w:r>
-        <w:rPr>
-          <w:b/>
-          <w:bCs/>
-          <w:szCs w:val="24"/>
-        </w:rPr>
-        <w:ptab w:relativeTo="margin" w:alignment="right" w:leader="dot"/>
-      </w:r>
-      <w:r>
-        <w:rPr>
-          <w:b/>
-          <w:bCs/>
-          <w:szCs w:val="24"/>
-        </w:rPr>
-        <w:t>20</w:t>
+        <w:t>26</w:t>
       </w:r>
     </w:p>
     <w:p>
@@ -2266,7 +2368,21 @@
         <w:rPr>
           <w:szCs w:val="24"/>
         </w:rPr>
-        <w:t>Davi Delmondes Machado - Scrum Master</w:t>
+        <w:t xml:space="preserve">Davi </w:t>
+      </w:r>
+      <w:proofErr w:type="spellStart"/>
+      <w:r>
+        <w:rPr>
+          <w:szCs w:val="24"/>
+        </w:rPr>
+        <w:t>Delmondes</w:t>
+      </w:r>
+      <w:proofErr w:type="spellEnd"/>
+      <w:r>
+        <w:rPr>
+          <w:szCs w:val="24"/>
+        </w:rPr>
+        <w:t xml:space="preserve"> Machado - Scrum Master</w:t>
       </w:r>
     </w:p>
     <w:p>
@@ -2306,8 +2422,16 @@
         <w:rPr>
           <w:szCs w:val="24"/>
         </w:rPr>
-        <w:t>Igor de Oliveira Bernardo - Developer</w:t>
-      </w:r>
+        <w:t xml:space="preserve">Igor de Oliveira Bernardo - </w:t>
+      </w:r>
+      <w:proofErr w:type="spellStart"/>
+      <w:r>
+        <w:rPr>
+          <w:szCs w:val="24"/>
+        </w:rPr>
+        <w:t>Developer</w:t>
+      </w:r>
+      <w:proofErr w:type="spellEnd"/>
     </w:p>
     <w:p>
       <w:pPr>
@@ -2358,14 +2482,30 @@
         <w:rPr>
           <w:szCs w:val="24"/>
         </w:rPr>
-        <w:t>- Product</w:t>
-      </w:r>
-      <w:r>
-        <w:rPr>
-          <w:szCs w:val="24"/>
-        </w:rPr>
-        <w:t xml:space="preserve"> Owner</w:t>
-      </w:r>
+        <w:t xml:space="preserve">- </w:t>
+      </w:r>
+      <w:proofErr w:type="spellStart"/>
+      <w:r>
+        <w:rPr>
+          <w:szCs w:val="24"/>
+        </w:rPr>
+        <w:t>Product</w:t>
+      </w:r>
+      <w:proofErr w:type="spellEnd"/>
+      <w:r>
+        <w:rPr>
+          <w:szCs w:val="24"/>
+        </w:rPr>
+        <w:t xml:space="preserve"> </w:t>
+      </w:r>
+      <w:proofErr w:type="spellStart"/>
+      <w:r>
+        <w:rPr>
+          <w:szCs w:val="24"/>
+        </w:rPr>
+        <w:t>Owner</w:t>
+      </w:r>
+      <w:proofErr w:type="spellEnd"/>
     </w:p>
     <w:p>
       <w:pPr>
@@ -2380,32 +2520,54 @@
         <w:rPr>
           <w:szCs w:val="24"/>
         </w:rPr>
-        <w:t>Responsável pela criação do protótipo, participação ativa no desenvolvimento front-end da aplicação web e mobile, além de realizar pesquisas sobre tecnologias atuais e seguras, contribuindo também na implementação de mecanismos de segurança da aplicação.</w:t>
-      </w:r>
-    </w:p>
-    <w:p>
-      <w:pPr>
-        <w:spacing w:line="360" w:lineRule="auto"/>
-        <w:jc w:val="both"/>
-        <w:rPr>
-          <w:szCs w:val="24"/>
-        </w:rPr>
-      </w:pPr>
-    </w:p>
-    <w:p>
-      <w:pPr>
-        <w:spacing w:line="360" w:lineRule="auto"/>
-        <w:jc w:val="both"/>
-        <w:rPr>
-          <w:szCs w:val="24"/>
-        </w:rPr>
-      </w:pPr>
-      <w:r>
-        <w:rPr>
-          <w:szCs w:val="24"/>
-        </w:rPr>
-        <w:t>Joaquim Pereira Lima - Developer</w:t>
-      </w:r>
+        <w:t>Responsável pela criação do protótipo, participação ativa no desenvolvimento front-</w:t>
+      </w:r>
+      <w:proofErr w:type="spellStart"/>
+      <w:r>
+        <w:rPr>
+          <w:szCs w:val="24"/>
+        </w:rPr>
+        <w:t>end</w:t>
+      </w:r>
+      <w:proofErr w:type="spellEnd"/>
+      <w:r>
+        <w:rPr>
+          <w:szCs w:val="24"/>
+        </w:rPr>
+        <w:t xml:space="preserve"> da aplicação web e mobile, além de realizar pesquisas sobre tecnologias atuais e seguras, contribuindo também na implementação de mecanismos de segurança da aplicação.</w:t>
+      </w:r>
+    </w:p>
+    <w:p>
+      <w:pPr>
+        <w:spacing w:line="360" w:lineRule="auto"/>
+        <w:jc w:val="both"/>
+        <w:rPr>
+          <w:szCs w:val="24"/>
+        </w:rPr>
+      </w:pPr>
+    </w:p>
+    <w:p>
+      <w:pPr>
+        <w:spacing w:line="360" w:lineRule="auto"/>
+        <w:jc w:val="both"/>
+        <w:rPr>
+          <w:szCs w:val="24"/>
+        </w:rPr>
+      </w:pPr>
+      <w:r>
+        <w:rPr>
+          <w:szCs w:val="24"/>
+        </w:rPr>
+        <w:t xml:space="preserve">Joaquim Pereira Lima - </w:t>
+      </w:r>
+      <w:proofErr w:type="spellStart"/>
+      <w:r>
+        <w:rPr>
+          <w:szCs w:val="24"/>
+        </w:rPr>
+        <w:t>Developer</w:t>
+      </w:r>
+      <w:proofErr w:type="spellEnd"/>
     </w:p>
     <w:p>
       <w:pPr>
@@ -2420,7 +2582,21 @@
         <w:rPr>
           <w:szCs w:val="24"/>
         </w:rPr>
-        <w:t>Responsável pelo suporte na prototipagem do sistema, participação ativa no desenvolvimento back-end da aplicação web e mobile, implementação de recursos de segurança da aplicação, além da elaboração dos slides para a apresentação do TCC.</w:t>
+        <w:t xml:space="preserve">Responsável pelo suporte na prototipagem do sistema, participação ativa no desenvolvimento </w:t>
+      </w:r>
+      <w:proofErr w:type="spellStart"/>
+      <w:r>
+        <w:rPr>
+          <w:szCs w:val="24"/>
+        </w:rPr>
+        <w:t>back-end</w:t>
+      </w:r>
+      <w:proofErr w:type="spellEnd"/>
+      <w:r>
+        <w:rPr>
+          <w:szCs w:val="24"/>
+        </w:rPr>
+        <w:t xml:space="preserve"> da aplicação web e mobile, implementação de recursos de segurança da aplicação, além da elaboração dos slides para a apresentação do TCC.</w:t>
       </w:r>
     </w:p>
     <w:p>
@@ -2519,7 +2695,6 @@
         <w:rPr>
           <w:szCs w:val="24"/>
         </w:rPr>
-        <w:tab/>
         <w:t>A segurança no ambiente de trabalho é uma obrigação legal estabelecida pela Norma Regulamentadora NR-6, que determina que toda empresa é responsável por fornecer, fiscalizar o uso e manter o controle dos Equipamentos de Proteção Individual de seus funcionários. O descumprimento dessa norma expõe as empresas e penalidades legais e, mais gravemente, coloca em risco a integridade física dos trabalhadores.</w:t>
       </w:r>
     </w:p>
@@ -2536,7 +2711,6 @@
         <w:rPr>
           <w:szCs w:val="24"/>
         </w:rPr>
-        <w:tab/>
         <w:t>Apesar disso, o controle dos EPIs ainda é feito de forma manual em grande parte das empresas brasileiras. Segundo uma pesquisa realizada pela plataforma Flash, 48% das empresas no Brasil ainda utilizam planilhas eletrônicas para gerenciar dados de seus colaboradores. Quando esse método é aplicado ao controle de EPIs, os problemas se tornam ainda mais críticos: registros desatualizados, dificuldade de rastrear quais equipamentos foram entregues a quais funcionários, ausência de alertas sobre validade e falta de histórico confiável para eventuais fiscalizações.</w:t>
       </w:r>
     </w:p>
@@ -2553,7 +2727,6 @@
         <w:rPr>
           <w:szCs w:val="24"/>
         </w:rPr>
-        <w:tab/>
         <w:t>De acordo com dados do Observatório de Segurança e Saúde do Trabalho, o Brasil Registra mais de 600 mil acidentes de trabalho por ano, ocupando uma posição preocupante no ranking mundial. Embora nem todos sejam causados pela ausência de EPIs, a falta de controle adequado sobre esses equipamentos contribui diretamente para que trabalhadores realizem suas atividades sem a proteção necessária, seja por falta de equipamento disponível, por uso de EPI com validade vencida ou simplesmente falha no registro da entrega.</w:t>
       </w:r>
     </w:p>
@@ -2570,7 +2743,6 @@
         <w:rPr>
           <w:szCs w:val="24"/>
         </w:rPr>
-        <w:tab/>
         <w:t>Diante desse cenário, o desenvolvimento de um sistema digital para o gerenciamento de EPIs se justifica tanto pelo impacto direto na segurança dos trabalhadores quanto pela necessidade das empresas de manterem registros organizados e auditáveis. O SIGEPI surge como uma solução acessível para substituir os métodos manuais por um sistema web responsivo, capaz de centrali</w:t>
       </w:r>
       <w:r>
@@ -2603,6 +2775,14 @@
         </w:rPr>
         <w:t>.</w:t>
       </w:r>
+    </w:p>
+    <w:p>
+      <w:pPr>
+        <w:spacing w:line="360" w:lineRule="auto"/>
+        <w:rPr>
+          <w:szCs w:val="24"/>
+        </w:rPr>
+      </w:pPr>
     </w:p>
     <w:p>
       <w:pPr>
@@ -3098,7 +3278,19 @@
         <w:rPr>
           <w:szCs w:val="24"/>
         </w:rPr>
-        <w:t>O projeto SIGEPI será desenvolvido com base em metodologias ágeis, com foco na estrutura do Scrum. Essa escolha se justifica pela necessidade de organizar as atividades entre quatro integrantes com funções distintas e de acompanhar o progresso do desenvolvimento de forma transparente, com entregas incrementais e revisões contínuas.</w:t>
+        <w:t xml:space="preserve">O projeto SIGEPI </w:t>
+      </w:r>
+      <w:r>
+        <w:rPr>
+          <w:szCs w:val="24"/>
+        </w:rPr>
+        <w:t xml:space="preserve">foi desenvolvido </w:t>
+      </w:r>
+      <w:r>
+        <w:rPr>
+          <w:szCs w:val="24"/>
+        </w:rPr>
+        <w:t>com base em metodologias ágeis, com foco na estrutura do Scrum. Essa escolha se justifica pela necessidade de organizar as atividades entre quatro integrantes com funções distintas e de acompanhar o progresso do desenvolvimento de forma transparente, com entregas incrementais e revisões contínuas.</w:t>
       </w:r>
     </w:p>
     <w:p>
@@ -3114,7 +3306,67 @@
         <w:rPr>
           <w:szCs w:val="24"/>
         </w:rPr>
-        <w:t>No Scrum, as atividades são divididas em sprints, que são ciclos curtos de desenvolvimento com objetivos definidos. Ao final de cada sprint, a equipe revisa o que foi produzido, identifica melhorias e define as tarefas do ciclo seguinte. Essa dinâmica foi adotada para garantir que o sistema seja construído de forma organizada, reduzindo o risco de retrabalho e mantendo o alinhamento entre os membros da equipe.</w:t>
+        <w:t xml:space="preserve">No Scrum, as atividades </w:t>
+      </w:r>
+      <w:r>
+        <w:rPr>
+          <w:szCs w:val="24"/>
+        </w:rPr>
+        <w:t>são</w:t>
+      </w:r>
+      <w:r>
+        <w:rPr>
+          <w:szCs w:val="24"/>
+        </w:rPr>
+        <w:t xml:space="preserve"> divididas em sprints, que são ciclos curtos de desenvolvimento com objetivos definidos. Ao final de cada sprint, a equipe </w:t>
+      </w:r>
+      <w:r>
+        <w:rPr>
+          <w:szCs w:val="24"/>
+        </w:rPr>
+        <w:t>revisou</w:t>
+      </w:r>
+      <w:r>
+        <w:rPr>
+          <w:szCs w:val="24"/>
+        </w:rPr>
+        <w:t xml:space="preserve"> o que foi produzido, </w:t>
+      </w:r>
+      <w:r>
+        <w:rPr>
+          <w:szCs w:val="24"/>
+        </w:rPr>
+        <w:t>identificou</w:t>
+      </w:r>
+      <w:r>
+        <w:rPr>
+          <w:szCs w:val="24"/>
+        </w:rPr>
+        <w:t xml:space="preserve"> melhorias e </w:t>
+      </w:r>
+      <w:r>
+        <w:rPr>
+          <w:szCs w:val="24"/>
+        </w:rPr>
+        <w:t>definiu</w:t>
+      </w:r>
+      <w:r>
+        <w:rPr>
+          <w:szCs w:val="24"/>
+        </w:rPr>
+        <w:t xml:space="preserve"> as tarefas do ciclo seguinte. Essa dinâmica foi adotada para garantir que o sistema </w:t>
+      </w:r>
+      <w:r>
+        <w:rPr>
+          <w:szCs w:val="24"/>
+        </w:rPr>
+        <w:t>fosse</w:t>
+      </w:r>
+      <w:r>
+        <w:rPr>
+          <w:szCs w:val="24"/>
+        </w:rPr>
+        <w:t xml:space="preserve"> construído de forma organizada, reduzindo o risco de retrabalho e mantendo o alinhamento entre os membros da equipe.</w:t>
       </w:r>
     </w:p>
     <w:p>
@@ -3130,13 +3382,47 @@
         <w:rPr>
           <w:szCs w:val="24"/>
         </w:rPr>
-        <w:t>Antes do início do desenvolvimento, foi realizada a etapa de prototipação das telas do Figma</w:t>
-      </w:r>
-      <w:r>
-        <w:rPr>
-          <w:szCs w:val="24"/>
-        </w:rPr>
-        <w:t>. Essa ferramenta permitiu visualizar a estrutura da interface e validar o fluxo de navegação do sistema antes de qualquer visual durante o desenvolvimento front-end, facilitando a implementação ao design planejado.</w:t>
+        <w:t xml:space="preserve">Antes do início do desenvolvimento, foi realizada a etapa de prototipação das telas do </w:t>
+      </w:r>
+      <w:proofErr w:type="spellStart"/>
+      <w:r>
+        <w:rPr>
+          <w:szCs w:val="24"/>
+        </w:rPr>
+        <w:t>Figma</w:t>
+      </w:r>
+      <w:proofErr w:type="spellEnd"/>
+      <w:r>
+        <w:rPr>
+          <w:szCs w:val="24"/>
+        </w:rPr>
+        <w:t>. Essa ferramenta permitiu visualizar a estrutura da interface e validar o fluxo de navegação do sistema antes de qualquer visual durante o desenvolvimento front-</w:t>
+      </w:r>
+      <w:proofErr w:type="spellStart"/>
+      <w:r>
+        <w:rPr>
+          <w:szCs w:val="24"/>
+        </w:rPr>
+        <w:t>end</w:t>
+      </w:r>
+      <w:proofErr w:type="spellEnd"/>
+      <w:r>
+        <w:rPr>
+          <w:szCs w:val="24"/>
+        </w:rPr>
+        <w:t>, facilitando a implementação ao design planejado</w:t>
+      </w:r>
+      <w:r>
+        <w:rPr>
+          <w:szCs w:val="24"/>
+        </w:rPr>
+        <w:t xml:space="preserve"> e a responsividade</w:t>
+      </w:r>
+      <w:r>
+        <w:rPr>
+          <w:szCs w:val="24"/>
+        </w:rPr>
+        <w:t>.</w:t>
       </w:r>
     </w:p>
     <w:p>
@@ -3152,7 +3438,31 @@
         <w:rPr>
           <w:szCs w:val="24"/>
         </w:rPr>
-        <w:t xml:space="preserve">O desenvolvimento será realizado de forma incremental, começando pelas funcionalidades mais essenciais do sistema, como o login, o cadastro de funcionários e EPIs e o controle de estoque. À medida que essas funcionalidades forem concluídas e testadas, novas </w:t>
+        <w:t xml:space="preserve">O desenvolvimento </w:t>
+      </w:r>
+      <w:r>
+        <w:rPr>
+          <w:szCs w:val="24"/>
+        </w:rPr>
+        <w:t xml:space="preserve">foi realizado </w:t>
+      </w:r>
+      <w:r>
+        <w:rPr>
+          <w:szCs w:val="24"/>
+        </w:rPr>
+        <w:t xml:space="preserve">de forma incremental, começando pelas funcionalidades mais essenciais do sistema, como o login, o cadastro de funcionários e EPIs e o controle de estoque. À medida que essas funcionalidades </w:t>
+      </w:r>
+      <w:r>
+        <w:rPr>
+          <w:szCs w:val="24"/>
+        </w:rPr>
+        <w:t>foram</w:t>
+      </w:r>
+      <w:r>
+        <w:rPr>
+          <w:szCs w:val="24"/>
+        </w:rPr>
+        <w:t xml:space="preserve"> concluídas e testadas, novas </w:t>
       </w:r>
       <w:r>
         <w:rPr>
@@ -3164,7 +3474,19 @@
         <w:rPr>
           <w:szCs w:val="24"/>
         </w:rPr>
-        <w:t xml:space="preserve"> serão implementadas, como o painel de dashboard, geração de relatórios e os alertas de validade.</w:t>
+        <w:t xml:space="preserve"> </w:t>
+      </w:r>
+      <w:r>
+        <w:rPr>
+          <w:szCs w:val="24"/>
+        </w:rPr>
+        <w:t>foram</w:t>
+      </w:r>
+      <w:r>
+        <w:rPr>
+          <w:szCs w:val="24"/>
+        </w:rPr>
+        <w:t xml:space="preserve"> implementadas, como o painel de dashboard, geração de relatórios e os alertas de validade.</w:t>
       </w:r>
     </w:p>
     <w:p>
@@ -3180,7 +3502,19 @@
         <w:rPr>
           <w:szCs w:val="24"/>
         </w:rPr>
-        <w:t>Do ponto de vista da classificação da pesquisa, esse trabalho pode ser caracterizado como aplicado, pois tem como objetivo produzir um sistema funcional para resolver um problema real. Quanto aos objetivos, é exploratório e descritivo, pois investiga as necessidades dos usuários e descreve as soluções adotadas. Em relação ao desenvolvimento, adota abordagem qualitativa, baseada na análise dos requisitos e na validação das funcionalidades implementadas.</w:t>
+        <w:t xml:space="preserve">Do ponto de vista da classificação da pesquisa, esse trabalho </w:t>
+      </w:r>
+      <w:r>
+        <w:rPr>
+          <w:szCs w:val="24"/>
+        </w:rPr>
+        <w:t>é</w:t>
+      </w:r>
+      <w:r>
+        <w:rPr>
+          <w:szCs w:val="24"/>
+        </w:rPr>
+        <w:t xml:space="preserve"> caracterizado como aplicado, pois tem como objetivo produzir um sistema funcional para resolver um problema real. Quanto aos objetivos, é exploratório e descritivo, pois investiga as necessidades dos usuários e descreve as soluções adotadas. Em relação ao desenvolvimento, adota abordagem qualitativa, baseada na análise dos requisitos e na validação das funcionalidades implementadas.</w:t>
       </w:r>
     </w:p>
     <w:p>
@@ -3305,7 +3639,47 @@
         <w:rPr>
           <w:szCs w:val="24"/>
         </w:rPr>
-        <w:t>. No front-end, serão utilizados HTML, CSS e JavaScript, linguagens que a equipe já domina e que são amplamente suportadas por todos os navegadores modernos.</w:t>
+        <w:t>. No front-</w:t>
+      </w:r>
+      <w:proofErr w:type="spellStart"/>
+      <w:r>
+        <w:rPr>
+          <w:szCs w:val="24"/>
+        </w:rPr>
+        <w:t>end</w:t>
+      </w:r>
+      <w:proofErr w:type="spellEnd"/>
+      <w:r>
+        <w:rPr>
+          <w:szCs w:val="24"/>
+        </w:rPr>
+        <w:t xml:space="preserve">, </w:t>
+      </w:r>
+      <w:r>
+        <w:rPr>
+          <w:szCs w:val="24"/>
+        </w:rPr>
+        <w:t>foram</w:t>
+      </w:r>
+      <w:r>
+        <w:rPr>
+          <w:szCs w:val="24"/>
+        </w:rPr>
+        <w:t xml:space="preserve"> utilizados HTML, CSS e </w:t>
+      </w:r>
+      <w:proofErr w:type="spellStart"/>
+      <w:r>
+        <w:rPr>
+          <w:szCs w:val="24"/>
+        </w:rPr>
+        <w:t>JavaScript</w:t>
+      </w:r>
+      <w:proofErr w:type="spellEnd"/>
+      <w:r>
+        <w:rPr>
+          <w:szCs w:val="24"/>
+        </w:rPr>
+        <w:t>, linguagens que a equipe já domina e que são amplamente suportadas por todos os navegadores modernos.</w:t>
       </w:r>
     </w:p>
     <w:p>
@@ -3321,7 +3695,21 @@
         <w:rPr>
           <w:szCs w:val="24"/>
         </w:rPr>
-        <w:t>No back-end, será utilizado</w:t>
+        <w:t xml:space="preserve">No </w:t>
+      </w:r>
+      <w:proofErr w:type="spellStart"/>
+      <w:r>
+        <w:rPr>
+          <w:szCs w:val="24"/>
+        </w:rPr>
+        <w:t>back-end</w:t>
+      </w:r>
+      <w:proofErr w:type="spellEnd"/>
+      <w:r>
+        <w:rPr>
+          <w:szCs w:val="24"/>
+        </w:rPr>
+        <w:t>, será utilizado</w:t>
       </w:r>
       <w:r>
         <w:rPr>
@@ -3359,7 +3747,61 @@
         <w:rPr>
           <w:szCs w:val="24"/>
         </w:rPr>
-        <w:t>Além disso, a equipe utilizará ferramentas consolidadas no mercado de desenvolvimento, como o Visual Studio Code como editor de código, o Figma para prototipação de telas e o Postman para testes de rotas de API. Esse conjunto de ferramentas é gratuito, bem documentado e já utilizado pela equipe em atividades anteriores do curso, o que reduz a curva de aprendizado e favorece a produtividade.</w:t>
+        <w:t xml:space="preserve">Além disso, a equipe </w:t>
+      </w:r>
+      <w:r>
+        <w:rPr>
+          <w:szCs w:val="24"/>
+        </w:rPr>
+        <w:t>utilizou</w:t>
+      </w:r>
+      <w:r>
+        <w:rPr>
+          <w:szCs w:val="24"/>
+        </w:rPr>
+        <w:t xml:space="preserve"> ferramentas consolidadas no mercado de desenvolvimento, como o Visual Studio </w:t>
+      </w:r>
+      <w:proofErr w:type="spellStart"/>
+      <w:r>
+        <w:rPr>
+          <w:szCs w:val="24"/>
+        </w:rPr>
+        <w:t>Code</w:t>
+      </w:r>
+      <w:proofErr w:type="spellEnd"/>
+      <w:r>
+        <w:rPr>
+          <w:szCs w:val="24"/>
+        </w:rPr>
+        <w:t xml:space="preserve"> como editor de código, o </w:t>
+      </w:r>
+      <w:proofErr w:type="spellStart"/>
+      <w:r>
+        <w:rPr>
+          <w:szCs w:val="24"/>
+        </w:rPr>
+        <w:t>Figma</w:t>
+      </w:r>
+      <w:proofErr w:type="spellEnd"/>
+      <w:r>
+        <w:rPr>
+          <w:szCs w:val="24"/>
+        </w:rPr>
+        <w:t xml:space="preserve"> para prototipação de telas e o </w:t>
+      </w:r>
+      <w:proofErr w:type="spellStart"/>
+      <w:r>
+        <w:rPr>
+          <w:szCs w:val="24"/>
+        </w:rPr>
+        <w:t>Postman</w:t>
+      </w:r>
+      <w:proofErr w:type="spellEnd"/>
+      <w:r>
+        <w:rPr>
+          <w:szCs w:val="24"/>
+        </w:rPr>
+        <w:t xml:space="preserve"> para testes de rotas de API. Esse conjunto de ferramentas é gratuito, bem documentado e já utilizado pela equipe em atividades anteriores do curso, o que reduz a curva de aprendizado e favorece a produtividade.</w:t>
       </w:r>
     </w:p>
     <w:p>
@@ -3403,7 +3845,49 @@
         <w:rPr>
           <w:szCs w:val="24"/>
         </w:rPr>
-        <w:t>O projeto apresenta alta viabilidade financeira. Todas as tecnologias e ferramentas previstas para o desenvolvimento são gratuitas ou de código aberto: Node.js, Express.js, MySQL, Visual Studio Code, Figma (plano gratuito) e Postman são exemplos disso.</w:t>
+        <w:t xml:space="preserve">O projeto apresenta alta viabilidade financeira. Todas as tecnologias e ferramentas previstas para o desenvolvimento são gratuitas ou de código aberto: Node.js, Express.js, MySQL, Visual Studio </w:t>
+      </w:r>
+      <w:proofErr w:type="spellStart"/>
+      <w:r>
+        <w:rPr>
+          <w:szCs w:val="24"/>
+        </w:rPr>
+        <w:t>Code</w:t>
+      </w:r>
+      <w:proofErr w:type="spellEnd"/>
+      <w:r>
+        <w:rPr>
+          <w:szCs w:val="24"/>
+        </w:rPr>
+        <w:t xml:space="preserve">, </w:t>
+      </w:r>
+      <w:proofErr w:type="spellStart"/>
+      <w:r>
+        <w:rPr>
+          <w:szCs w:val="24"/>
+        </w:rPr>
+        <w:t>Figma</w:t>
+      </w:r>
+      <w:proofErr w:type="spellEnd"/>
+      <w:r>
+        <w:rPr>
+          <w:szCs w:val="24"/>
+        </w:rPr>
+        <w:t xml:space="preserve"> (plano gratuito) e </w:t>
+      </w:r>
+      <w:proofErr w:type="spellStart"/>
+      <w:r>
+        <w:rPr>
+          <w:szCs w:val="24"/>
+        </w:rPr>
+        <w:t>Postman</w:t>
+      </w:r>
+      <w:proofErr w:type="spellEnd"/>
+      <w:r>
+        <w:rPr>
+          <w:szCs w:val="24"/>
+        </w:rPr>
+        <w:t xml:space="preserve"> são exemplos disso.</w:t>
       </w:r>
     </w:p>
     <w:p>
@@ -3773,13 +4257,23 @@
                 <w:szCs w:val="24"/>
               </w:rPr>
             </w:pPr>
-            <w:r>
-              <w:rPr>
-                <w:b/>
-                <w:bCs/>
-                <w:szCs w:val="24"/>
-              </w:rPr>
-              <w:t>Cód-Nome</w:t>
+            <w:proofErr w:type="spellStart"/>
+            <w:r>
+              <w:rPr>
+                <w:b/>
+                <w:bCs/>
+                <w:szCs w:val="24"/>
+              </w:rPr>
+              <w:t>Cód</w:t>
+            </w:r>
+            <w:proofErr w:type="spellEnd"/>
+            <w:r>
+              <w:rPr>
+                <w:b/>
+                <w:bCs/>
+                <w:szCs w:val="24"/>
+              </w:rPr>
+              <w:t>-Nome</w:t>
             </w:r>
           </w:p>
         </w:tc>
@@ -3915,8 +4409,16 @@
               <w:rPr>
                 <w:szCs w:val="24"/>
               </w:rPr>
-              <w:t>NF1.2 Validar Captcha</w:t>
-            </w:r>
+              <w:t xml:space="preserve">NF1.2 Validar </w:t>
+            </w:r>
+            <w:proofErr w:type="spellStart"/>
+            <w:r>
+              <w:rPr>
+                <w:szCs w:val="24"/>
+              </w:rPr>
+              <w:t>Captcha</w:t>
+            </w:r>
+            <w:proofErr w:type="spellEnd"/>
           </w:p>
         </w:tc>
         <w:tc>
@@ -3934,7 +4436,21 @@
               <w:rPr>
                 <w:szCs w:val="24"/>
               </w:rPr>
-              <w:t>O usuário deve confirmar captcha para evitar acessos automatizados/robôs</w:t>
+              <w:t xml:space="preserve">O usuário deve confirmar </w:t>
+            </w:r>
+            <w:proofErr w:type="spellStart"/>
+            <w:r>
+              <w:rPr>
+                <w:szCs w:val="24"/>
+              </w:rPr>
+              <w:t>captcha</w:t>
+            </w:r>
+            <w:proofErr w:type="spellEnd"/>
+            <w:r>
+              <w:rPr>
+                <w:szCs w:val="24"/>
+              </w:rPr>
+              <w:t xml:space="preserve"> para evitar acessos automatizados/robôs</w:t>
             </w:r>
             <w:r>
               <w:rPr>
@@ -4290,13 +4806,23 @@
                 <w:szCs w:val="24"/>
               </w:rPr>
             </w:pPr>
-            <w:r>
-              <w:rPr>
-                <w:b/>
-                <w:bCs/>
-                <w:szCs w:val="24"/>
-              </w:rPr>
-              <w:t>Cód-Nome</w:t>
+            <w:proofErr w:type="spellStart"/>
+            <w:r>
+              <w:rPr>
+                <w:b/>
+                <w:bCs/>
+                <w:szCs w:val="24"/>
+              </w:rPr>
+              <w:t>Cód</w:t>
+            </w:r>
+            <w:proofErr w:type="spellEnd"/>
+            <w:r>
+              <w:rPr>
+                <w:b/>
+                <w:bCs/>
+                <w:szCs w:val="24"/>
+              </w:rPr>
+              <w:t>-Nome</w:t>
             </w:r>
           </w:p>
         </w:tc>
@@ -4838,13 +5364,23 @@
                 <w:szCs w:val="24"/>
               </w:rPr>
             </w:pPr>
-            <w:r>
-              <w:rPr>
-                <w:b/>
-                <w:bCs/>
-                <w:szCs w:val="24"/>
-              </w:rPr>
-              <w:t>Cód-Nome</w:t>
+            <w:proofErr w:type="spellStart"/>
+            <w:r>
+              <w:rPr>
+                <w:b/>
+                <w:bCs/>
+                <w:szCs w:val="24"/>
+              </w:rPr>
+              <w:t>Cód</w:t>
+            </w:r>
+            <w:proofErr w:type="spellEnd"/>
+            <w:r>
+              <w:rPr>
+                <w:b/>
+                <w:bCs/>
+                <w:szCs w:val="24"/>
+              </w:rPr>
+              <w:t>-Nome</w:t>
             </w:r>
           </w:p>
         </w:tc>
@@ -5162,7 +5698,13 @@
               <w:rPr>
                 <w:szCs w:val="24"/>
               </w:rPr>
-              <w:t xml:space="preserve"> registra a entrega de um EPI para um funcionário</w:t>
+              <w:t>registra</w:t>
+            </w:r>
+            <w:r>
+              <w:rPr>
+                <w:szCs w:val="24"/>
+              </w:rPr>
+              <w:t xml:space="preserve"> a entrega de um EPI para um funcionário</w:t>
             </w:r>
           </w:p>
         </w:tc>
@@ -5302,13 +5844,23 @@
                 <w:szCs w:val="24"/>
               </w:rPr>
             </w:pPr>
-            <w:r>
-              <w:rPr>
-                <w:b/>
-                <w:bCs/>
-                <w:szCs w:val="24"/>
-              </w:rPr>
-              <w:t>Cód-Nome</w:t>
+            <w:proofErr w:type="spellStart"/>
+            <w:r>
+              <w:rPr>
+                <w:b/>
+                <w:bCs/>
+                <w:szCs w:val="24"/>
+              </w:rPr>
+              <w:t>Cód</w:t>
+            </w:r>
+            <w:proofErr w:type="spellEnd"/>
+            <w:r>
+              <w:rPr>
+                <w:b/>
+                <w:bCs/>
+                <w:szCs w:val="24"/>
+              </w:rPr>
+              <w:t>-Nome</w:t>
             </w:r>
           </w:p>
         </w:tc>
@@ -5792,13 +6344,23 @@
                 <w:szCs w:val="24"/>
               </w:rPr>
             </w:pPr>
-            <w:r>
-              <w:rPr>
-                <w:b/>
-                <w:bCs/>
-                <w:szCs w:val="24"/>
-              </w:rPr>
-              <w:t>Cód-Nome</w:t>
+            <w:proofErr w:type="spellStart"/>
+            <w:r>
+              <w:rPr>
+                <w:b/>
+                <w:bCs/>
+                <w:szCs w:val="24"/>
+              </w:rPr>
+              <w:t>Cód</w:t>
+            </w:r>
+            <w:proofErr w:type="spellEnd"/>
+            <w:r>
+              <w:rPr>
+                <w:b/>
+                <w:bCs/>
+                <w:szCs w:val="24"/>
+              </w:rPr>
+              <w:t>-Nome</w:t>
             </w:r>
           </w:p>
         </w:tc>
@@ -6260,13 +6822,23 @@
                 <w:szCs w:val="24"/>
               </w:rPr>
             </w:pPr>
-            <w:r>
-              <w:rPr>
-                <w:b/>
-                <w:bCs/>
-                <w:szCs w:val="24"/>
-              </w:rPr>
-              <w:t>Cód-Nome</w:t>
+            <w:proofErr w:type="spellStart"/>
+            <w:r>
+              <w:rPr>
+                <w:b/>
+                <w:bCs/>
+                <w:szCs w:val="24"/>
+              </w:rPr>
+              <w:t>Cód</w:t>
+            </w:r>
+            <w:proofErr w:type="spellEnd"/>
+            <w:r>
+              <w:rPr>
+                <w:b/>
+                <w:bCs/>
+                <w:szCs w:val="24"/>
+              </w:rPr>
+              <w:t>-Nome</w:t>
             </w:r>
           </w:p>
         </w:tc>
@@ -6739,13 +7311,23 @@
                 <w:szCs w:val="24"/>
               </w:rPr>
             </w:pPr>
-            <w:r>
-              <w:rPr>
-                <w:b/>
-                <w:bCs/>
-                <w:szCs w:val="24"/>
-              </w:rPr>
-              <w:t>Cód-Nome</w:t>
+            <w:proofErr w:type="spellStart"/>
+            <w:r>
+              <w:rPr>
+                <w:b/>
+                <w:bCs/>
+                <w:szCs w:val="24"/>
+              </w:rPr>
+              <w:t>Cód</w:t>
+            </w:r>
+            <w:proofErr w:type="spellEnd"/>
+            <w:r>
+              <w:rPr>
+                <w:b/>
+                <w:bCs/>
+                <w:szCs w:val="24"/>
+              </w:rPr>
+              <w:t>-Nome</w:t>
             </w:r>
           </w:p>
         </w:tc>
@@ -6916,7 +7498,14 @@
               <w:rPr>
                 <w:szCs w:val="24"/>
               </w:rPr>
-              <w:t>Os relatórios devem apresentar dados estruturados e legíveis</w:t>
+              <w:t xml:space="preserve">Os relatórios devem apresentar dados estruturados e </w:t>
+            </w:r>
+            <w:proofErr w:type="gramStart"/>
+            <w:r>
+              <w:rPr>
+                <w:szCs w:val="24"/>
+              </w:rPr>
+              <w:t>legíveis</w:t>
             </w:r>
             <w:r>
               <w:rPr>
@@ -6924,6 +7513,7 @@
               </w:rPr>
               <w:t xml:space="preserve"> .</w:t>
             </w:r>
+            <w:proofErr w:type="gramEnd"/>
           </w:p>
         </w:tc>
         <w:tc>
@@ -7185,13 +7775,23 @@
                 <w:szCs w:val="24"/>
               </w:rPr>
             </w:pPr>
-            <w:r>
-              <w:rPr>
-                <w:b/>
-                <w:bCs/>
-                <w:szCs w:val="24"/>
-              </w:rPr>
-              <w:t>Cód-Nome</w:t>
+            <w:proofErr w:type="spellStart"/>
+            <w:r>
+              <w:rPr>
+                <w:b/>
+                <w:bCs/>
+                <w:szCs w:val="24"/>
+              </w:rPr>
+              <w:t>Cód</w:t>
+            </w:r>
+            <w:proofErr w:type="spellEnd"/>
+            <w:r>
+              <w:rPr>
+                <w:b/>
+                <w:bCs/>
+                <w:szCs w:val="24"/>
+              </w:rPr>
+              <w:t>-Nome</w:t>
             </w:r>
           </w:p>
         </w:tc>
@@ -7740,13 +8340,23 @@
                 <w:szCs w:val="24"/>
               </w:rPr>
             </w:pPr>
-            <w:r>
-              <w:rPr>
-                <w:b/>
-                <w:bCs/>
-                <w:szCs w:val="24"/>
-              </w:rPr>
-              <w:t>Cód-Nome</w:t>
+            <w:proofErr w:type="spellStart"/>
+            <w:r>
+              <w:rPr>
+                <w:b/>
+                <w:bCs/>
+                <w:szCs w:val="24"/>
+              </w:rPr>
+              <w:t>Cód</w:t>
+            </w:r>
+            <w:proofErr w:type="spellEnd"/>
+            <w:r>
+              <w:rPr>
+                <w:b/>
+                <w:bCs/>
+                <w:szCs w:val="24"/>
+              </w:rPr>
+              <w:t>-Nome</w:t>
             </w:r>
           </w:p>
         </w:tc>
@@ -8184,13 +8794,23 @@
                 <w:szCs w:val="24"/>
               </w:rPr>
             </w:pPr>
-            <w:r>
-              <w:rPr>
-                <w:b/>
-                <w:bCs/>
-                <w:szCs w:val="24"/>
-              </w:rPr>
-              <w:t>Cód-Nome</w:t>
+            <w:proofErr w:type="spellStart"/>
+            <w:r>
+              <w:rPr>
+                <w:b/>
+                <w:bCs/>
+                <w:szCs w:val="24"/>
+              </w:rPr>
+              <w:t>Cód</w:t>
+            </w:r>
+            <w:proofErr w:type="spellEnd"/>
+            <w:r>
+              <w:rPr>
+                <w:b/>
+                <w:bCs/>
+                <w:szCs w:val="24"/>
+              </w:rPr>
+              <w:t>-Nome</w:t>
             </w:r>
           </w:p>
         </w:tc>
@@ -8638,13 +9258,23 @@
                 <w:szCs w:val="24"/>
               </w:rPr>
             </w:pPr>
-            <w:r>
-              <w:rPr>
-                <w:b/>
-                <w:bCs/>
-                <w:szCs w:val="24"/>
-              </w:rPr>
-              <w:t>Cód-Nome</w:t>
+            <w:proofErr w:type="spellStart"/>
+            <w:r>
+              <w:rPr>
+                <w:b/>
+                <w:bCs/>
+                <w:szCs w:val="24"/>
+              </w:rPr>
+              <w:t>Cód</w:t>
+            </w:r>
+            <w:proofErr w:type="spellEnd"/>
+            <w:r>
+              <w:rPr>
+                <w:b/>
+                <w:bCs/>
+                <w:szCs w:val="24"/>
+              </w:rPr>
+              <w:t>-Nome</w:t>
             </w:r>
           </w:p>
         </w:tc>
@@ -9079,13 +9709,23 @@
                 <w:szCs w:val="24"/>
               </w:rPr>
             </w:pPr>
-            <w:r>
-              <w:rPr>
-                <w:b/>
-                <w:bCs/>
-                <w:szCs w:val="24"/>
-              </w:rPr>
-              <w:t>Cód-Nome</w:t>
+            <w:proofErr w:type="spellStart"/>
+            <w:r>
+              <w:rPr>
+                <w:b/>
+                <w:bCs/>
+                <w:szCs w:val="24"/>
+              </w:rPr>
+              <w:t>Cód</w:t>
+            </w:r>
+            <w:proofErr w:type="spellEnd"/>
+            <w:r>
+              <w:rPr>
+                <w:b/>
+                <w:bCs/>
+                <w:szCs w:val="24"/>
+              </w:rPr>
+              <w:t>-Nome</w:t>
             </w:r>
           </w:p>
         </w:tc>
@@ -9620,13 +10260,23 @@
                 <w:szCs w:val="24"/>
               </w:rPr>
             </w:pPr>
-            <w:r>
-              <w:rPr>
-                <w:b/>
-                <w:bCs/>
-                <w:szCs w:val="24"/>
-              </w:rPr>
-              <w:t>Cód-Nome</w:t>
+            <w:proofErr w:type="spellStart"/>
+            <w:r>
+              <w:rPr>
+                <w:b/>
+                <w:bCs/>
+                <w:szCs w:val="24"/>
+              </w:rPr>
+              <w:t>Cód</w:t>
+            </w:r>
+            <w:proofErr w:type="spellEnd"/>
+            <w:r>
+              <w:rPr>
+                <w:b/>
+                <w:bCs/>
+                <w:szCs w:val="24"/>
+              </w:rPr>
+              <w:t>-Nome</w:t>
             </w:r>
           </w:p>
         </w:tc>
@@ -9859,74 +10509,965 @@
         </w:rPr>
       </w:pPr>
     </w:p>
-    <w:p>
-      <w:pPr>
-        <w:spacing w:line="360" w:lineRule="auto"/>
-        <w:rPr>
-          <w:szCs w:val="24"/>
-        </w:rPr>
-      </w:pPr>
-    </w:p>
-    <w:p>
-      <w:pPr>
-        <w:spacing w:line="360" w:lineRule="auto"/>
-        <w:rPr>
-          <w:szCs w:val="24"/>
-        </w:rPr>
-      </w:pPr>
-    </w:p>
-    <w:p>
-      <w:pPr>
-        <w:spacing w:line="360" w:lineRule="auto"/>
-        <w:rPr>
-          <w:szCs w:val="24"/>
-        </w:rPr>
-      </w:pPr>
-    </w:p>
-    <w:p>
-      <w:pPr>
-        <w:spacing w:line="360" w:lineRule="auto"/>
-        <w:rPr>
-          <w:szCs w:val="24"/>
-        </w:rPr>
-      </w:pPr>
-    </w:p>
-    <w:p>
-      <w:pPr>
-        <w:spacing w:line="360" w:lineRule="auto"/>
-        <w:jc w:val="both"/>
-        <w:rPr>
-          <w:szCs w:val="24"/>
-        </w:rPr>
-      </w:pPr>
-    </w:p>
-    <w:p>
-      <w:pPr>
-        <w:spacing w:line="360" w:lineRule="auto"/>
-        <w:jc w:val="both"/>
-        <w:rPr>
-          <w:szCs w:val="24"/>
-        </w:rPr>
-      </w:pPr>
-    </w:p>
-    <w:p>
-      <w:pPr>
-        <w:spacing w:line="360" w:lineRule="auto"/>
-        <w:jc w:val="both"/>
-        <w:rPr>
-          <w:szCs w:val="24"/>
-        </w:rPr>
-      </w:pPr>
-    </w:p>
-    <w:p>
-      <w:pPr>
-        <w:spacing w:line="360" w:lineRule="auto"/>
-        <w:jc w:val="both"/>
-        <w:rPr>
-          <w:szCs w:val="24"/>
-        </w:rPr>
-      </w:pPr>
-    </w:p>
+    <w:tbl>
+      <w:tblPr>
+        <w:tblStyle w:val="Tabelacomgrade"/>
+        <w:tblW w:w="0" w:type="auto"/>
+        <w:tblLook w:val="04A0" w:firstRow="1" w:lastRow="0" w:firstColumn="1" w:lastColumn="0" w:noHBand="0" w:noVBand="1"/>
+      </w:tblPr>
+      <w:tblGrid>
+        <w:gridCol w:w="1299"/>
+        <w:gridCol w:w="539"/>
+        <w:gridCol w:w="1063"/>
+        <w:gridCol w:w="3254"/>
+        <w:gridCol w:w="2541"/>
+      </w:tblGrid>
+      <w:tr>
+        <w:tc>
+          <w:tcPr>
+            <w:tcW w:w="1299" w:type="dxa"/>
+          </w:tcPr>
+          <w:p>
+            <w:pPr>
+              <w:spacing w:line="360" w:lineRule="auto"/>
+              <w:rPr>
+                <w:b/>
+                <w:bCs/>
+                <w:szCs w:val="24"/>
+              </w:rPr>
+            </w:pPr>
+            <w:r>
+              <w:rPr>
+                <w:b/>
+                <w:bCs/>
+                <w:szCs w:val="24"/>
+              </w:rPr>
+              <w:t>F1</w:t>
+            </w:r>
+            <w:r>
+              <w:rPr>
+                <w:b/>
+                <w:bCs/>
+                <w:szCs w:val="24"/>
+              </w:rPr>
+              <w:t>4</w:t>
+            </w:r>
+          </w:p>
+        </w:tc>
+        <w:tc>
+          <w:tcPr>
+            <w:tcW w:w="7397" w:type="dxa"/>
+            <w:gridSpan w:val="4"/>
+          </w:tcPr>
+          <w:p>
+            <w:pPr>
+              <w:spacing w:line="360" w:lineRule="auto"/>
+              <w:rPr>
+                <w:szCs w:val="24"/>
+              </w:rPr>
+            </w:pPr>
+            <w:r>
+              <w:t>Entrar na Empresa</w:t>
+            </w:r>
+          </w:p>
+        </w:tc>
+      </w:tr>
+      <w:tr>
+        <w:tc>
+          <w:tcPr>
+            <w:tcW w:w="1299" w:type="dxa"/>
+          </w:tcPr>
+          <w:p>
+            <w:pPr>
+              <w:spacing w:line="360" w:lineRule="auto"/>
+              <w:rPr>
+                <w:b/>
+                <w:bCs/>
+                <w:szCs w:val="24"/>
+              </w:rPr>
+            </w:pPr>
+            <w:r>
+              <w:rPr>
+                <w:b/>
+                <w:bCs/>
+                <w:szCs w:val="24"/>
+              </w:rPr>
+              <w:t>Descrição</w:t>
+            </w:r>
+          </w:p>
+        </w:tc>
+        <w:tc>
+          <w:tcPr>
+            <w:tcW w:w="7397" w:type="dxa"/>
+            <w:gridSpan w:val="4"/>
+          </w:tcPr>
+          <w:p>
+            <w:pPr>
+              <w:spacing w:line="360" w:lineRule="auto"/>
+              <w:rPr>
+                <w:szCs w:val="24"/>
+              </w:rPr>
+            </w:pPr>
+            <w:r>
+              <w:t>O funcionário vincula-se a uma empresa informando o código único de acesso, gerado no cadastro da empresa e repassado pelo administrador.</w:t>
+            </w:r>
+          </w:p>
+        </w:tc>
+      </w:tr>
+      <w:tr>
+        <w:tc>
+          <w:tcPr>
+            <w:tcW w:w="1838" w:type="dxa"/>
+            <w:gridSpan w:val="2"/>
+          </w:tcPr>
+          <w:p>
+            <w:pPr>
+              <w:spacing w:line="360" w:lineRule="auto"/>
+              <w:rPr>
+                <w:b/>
+                <w:bCs/>
+                <w:szCs w:val="24"/>
+              </w:rPr>
+            </w:pPr>
+            <w:r>
+              <w:rPr>
+                <w:b/>
+                <w:bCs/>
+                <w:szCs w:val="24"/>
+              </w:rPr>
+              <w:t>Pré-condição</w:t>
+            </w:r>
+          </w:p>
+        </w:tc>
+        <w:tc>
+          <w:tcPr>
+            <w:tcW w:w="6858" w:type="dxa"/>
+            <w:gridSpan w:val="3"/>
+          </w:tcPr>
+          <w:p>
+            <w:pPr>
+              <w:spacing w:line="360" w:lineRule="auto"/>
+              <w:rPr>
+                <w:szCs w:val="24"/>
+              </w:rPr>
+            </w:pPr>
+            <w:r>
+              <w:t>O usuário deve estar autenticado como funcionário e não possuir empresa vinculada.</w:t>
+            </w:r>
+          </w:p>
+        </w:tc>
+      </w:tr>
+      <w:tr>
+        <w:tc>
+          <w:tcPr>
+            <w:tcW w:w="1838" w:type="dxa"/>
+            <w:gridSpan w:val="2"/>
+          </w:tcPr>
+          <w:p>
+            <w:pPr>
+              <w:spacing w:line="360" w:lineRule="auto"/>
+              <w:rPr>
+                <w:b/>
+                <w:bCs/>
+                <w:szCs w:val="24"/>
+              </w:rPr>
+            </w:pPr>
+            <w:r>
+              <w:rPr>
+                <w:b/>
+                <w:bCs/>
+                <w:szCs w:val="24"/>
+              </w:rPr>
+              <w:t>Pós-condição</w:t>
+            </w:r>
+          </w:p>
+        </w:tc>
+        <w:tc>
+          <w:tcPr>
+            <w:tcW w:w="6858" w:type="dxa"/>
+            <w:gridSpan w:val="3"/>
+          </w:tcPr>
+          <w:p>
+            <w:pPr>
+              <w:spacing w:line="360" w:lineRule="auto"/>
+              <w:rPr>
+                <w:szCs w:val="24"/>
+              </w:rPr>
+            </w:pPr>
+            <w:r>
+              <w:t>O usuário é vinculado à empresa correspondente ao código e passa a ter acesso às funcionalidades de funcionário.</w:t>
+            </w:r>
+          </w:p>
+        </w:tc>
+      </w:tr>
+      <w:tr>
+        <w:tc>
+          <w:tcPr>
+            <w:tcW w:w="8696" w:type="dxa"/>
+            <w:gridSpan w:val="5"/>
+          </w:tcPr>
+          <w:p>
+            <w:pPr>
+              <w:spacing w:line="360" w:lineRule="auto"/>
+              <w:jc w:val="center"/>
+              <w:rPr>
+                <w:b/>
+                <w:bCs/>
+                <w:szCs w:val="24"/>
+              </w:rPr>
+            </w:pPr>
+            <w:r>
+              <w:rPr>
+                <w:b/>
+                <w:bCs/>
+                <w:szCs w:val="24"/>
+              </w:rPr>
+              <w:lastRenderedPageBreak/>
+              <w:t>Requisitos Não Funcional</w:t>
+            </w:r>
+          </w:p>
+        </w:tc>
+      </w:tr>
+      <w:tr>
+        <w:tc>
+          <w:tcPr>
+            <w:tcW w:w="2901" w:type="dxa"/>
+            <w:gridSpan w:val="3"/>
+          </w:tcPr>
+          <w:p>
+            <w:pPr>
+              <w:spacing w:line="360" w:lineRule="auto"/>
+              <w:jc w:val="center"/>
+              <w:rPr>
+                <w:b/>
+                <w:bCs/>
+                <w:szCs w:val="24"/>
+              </w:rPr>
+            </w:pPr>
+            <w:proofErr w:type="spellStart"/>
+            <w:r>
+              <w:rPr>
+                <w:b/>
+                <w:bCs/>
+                <w:szCs w:val="24"/>
+              </w:rPr>
+              <w:t>Cód</w:t>
+            </w:r>
+            <w:proofErr w:type="spellEnd"/>
+            <w:r>
+              <w:rPr>
+                <w:b/>
+                <w:bCs/>
+                <w:szCs w:val="24"/>
+              </w:rPr>
+              <w:t>-Nome</w:t>
+            </w:r>
+          </w:p>
+        </w:tc>
+        <w:tc>
+          <w:tcPr>
+            <w:tcW w:w="3254" w:type="dxa"/>
+          </w:tcPr>
+          <w:p>
+            <w:pPr>
+              <w:spacing w:line="360" w:lineRule="auto"/>
+              <w:jc w:val="center"/>
+              <w:rPr>
+                <w:b/>
+                <w:bCs/>
+                <w:szCs w:val="24"/>
+              </w:rPr>
+            </w:pPr>
+            <w:r>
+              <w:rPr>
+                <w:b/>
+                <w:bCs/>
+                <w:szCs w:val="24"/>
+              </w:rPr>
+              <w:t>Descrição</w:t>
+            </w:r>
+          </w:p>
+        </w:tc>
+        <w:tc>
+          <w:tcPr>
+            <w:tcW w:w="2541" w:type="dxa"/>
+          </w:tcPr>
+          <w:p>
+            <w:pPr>
+              <w:spacing w:line="360" w:lineRule="auto"/>
+              <w:jc w:val="center"/>
+              <w:rPr>
+                <w:b/>
+                <w:bCs/>
+                <w:szCs w:val="24"/>
+              </w:rPr>
+            </w:pPr>
+            <w:r>
+              <w:rPr>
+                <w:b/>
+                <w:bCs/>
+                <w:szCs w:val="24"/>
+              </w:rPr>
+              <w:t>Categoria</w:t>
+            </w:r>
+          </w:p>
+        </w:tc>
+      </w:tr>
+      <w:tr>
+        <w:tc>
+          <w:tcPr>
+            <w:tcW w:w="2901" w:type="dxa"/>
+            <w:gridSpan w:val="3"/>
+          </w:tcPr>
+          <w:p>
+            <w:pPr>
+              <w:spacing w:line="360" w:lineRule="auto"/>
+              <w:rPr>
+                <w:szCs w:val="24"/>
+              </w:rPr>
+            </w:pPr>
+            <w:r>
+              <w:rPr>
+                <w:szCs w:val="24"/>
+              </w:rPr>
+              <w:t>NF14.1 Validação de código</w:t>
+            </w:r>
+          </w:p>
+        </w:tc>
+        <w:tc>
+          <w:tcPr>
+            <w:tcW w:w="3254" w:type="dxa"/>
+          </w:tcPr>
+          <w:p>
+            <w:pPr>
+              <w:spacing w:line="360" w:lineRule="auto"/>
+              <w:rPr>
+                <w:szCs w:val="24"/>
+              </w:rPr>
+            </w:pPr>
+            <w:r>
+              <w:t>O sistema deve rejeitar códigos inexistentes, informando erro ao usuário.</w:t>
+            </w:r>
+          </w:p>
+        </w:tc>
+        <w:tc>
+          <w:tcPr>
+            <w:tcW w:w="2541" w:type="dxa"/>
+          </w:tcPr>
+          <w:p>
+            <w:pPr>
+              <w:spacing w:line="360" w:lineRule="auto"/>
+              <w:rPr>
+                <w:szCs w:val="24"/>
+              </w:rPr>
+            </w:pPr>
+            <w:r>
+              <w:rPr>
+                <w:szCs w:val="24"/>
+              </w:rPr>
+              <w:t>Produto</w:t>
+            </w:r>
+          </w:p>
+        </w:tc>
+      </w:tr>
+      <w:tr>
+        <w:tc>
+          <w:tcPr>
+            <w:tcW w:w="2901" w:type="dxa"/>
+            <w:gridSpan w:val="3"/>
+          </w:tcPr>
+          <w:p>
+            <w:pPr>
+              <w:spacing w:line="360" w:lineRule="auto"/>
+              <w:rPr>
+                <w:szCs w:val="24"/>
+              </w:rPr>
+            </w:pPr>
+            <w:r>
+              <w:rPr>
+                <w:szCs w:val="24"/>
+              </w:rPr>
+              <w:t>NF14.2 Vínculo único</w:t>
+            </w:r>
+          </w:p>
+        </w:tc>
+        <w:tc>
+          <w:tcPr>
+            <w:tcW w:w="3254" w:type="dxa"/>
+          </w:tcPr>
+          <w:p>
+            <w:pPr>
+              <w:spacing w:line="360" w:lineRule="auto"/>
+              <w:rPr>
+                <w:szCs w:val="24"/>
+              </w:rPr>
+            </w:pPr>
+            <w:r>
+              <w:t>O sistema não deve permitir que um usuário já vinculado a uma empresa entre em outra.</w:t>
+            </w:r>
+          </w:p>
+        </w:tc>
+        <w:tc>
+          <w:tcPr>
+            <w:tcW w:w="2541" w:type="dxa"/>
+          </w:tcPr>
+          <w:p>
+            <w:pPr>
+              <w:spacing w:line="360" w:lineRule="auto"/>
+              <w:rPr>
+                <w:szCs w:val="24"/>
+              </w:rPr>
+            </w:pPr>
+            <w:r>
+              <w:rPr>
+                <w:szCs w:val="24"/>
+              </w:rPr>
+              <w:t>Usabilidade</w:t>
+            </w:r>
+          </w:p>
+        </w:tc>
+      </w:tr>
+      <w:tr>
+        <w:tc>
+          <w:tcPr>
+            <w:tcW w:w="2901" w:type="dxa"/>
+            <w:gridSpan w:val="3"/>
+          </w:tcPr>
+          <w:p>
+            <w:pPr>
+              <w:spacing w:line="360" w:lineRule="auto"/>
+              <w:rPr>
+                <w:szCs w:val="24"/>
+              </w:rPr>
+            </w:pPr>
+            <w:r>
+              <w:rPr>
+                <w:szCs w:val="24"/>
+              </w:rPr>
+              <w:t>NF14.3 Isolamento de dados</w:t>
+            </w:r>
+          </w:p>
+        </w:tc>
+        <w:tc>
+          <w:tcPr>
+            <w:tcW w:w="3254" w:type="dxa"/>
+          </w:tcPr>
+          <w:p>
+            <w:pPr>
+              <w:spacing w:line="360" w:lineRule="auto"/>
+              <w:rPr>
+                <w:szCs w:val="24"/>
+              </w:rPr>
+            </w:pPr>
+            <w:r>
+              <w:t>O funcionário deve acessar exclusivamente os dados da empresa à qual está vinculado.</w:t>
+            </w:r>
+          </w:p>
+        </w:tc>
+        <w:tc>
+          <w:tcPr>
+            <w:tcW w:w="2541" w:type="dxa"/>
+          </w:tcPr>
+          <w:p>
+            <w:pPr>
+              <w:spacing w:line="360" w:lineRule="auto"/>
+              <w:rPr>
+                <w:szCs w:val="24"/>
+              </w:rPr>
+            </w:pPr>
+            <w:r>
+              <w:rPr>
+                <w:szCs w:val="24"/>
+              </w:rPr>
+              <w:t>Usabilidade</w:t>
+            </w:r>
+          </w:p>
+        </w:tc>
+      </w:tr>
+    </w:tbl>
+    <w:p>
+      <w:pPr>
+        <w:spacing w:line="360" w:lineRule="auto"/>
+        <w:rPr>
+          <w:szCs w:val="24"/>
+        </w:rPr>
+      </w:pPr>
+    </w:p>
+    <w:tbl>
+      <w:tblPr>
+        <w:tblStyle w:val="Tabelacomgrade"/>
+        <w:tblW w:w="0" w:type="auto"/>
+        <w:tblLook w:val="04A0" w:firstRow="1" w:lastRow="0" w:firstColumn="1" w:lastColumn="0" w:noHBand="0" w:noVBand="1"/>
+      </w:tblPr>
+      <w:tblGrid>
+        <w:gridCol w:w="1299"/>
+        <w:gridCol w:w="539"/>
+        <w:gridCol w:w="1063"/>
+        <w:gridCol w:w="3254"/>
+        <w:gridCol w:w="2541"/>
+      </w:tblGrid>
+      <w:tr>
+        <w:tc>
+          <w:tcPr>
+            <w:tcW w:w="1299" w:type="dxa"/>
+          </w:tcPr>
+          <w:p>
+            <w:pPr>
+              <w:spacing w:line="360" w:lineRule="auto"/>
+              <w:rPr>
+                <w:b/>
+                <w:bCs/>
+                <w:szCs w:val="24"/>
+              </w:rPr>
+            </w:pPr>
+            <w:r>
+              <w:rPr>
+                <w:b/>
+                <w:bCs/>
+                <w:szCs w:val="24"/>
+              </w:rPr>
+              <w:t>F1</w:t>
+            </w:r>
+            <w:r>
+              <w:rPr>
+                <w:b/>
+                <w:bCs/>
+                <w:szCs w:val="24"/>
+              </w:rPr>
+              <w:t>5</w:t>
+            </w:r>
+          </w:p>
+        </w:tc>
+        <w:tc>
+          <w:tcPr>
+            <w:tcW w:w="7397" w:type="dxa"/>
+            <w:gridSpan w:val="4"/>
+          </w:tcPr>
+          <w:p>
+            <w:pPr>
+              <w:spacing w:line="360" w:lineRule="auto"/>
+              <w:rPr>
+                <w:szCs w:val="24"/>
+              </w:rPr>
+            </w:pPr>
+            <w:r>
+              <w:t>Completar Cadastro de Funcionário</w:t>
+            </w:r>
+          </w:p>
+        </w:tc>
+      </w:tr>
+      <w:tr>
+        <w:tc>
+          <w:tcPr>
+            <w:tcW w:w="1299" w:type="dxa"/>
+          </w:tcPr>
+          <w:p>
+            <w:pPr>
+              <w:spacing w:line="360" w:lineRule="auto"/>
+              <w:rPr>
+                <w:b/>
+                <w:bCs/>
+                <w:szCs w:val="24"/>
+              </w:rPr>
+            </w:pPr>
+            <w:r>
+              <w:rPr>
+                <w:b/>
+                <w:bCs/>
+                <w:szCs w:val="24"/>
+              </w:rPr>
+              <w:t>Descrição</w:t>
+            </w:r>
+          </w:p>
+        </w:tc>
+        <w:tc>
+          <w:tcPr>
+            <w:tcW w:w="7397" w:type="dxa"/>
+            <w:gridSpan w:val="4"/>
+          </w:tcPr>
+          <w:p>
+            <w:pPr>
+              <w:spacing w:line="360" w:lineRule="auto"/>
+              <w:rPr>
+                <w:szCs w:val="24"/>
+              </w:rPr>
+            </w:pPr>
+            <w:r>
+              <w:t>Após vincular-se à empresa, o funcionário conclui seu cadastro informando data de nascimento e setor de atuação.</w:t>
+            </w:r>
+          </w:p>
+        </w:tc>
+      </w:tr>
+      <w:tr>
+        <w:tc>
+          <w:tcPr>
+            <w:tcW w:w="1838" w:type="dxa"/>
+            <w:gridSpan w:val="2"/>
+          </w:tcPr>
+          <w:p>
+            <w:pPr>
+              <w:spacing w:line="360" w:lineRule="auto"/>
+              <w:rPr>
+                <w:b/>
+                <w:bCs/>
+                <w:szCs w:val="24"/>
+              </w:rPr>
+            </w:pPr>
+            <w:r>
+              <w:rPr>
+                <w:b/>
+                <w:bCs/>
+                <w:szCs w:val="24"/>
+              </w:rPr>
+              <w:t>Pré-condição</w:t>
+            </w:r>
+          </w:p>
+        </w:tc>
+        <w:tc>
+          <w:tcPr>
+            <w:tcW w:w="6858" w:type="dxa"/>
+            <w:gridSpan w:val="3"/>
+          </w:tcPr>
+          <w:p>
+            <w:pPr>
+              <w:spacing w:line="360" w:lineRule="auto"/>
+              <w:rPr>
+                <w:szCs w:val="24"/>
+              </w:rPr>
+            </w:pPr>
+            <w:r>
+              <w:t>O usuário deve estar vinculado a uma empresa e ainda não possuir cadastro de funcionário concluído.</w:t>
+            </w:r>
+          </w:p>
+        </w:tc>
+      </w:tr>
+      <w:tr>
+        <w:tc>
+          <w:tcPr>
+            <w:tcW w:w="1838" w:type="dxa"/>
+            <w:gridSpan w:val="2"/>
+          </w:tcPr>
+          <w:p>
+            <w:pPr>
+              <w:spacing w:line="360" w:lineRule="auto"/>
+              <w:rPr>
+                <w:b/>
+                <w:bCs/>
+                <w:szCs w:val="24"/>
+              </w:rPr>
+            </w:pPr>
+            <w:r>
+              <w:rPr>
+                <w:b/>
+                <w:bCs/>
+                <w:szCs w:val="24"/>
+              </w:rPr>
+              <w:t>Pós-condição</w:t>
+            </w:r>
+          </w:p>
+        </w:tc>
+        <w:tc>
+          <w:tcPr>
+            <w:tcW w:w="6858" w:type="dxa"/>
+            <w:gridSpan w:val="3"/>
+          </w:tcPr>
+          <w:p>
+            <w:pPr>
+              <w:spacing w:line="360" w:lineRule="auto"/>
+              <w:rPr>
+                <w:szCs w:val="24"/>
+              </w:rPr>
+            </w:pPr>
+            <w:r>
+              <w:t>O registro do funcionário é criado no banco de dados com status ativo, habilitando-o a solicitar e receber EPIs.</w:t>
+            </w:r>
+          </w:p>
+        </w:tc>
+      </w:tr>
+      <w:tr>
+        <w:tc>
+          <w:tcPr>
+            <w:tcW w:w="8696" w:type="dxa"/>
+            <w:gridSpan w:val="5"/>
+          </w:tcPr>
+          <w:p>
+            <w:pPr>
+              <w:spacing w:line="360" w:lineRule="auto"/>
+              <w:jc w:val="center"/>
+              <w:rPr>
+                <w:b/>
+                <w:bCs/>
+                <w:szCs w:val="24"/>
+              </w:rPr>
+            </w:pPr>
+            <w:r>
+              <w:rPr>
+                <w:b/>
+                <w:bCs/>
+                <w:szCs w:val="24"/>
+              </w:rPr>
+              <w:t>Requisitos Não Funcional</w:t>
+            </w:r>
+          </w:p>
+        </w:tc>
+      </w:tr>
+      <w:tr>
+        <w:tc>
+          <w:tcPr>
+            <w:tcW w:w="2901" w:type="dxa"/>
+            <w:gridSpan w:val="3"/>
+          </w:tcPr>
+          <w:p>
+            <w:pPr>
+              <w:spacing w:line="360" w:lineRule="auto"/>
+              <w:jc w:val="center"/>
+              <w:rPr>
+                <w:b/>
+                <w:bCs/>
+                <w:szCs w:val="24"/>
+              </w:rPr>
+            </w:pPr>
+            <w:proofErr w:type="spellStart"/>
+            <w:r>
+              <w:rPr>
+                <w:b/>
+                <w:bCs/>
+                <w:szCs w:val="24"/>
+              </w:rPr>
+              <w:t>Cód</w:t>
+            </w:r>
+            <w:proofErr w:type="spellEnd"/>
+            <w:r>
+              <w:rPr>
+                <w:b/>
+                <w:bCs/>
+                <w:szCs w:val="24"/>
+              </w:rPr>
+              <w:t>-Nome</w:t>
+            </w:r>
+          </w:p>
+        </w:tc>
+        <w:tc>
+          <w:tcPr>
+            <w:tcW w:w="3254" w:type="dxa"/>
+          </w:tcPr>
+          <w:p>
+            <w:pPr>
+              <w:spacing w:line="360" w:lineRule="auto"/>
+              <w:jc w:val="center"/>
+              <w:rPr>
+                <w:b/>
+                <w:bCs/>
+                <w:szCs w:val="24"/>
+              </w:rPr>
+            </w:pPr>
+            <w:r>
+              <w:rPr>
+                <w:b/>
+                <w:bCs/>
+                <w:szCs w:val="24"/>
+              </w:rPr>
+              <w:t>Descrição</w:t>
+            </w:r>
+          </w:p>
+        </w:tc>
+        <w:tc>
+          <w:tcPr>
+            <w:tcW w:w="2541" w:type="dxa"/>
+          </w:tcPr>
+          <w:p>
+            <w:pPr>
+              <w:spacing w:line="360" w:lineRule="auto"/>
+              <w:jc w:val="center"/>
+              <w:rPr>
+                <w:b/>
+                <w:bCs/>
+                <w:szCs w:val="24"/>
+              </w:rPr>
+            </w:pPr>
+            <w:r>
+              <w:rPr>
+                <w:b/>
+                <w:bCs/>
+                <w:szCs w:val="24"/>
+              </w:rPr>
+              <w:t>Categoria</w:t>
+            </w:r>
+          </w:p>
+        </w:tc>
+      </w:tr>
+      <w:tr>
+        <w:tc>
+          <w:tcPr>
+            <w:tcW w:w="2901" w:type="dxa"/>
+            <w:gridSpan w:val="3"/>
+          </w:tcPr>
+          <w:p>
+            <w:pPr>
+              <w:spacing w:line="360" w:lineRule="auto"/>
+              <w:rPr>
+                <w:szCs w:val="24"/>
+              </w:rPr>
+            </w:pPr>
+            <w:r>
+              <w:rPr>
+                <w:szCs w:val="24"/>
+              </w:rPr>
+              <w:t>NF15.1 Idade mínima</w:t>
+            </w:r>
+          </w:p>
+        </w:tc>
+        <w:tc>
+          <w:tcPr>
+            <w:tcW w:w="3254" w:type="dxa"/>
+          </w:tcPr>
+          <w:p>
+            <w:pPr>
+              <w:spacing w:line="360" w:lineRule="auto"/>
+              <w:rPr>
+                <w:szCs w:val="24"/>
+              </w:rPr>
+            </w:pPr>
+            <w:r>
+              <w:t>O sistema não deve permitir o cadastro de funcionário com menos de 18 anos.</w:t>
+            </w:r>
+          </w:p>
+        </w:tc>
+        <w:tc>
+          <w:tcPr>
+            <w:tcW w:w="2541" w:type="dxa"/>
+          </w:tcPr>
+          <w:p>
+            <w:pPr>
+              <w:spacing w:line="360" w:lineRule="auto"/>
+              <w:rPr>
+                <w:szCs w:val="24"/>
+              </w:rPr>
+            </w:pPr>
+            <w:r>
+              <w:rPr>
+                <w:szCs w:val="24"/>
+              </w:rPr>
+              <w:t>Produto</w:t>
+            </w:r>
+          </w:p>
+        </w:tc>
+      </w:tr>
+      <w:tr>
+        <w:tc>
+          <w:tcPr>
+            <w:tcW w:w="2901" w:type="dxa"/>
+            <w:gridSpan w:val="3"/>
+          </w:tcPr>
+          <w:p>
+            <w:pPr>
+              <w:spacing w:line="360" w:lineRule="auto"/>
+              <w:rPr>
+                <w:szCs w:val="24"/>
+              </w:rPr>
+            </w:pPr>
+            <w:r>
+              <w:rPr>
+                <w:szCs w:val="24"/>
+              </w:rPr>
+              <w:t>NF15.2 Setor válido</w:t>
+            </w:r>
+          </w:p>
+        </w:tc>
+        <w:tc>
+          <w:tcPr>
+            <w:tcW w:w="3254" w:type="dxa"/>
+          </w:tcPr>
+          <w:p>
+            <w:pPr>
+              <w:spacing w:line="360" w:lineRule="auto"/>
+              <w:rPr>
+                <w:szCs w:val="24"/>
+              </w:rPr>
+            </w:pPr>
+            <w:r>
+              <w:t>O sistema deve aceitar apenas setores pertencentes à empresa do funcionário.</w:t>
+            </w:r>
+          </w:p>
+        </w:tc>
+        <w:tc>
+          <w:tcPr>
+            <w:tcW w:w="2541" w:type="dxa"/>
+          </w:tcPr>
+          <w:p>
+            <w:pPr>
+              <w:spacing w:line="360" w:lineRule="auto"/>
+              <w:rPr>
+                <w:szCs w:val="24"/>
+              </w:rPr>
+            </w:pPr>
+            <w:r>
+              <w:rPr>
+                <w:szCs w:val="24"/>
+              </w:rPr>
+              <w:t>Usabilidade</w:t>
+            </w:r>
+          </w:p>
+        </w:tc>
+      </w:tr>
+      <w:tr>
+        <w:tc>
+          <w:tcPr>
+            <w:tcW w:w="2901" w:type="dxa"/>
+            <w:gridSpan w:val="3"/>
+          </w:tcPr>
+          <w:p>
+            <w:pPr>
+              <w:spacing w:line="360" w:lineRule="auto"/>
+              <w:rPr>
+                <w:szCs w:val="24"/>
+              </w:rPr>
+            </w:pPr>
+            <w:r>
+              <w:rPr>
+                <w:szCs w:val="24"/>
+              </w:rPr>
+              <w:t>NF15.3 Cadastro único</w:t>
+            </w:r>
+          </w:p>
+        </w:tc>
+        <w:tc>
+          <w:tcPr>
+            <w:tcW w:w="3254" w:type="dxa"/>
+          </w:tcPr>
+          <w:p>
+            <w:pPr>
+              <w:spacing w:line="360" w:lineRule="auto"/>
+              <w:rPr>
+                <w:szCs w:val="24"/>
+              </w:rPr>
+            </w:pPr>
+            <w:r>
+              <w:t>O sistema não deve permitir que o funcionário conclua o cadastro mais de uma vez.</w:t>
+            </w:r>
+          </w:p>
+        </w:tc>
+        <w:tc>
+          <w:tcPr>
+            <w:tcW w:w="2541" w:type="dxa"/>
+          </w:tcPr>
+          <w:p>
+            <w:pPr>
+              <w:spacing w:line="360" w:lineRule="auto"/>
+              <w:rPr>
+                <w:szCs w:val="24"/>
+              </w:rPr>
+            </w:pPr>
+            <w:r>
+              <w:rPr>
+                <w:szCs w:val="24"/>
+              </w:rPr>
+              <w:t>Segurança</w:t>
+            </w:r>
+          </w:p>
+        </w:tc>
+      </w:tr>
+    </w:tbl>
     <w:p>
       <w:pPr>
         <w:spacing w:line="360" w:lineRule="auto"/>
@@ -10255,36 +11796,37 @@
         <w:rPr>
           <w:szCs w:val="24"/>
         </w:rPr>
-        <w:t>A escolha das tecnologias do SIGEPI foi baseada em dois critérios principais: a familiaridade da equipe com as ferramentas e a adequação de cada tecnologia às necessidades do sistema. A seguir, são descritas as principais tecnologias adotadas e a justificada para cada escolha.</w:t>
-      </w:r>
-    </w:p>
-    <w:p>
-      <w:pPr>
-        <w:spacing w:line="360" w:lineRule="auto"/>
-        <w:jc w:val="both"/>
-        <w:rPr>
-          <w:szCs w:val="24"/>
-        </w:rPr>
-      </w:pPr>
-    </w:p>
-    <w:p>
-      <w:pPr>
-        <w:spacing w:line="360" w:lineRule="auto"/>
-        <w:jc w:val="both"/>
-        <w:rPr>
-          <w:b/>
-          <w:bCs/>
-          <w:szCs w:val="24"/>
-        </w:rPr>
-      </w:pPr>
-      <w:r>
-        <w:rPr>
-          <w:b/>
-          <w:bCs/>
-          <w:szCs w:val="24"/>
-        </w:rPr>
-        <w:t>Front-end</w:t>
-      </w:r>
+        <w:t>A escolha das tecnologias do SIGEPI foi baseada em dois critérios principais: a familiaridade da equipe com as ferramentas e a adequação de cada tecnologia às necessidades do sistema. A seguir, são descritas as principais tecnologias adotadas e a justificativa para cada escolha.</w:t>
+      </w:r>
+    </w:p>
+    <w:p>
+      <w:pPr>
+        <w:spacing w:line="360" w:lineRule="auto"/>
+        <w:jc w:val="both"/>
+        <w:rPr>
+          <w:b/>
+          <w:bCs/>
+          <w:szCs w:val="24"/>
+        </w:rPr>
+      </w:pPr>
+      <w:r>
+        <w:rPr>
+          <w:b/>
+          <w:bCs/>
+          <w:szCs w:val="24"/>
+        </w:rPr>
+        <w:t>Front-</w:t>
+      </w:r>
+      <w:proofErr w:type="spellStart"/>
+      <w:r>
+        <w:rPr>
+          <w:b/>
+          <w:bCs/>
+          <w:szCs w:val="24"/>
+        </w:rPr>
+        <w:t>end</w:t>
+      </w:r>
+      <w:proofErr w:type="spellEnd"/>
     </w:p>
     <w:p>
       <w:pPr>
@@ -10299,42 +11841,79 @@
         <w:rPr>
           <w:szCs w:val="24"/>
         </w:rPr>
-        <w:t xml:space="preserve">A interface do sistema </w:t>
-      </w:r>
-      <w:r>
-        <w:rPr>
-          <w:szCs w:val="24"/>
-        </w:rPr>
-        <w:t>será construída com HTML, CSS e JavaScript puro. Essa combinação foi escolhida por ser a base do desenvolvimento web e por já ter sido trabalhada pela equipe durante o curso. O JavaScript será utilizado para a manipulação dinâmica da interface e para a comunicação com a API do back-end por meio de requisições assíncronas.</w:t>
-      </w:r>
-    </w:p>
-    <w:p>
-      <w:pPr>
-        <w:spacing w:line="360" w:lineRule="auto"/>
-        <w:jc w:val="both"/>
-        <w:rPr>
-          <w:szCs w:val="24"/>
-        </w:rPr>
-      </w:pPr>
-    </w:p>
-    <w:p>
-      <w:pPr>
-        <w:spacing w:line="360" w:lineRule="auto"/>
-        <w:jc w:val="both"/>
-        <w:rPr>
-          <w:b/>
-          <w:bCs/>
-          <w:szCs w:val="24"/>
-        </w:rPr>
-      </w:pPr>
-      <w:r>
-        <w:rPr>
-          <w:b/>
-          <w:bCs/>
-          <w:szCs w:val="24"/>
-        </w:rPr>
-        <w:t>Back-end</w:t>
-      </w:r>
+        <w:t xml:space="preserve">A interface do sistema foi construída com HTML, CSS e </w:t>
+      </w:r>
+      <w:proofErr w:type="spellStart"/>
+      <w:r>
+        <w:rPr>
+          <w:szCs w:val="24"/>
+        </w:rPr>
+        <w:t>JavaScript</w:t>
+      </w:r>
+      <w:proofErr w:type="spellEnd"/>
+      <w:r>
+        <w:rPr>
+          <w:szCs w:val="24"/>
+        </w:rPr>
+        <w:t xml:space="preserve"> puro. Essa combinação foi escolhida por ser a base do desenvolvimento web e por já ter sido trabalhada pela equipe durante o curso. O </w:t>
+      </w:r>
+      <w:proofErr w:type="spellStart"/>
+      <w:r>
+        <w:rPr>
+          <w:szCs w:val="24"/>
+        </w:rPr>
+        <w:t>JavaScript</w:t>
+      </w:r>
+      <w:proofErr w:type="spellEnd"/>
+      <w:r>
+        <w:rPr>
+          <w:szCs w:val="24"/>
+        </w:rPr>
+        <w:t xml:space="preserve"> foi utilizado para a manipulação dinâmica da interface e para a comunicação com a API do </w:t>
+      </w:r>
+      <w:proofErr w:type="spellStart"/>
+      <w:r>
+        <w:rPr>
+          <w:szCs w:val="24"/>
+        </w:rPr>
+        <w:t>back-end</w:t>
+      </w:r>
+      <w:proofErr w:type="spellEnd"/>
+      <w:r>
+        <w:rPr>
+          <w:szCs w:val="24"/>
+        </w:rPr>
+        <w:t xml:space="preserve"> por meio de requisições assíncronas.</w:t>
+      </w:r>
+    </w:p>
+    <w:p>
+      <w:pPr>
+        <w:spacing w:line="360" w:lineRule="auto"/>
+        <w:jc w:val="both"/>
+        <w:rPr>
+          <w:b/>
+          <w:bCs/>
+          <w:szCs w:val="24"/>
+        </w:rPr>
+      </w:pPr>
+      <w:r>
+        <w:rPr>
+          <w:b/>
+          <w:bCs/>
+          <w:szCs w:val="24"/>
+        </w:rPr>
+        <w:t>Back-</w:t>
+      </w:r>
+      <w:proofErr w:type="spellStart"/>
+      <w:r>
+        <w:rPr>
+          <w:b/>
+          <w:bCs/>
+          <w:szCs w:val="24"/>
+        </w:rPr>
+        <w:t>end</w:t>
+      </w:r>
+      <w:proofErr w:type="spellEnd"/>
     </w:p>
     <w:p>
       <w:pPr>
@@ -10349,23 +11928,106 @@
         <w:rPr>
           <w:szCs w:val="24"/>
         </w:rPr>
-        <w:t>O back-end da aplicação será desenvolvida</w:t>
-      </w:r>
-      <w:r>
-        <w:rPr>
-          <w:szCs w:val="24"/>
-        </w:rPr>
-        <w:t xml:space="preserve"> com Node.js, uma plataforma que permite executar JavaScript no servidor, e o framework Express.js, que simplifica a criação de APIs. O Express.js foi escolhido por sua leveza, flexibilidade e pela grande quantidade de bibliotecas disponíveis no ecossistema Node.js, como bcrypt para criptografia de senhas e jsonwebtoken para autenticação.</w:t>
-      </w:r>
-    </w:p>
-    <w:p>
-      <w:pPr>
-        <w:spacing w:line="360" w:lineRule="auto"/>
-        <w:jc w:val="both"/>
-        <w:rPr>
-          <w:szCs w:val="24"/>
-        </w:rPr>
-      </w:pPr>
+        <w:t xml:space="preserve">O </w:t>
+      </w:r>
+      <w:proofErr w:type="spellStart"/>
+      <w:r>
+        <w:rPr>
+          <w:szCs w:val="24"/>
+        </w:rPr>
+        <w:t>back-end</w:t>
+      </w:r>
+      <w:proofErr w:type="spellEnd"/>
+      <w:r>
+        <w:rPr>
+          <w:szCs w:val="24"/>
+        </w:rPr>
+        <w:t xml:space="preserve"> da aplicação foi desenvolvido com Node.js, plataforma que permite executar </w:t>
+      </w:r>
+      <w:proofErr w:type="spellStart"/>
+      <w:r>
+        <w:rPr>
+          <w:szCs w:val="24"/>
+        </w:rPr>
+        <w:t>JavaScript</w:t>
+      </w:r>
+      <w:proofErr w:type="spellEnd"/>
+      <w:r>
+        <w:rPr>
+          <w:szCs w:val="24"/>
+        </w:rPr>
+        <w:t xml:space="preserve"> no servidor, e com o framework Express.js, que simplifica a criação de APIs. O Express.js foi escolhido por sua leveza, flexibilidade e pela grande quantidade de bibliotecas disponíveis no ecossistema Node.js. Entre as bibliotecas utilizadas, destacam-se o </w:t>
+      </w:r>
+      <w:proofErr w:type="spellStart"/>
+      <w:r>
+        <w:rPr>
+          <w:szCs w:val="24"/>
+        </w:rPr>
+        <w:t>bcrypt</w:t>
+      </w:r>
+      <w:proofErr w:type="spellEnd"/>
+      <w:r>
+        <w:rPr>
+          <w:szCs w:val="24"/>
+        </w:rPr>
+        <w:t xml:space="preserve">, para a criptografia das senhas; o </w:t>
+      </w:r>
+      <w:proofErr w:type="spellStart"/>
+      <w:r>
+        <w:rPr>
+          <w:szCs w:val="24"/>
+        </w:rPr>
+        <w:t>jsonwebtoken</w:t>
+      </w:r>
+      <w:proofErr w:type="spellEnd"/>
+      <w:r>
+        <w:rPr>
+          <w:szCs w:val="24"/>
+        </w:rPr>
+        <w:t xml:space="preserve">, para a autenticação por meio de tokens JWT; e o </w:t>
+      </w:r>
+      <w:proofErr w:type="spellStart"/>
+      <w:r>
+        <w:rPr>
+          <w:szCs w:val="24"/>
+        </w:rPr>
+        <w:t>helmet</w:t>
+      </w:r>
+      <w:proofErr w:type="spellEnd"/>
+      <w:r>
+        <w:rPr>
+          <w:szCs w:val="24"/>
+        </w:rPr>
+        <w:t xml:space="preserve"> e o </w:t>
+      </w:r>
+      <w:proofErr w:type="spellStart"/>
+      <w:r>
+        <w:rPr>
+          <w:szCs w:val="24"/>
+        </w:rPr>
+        <w:t>express</w:t>
+      </w:r>
+      <w:proofErr w:type="spellEnd"/>
+      <w:r>
+        <w:rPr>
+          <w:szCs w:val="24"/>
+        </w:rPr>
+        <w:t>-rate-</w:t>
+      </w:r>
+      <w:proofErr w:type="spellStart"/>
+      <w:r>
+        <w:rPr>
+          <w:szCs w:val="24"/>
+        </w:rPr>
+        <w:t>limit</w:t>
+      </w:r>
+      <w:proofErr w:type="spellEnd"/>
+      <w:r>
+        <w:rPr>
+          <w:szCs w:val="24"/>
+        </w:rPr>
+        <w:t>, que reforçam a segurança da aplicação com cabeçalhos HTTP de proteção e limitação de tentativas de acesso.</w:t>
+      </w:r>
     </w:p>
     <w:p>
       <w:pPr>
@@ -10399,17 +12061,13 @@
           <w:szCs w:val="24"/>
         </w:rPr>
         <w:tab/>
-        <w:t>Para o armazenamento dos dados, será utilizado o MySQL, um sistema de gerenciamento de banco de dados relacional. Sua escolha se justifica pela necessidade de manter a integridade referencial entre as tabelas do sistema, como a relação entre funcionários, EPIs e movimentações de estoque. O MySQL é uma tecnologia madura, amplamente adotada no mercado e com suporte nativo no ecossistema Node.js via bibliotecas como mysql2.</w:t>
-      </w:r>
-    </w:p>
-    <w:p>
-      <w:pPr>
-        <w:spacing w:line="360" w:lineRule="auto"/>
-        <w:jc w:val="both"/>
-        <w:rPr>
-          <w:szCs w:val="24"/>
-        </w:rPr>
-      </w:pPr>
+      </w:r>
+      <w:r>
+        <w:rPr>
+          <w:szCs w:val="24"/>
+        </w:rPr>
+        <w:t>Para o armazenamento dos dados, foi utilizado o MySQL, um sistema de gerenciamento de banco de dados relacional. Sua escolha se justificou pela necessidade de manter a integridade referencial entre as tabelas do sistema, como a relação entre funcionários, EPIs e movimentações de estoque. O MySQL é uma tecnologia madura, amplamente adotada no mercado e com suporte nativo no ecossistema Node.js por meio de bibliotecas como o mysql2.</w:t>
+      </w:r>
     </w:p>
     <w:p>
       <w:pPr>
@@ -10443,7 +12101,68 @@
           <w:szCs w:val="24"/>
         </w:rPr>
         <w:tab/>
-        <w:t>Para o desenvolvimento do código, a equipe utilizará o Visual Studio Code, editor gratuito e amplamente adotado na indústria. A prototipação das telas foi realizada no Figma, que permitiu criar e validar as interfaces antes do desenvolvimento. Para testes de rotas da API, será utilizado o Postman, ferramenta que facilita o envio de requisições HTTP e a verificação das respostas do servidor.</w:t>
+      </w:r>
+      <w:r>
+        <w:rPr>
+          <w:szCs w:val="24"/>
+        </w:rPr>
+        <w:t xml:space="preserve">Para o desenvolvimento do código, a equipe utilizou o Visual Studio </w:t>
+      </w:r>
+      <w:proofErr w:type="spellStart"/>
+      <w:r>
+        <w:rPr>
+          <w:szCs w:val="24"/>
+        </w:rPr>
+        <w:t>Code</w:t>
+      </w:r>
+      <w:proofErr w:type="spellEnd"/>
+      <w:r>
+        <w:rPr>
+          <w:szCs w:val="24"/>
+        </w:rPr>
+        <w:t xml:space="preserve">, editor gratuito e amplamente adotado na indústria. A prototipação das telas foi realizada no </w:t>
+      </w:r>
+      <w:proofErr w:type="spellStart"/>
+      <w:r>
+        <w:rPr>
+          <w:szCs w:val="24"/>
+        </w:rPr>
+        <w:t>Figma</w:t>
+      </w:r>
+      <w:proofErr w:type="spellEnd"/>
+      <w:r>
+        <w:rPr>
+          <w:szCs w:val="24"/>
+        </w:rPr>
+        <w:t xml:space="preserve">, que permitiu criar e validar as interfaces antes do desenvolvimento. Para os testes das rotas da API, foi utilizado o </w:t>
+      </w:r>
+      <w:proofErr w:type="spellStart"/>
+      <w:r>
+        <w:rPr>
+          <w:szCs w:val="24"/>
+        </w:rPr>
+        <w:t>Postman</w:t>
+      </w:r>
+      <w:proofErr w:type="spellEnd"/>
+      <w:r>
+        <w:rPr>
+          <w:szCs w:val="24"/>
+        </w:rPr>
+        <w:t xml:space="preserve">, ferramenta que facilita o envio de requisições HTTP e a verificação das respostas do servidor. O controle de versão do código foi feito com </w:t>
+      </w:r>
+      <w:proofErr w:type="spellStart"/>
+      <w:r>
+        <w:rPr>
+          <w:szCs w:val="24"/>
+        </w:rPr>
+        <w:t>Git</w:t>
+      </w:r>
+      <w:proofErr w:type="spellEnd"/>
+      <w:r>
+        <w:rPr>
+          <w:szCs w:val="24"/>
+        </w:rPr>
+        <w:t xml:space="preserve"> e GitHub.</w:t>
       </w:r>
     </w:p>
     <w:p>
@@ -10479,212 +12198,233 @@
           <w:szCs w:val="24"/>
         </w:rPr>
         <w:tab/>
-        <w:t>Após a conclusão da versão web, o sistema será adaptado para funcionar como um Progressive Web App. Essa abordagem permite que o SIGEPI seja instalado em dispositivos móveis como se fosse um aplicativo nativo, sem a necessidade de publicação de lojas como Google Play ou App Store. O PWA utiliza recursos como Service Workers e Web App Manifest para oferecer uma experiência próxima à de um aplicativo móvel, mantendo a mesma base de código da versão web.</w:t>
-      </w:r>
-    </w:p>
-    <w:p>
-      <w:pPr>
-        <w:spacing w:line="360" w:lineRule="auto"/>
-        <w:jc w:val="both"/>
-        <w:rPr>
-          <w:szCs w:val="24"/>
-        </w:rPr>
-      </w:pPr>
-    </w:p>
-    <w:p>
-      <w:pPr>
-        <w:spacing w:line="360" w:lineRule="auto"/>
-        <w:jc w:val="both"/>
-        <w:rPr>
-          <w:szCs w:val="24"/>
-        </w:rPr>
-      </w:pPr>
-    </w:p>
-    <w:p>
-      <w:pPr>
-        <w:spacing w:line="360" w:lineRule="auto"/>
-        <w:jc w:val="both"/>
-        <w:rPr>
-          <w:szCs w:val="24"/>
-        </w:rPr>
-      </w:pPr>
-    </w:p>
-    <w:p>
-      <w:pPr>
-        <w:spacing w:line="360" w:lineRule="auto"/>
-        <w:jc w:val="both"/>
-        <w:rPr>
-          <w:szCs w:val="24"/>
-        </w:rPr>
-      </w:pPr>
-    </w:p>
-    <w:p>
-      <w:pPr>
-        <w:spacing w:line="360" w:lineRule="auto"/>
-        <w:jc w:val="both"/>
-        <w:rPr>
-          <w:szCs w:val="24"/>
-        </w:rPr>
-      </w:pPr>
-    </w:p>
-    <w:p>
-      <w:pPr>
-        <w:spacing w:line="360" w:lineRule="auto"/>
-        <w:jc w:val="both"/>
-        <w:rPr>
-          <w:szCs w:val="24"/>
-        </w:rPr>
-      </w:pPr>
-    </w:p>
-    <w:p>
-      <w:pPr>
-        <w:spacing w:line="360" w:lineRule="auto"/>
-        <w:jc w:val="both"/>
-        <w:rPr>
-          <w:szCs w:val="24"/>
-        </w:rPr>
-      </w:pPr>
-    </w:p>
-    <w:p>
-      <w:pPr>
-        <w:spacing w:line="360" w:lineRule="auto"/>
-        <w:jc w:val="both"/>
-        <w:rPr>
-          <w:szCs w:val="24"/>
-        </w:rPr>
-      </w:pPr>
-    </w:p>
-    <w:p>
-      <w:pPr>
-        <w:spacing w:line="360" w:lineRule="auto"/>
-        <w:jc w:val="both"/>
-        <w:rPr>
-          <w:szCs w:val="24"/>
-        </w:rPr>
-      </w:pPr>
-    </w:p>
-    <w:p>
-      <w:pPr>
-        <w:spacing w:line="360" w:lineRule="auto"/>
-        <w:jc w:val="both"/>
-        <w:rPr>
-          <w:szCs w:val="24"/>
-        </w:rPr>
-      </w:pPr>
-    </w:p>
-    <w:p>
-      <w:pPr>
-        <w:spacing w:line="360" w:lineRule="auto"/>
-        <w:jc w:val="both"/>
-        <w:rPr>
-          <w:szCs w:val="24"/>
-        </w:rPr>
-      </w:pPr>
-    </w:p>
-    <w:p>
-      <w:pPr>
-        <w:spacing w:line="360" w:lineRule="auto"/>
-        <w:jc w:val="both"/>
-        <w:rPr>
-          <w:szCs w:val="24"/>
-        </w:rPr>
-      </w:pPr>
-    </w:p>
-    <w:p>
-      <w:pPr>
-        <w:spacing w:line="360" w:lineRule="auto"/>
-        <w:jc w:val="both"/>
-        <w:rPr>
-          <w:szCs w:val="24"/>
-        </w:rPr>
-      </w:pPr>
-    </w:p>
-    <w:p>
-      <w:pPr>
-        <w:spacing w:line="360" w:lineRule="auto"/>
-        <w:jc w:val="both"/>
-        <w:rPr>
-          <w:szCs w:val="24"/>
-        </w:rPr>
-      </w:pPr>
-    </w:p>
-    <w:p>
-      <w:pPr>
-        <w:spacing w:line="360" w:lineRule="auto"/>
-        <w:jc w:val="both"/>
-        <w:rPr>
-          <w:szCs w:val="24"/>
-        </w:rPr>
-      </w:pPr>
-    </w:p>
-    <w:p>
-      <w:pPr>
-        <w:spacing w:line="360" w:lineRule="auto"/>
-        <w:jc w:val="both"/>
-        <w:rPr>
-          <w:szCs w:val="24"/>
-        </w:rPr>
-      </w:pPr>
-    </w:p>
-    <w:p>
-      <w:pPr>
-        <w:spacing w:line="360" w:lineRule="auto"/>
-        <w:jc w:val="both"/>
-        <w:rPr>
-          <w:szCs w:val="24"/>
-        </w:rPr>
-      </w:pPr>
-    </w:p>
-    <w:p>
-      <w:pPr>
-        <w:spacing w:line="360" w:lineRule="auto"/>
-        <w:jc w:val="both"/>
-        <w:rPr>
-          <w:szCs w:val="24"/>
-        </w:rPr>
-      </w:pPr>
-    </w:p>
-    <w:p>
-      <w:pPr>
-        <w:spacing w:line="360" w:lineRule="auto"/>
-        <w:jc w:val="both"/>
-        <w:rPr>
-          <w:szCs w:val="24"/>
-        </w:rPr>
-      </w:pPr>
-    </w:p>
-    <w:p>
-      <w:pPr>
-        <w:spacing w:line="360" w:lineRule="auto"/>
-        <w:jc w:val="both"/>
-        <w:rPr>
-          <w:szCs w:val="24"/>
-        </w:rPr>
-      </w:pPr>
-    </w:p>
-    <w:p>
-      <w:pPr>
-        <w:spacing w:line="360" w:lineRule="auto"/>
-        <w:jc w:val="both"/>
-        <w:rPr>
-          <w:szCs w:val="24"/>
-        </w:rPr>
-      </w:pPr>
-    </w:p>
-    <w:p>
-      <w:pPr>
-        <w:spacing w:line="360" w:lineRule="auto"/>
-        <w:jc w:val="both"/>
-        <w:rPr>
-          <w:szCs w:val="24"/>
-        </w:rPr>
-      </w:pPr>
-    </w:p>
-    <w:p>
-      <w:pPr>
-        <w:spacing w:line="360" w:lineRule="auto"/>
-        <w:jc w:val="both"/>
-        <w:rPr>
+      </w:r>
+      <w:r>
+        <w:rPr>
+          <w:szCs w:val="24"/>
+        </w:rPr>
+        <w:t xml:space="preserve">Após a conclusão da versão web, o sistema será adaptado para funcionar como um Progressive Web App. Essa abordagem permitirá que o SIGEPI seja instalado em dispositivos móveis como se fosse um aplicativo nativo, sem a necessidade de publicação em lojas como Google Play ou App Store. O PWA utiliza recursos como Service Workers e Web App </w:t>
+      </w:r>
+      <w:proofErr w:type="spellStart"/>
+      <w:r>
+        <w:rPr>
+          <w:szCs w:val="24"/>
+        </w:rPr>
+        <w:t>Manifest</w:t>
+      </w:r>
+      <w:proofErr w:type="spellEnd"/>
+      <w:r>
+        <w:rPr>
+          <w:szCs w:val="24"/>
+        </w:rPr>
+        <w:t xml:space="preserve"> para oferecer uma experiência próxima à de um aplicativo móvel, mantendo a mesma base de código da versão web.</w:t>
+      </w:r>
+    </w:p>
+    <w:p>
+      <w:pPr>
+        <w:spacing w:line="360" w:lineRule="auto"/>
+        <w:jc w:val="both"/>
+        <w:rPr>
+          <w:szCs w:val="24"/>
+        </w:rPr>
+      </w:pPr>
+    </w:p>
+    <w:p>
+      <w:pPr>
+        <w:spacing w:line="360" w:lineRule="auto"/>
+        <w:jc w:val="both"/>
+        <w:rPr>
+          <w:szCs w:val="24"/>
+        </w:rPr>
+      </w:pPr>
+    </w:p>
+    <w:p>
+      <w:pPr>
+        <w:spacing w:line="360" w:lineRule="auto"/>
+        <w:jc w:val="both"/>
+        <w:rPr>
+          <w:szCs w:val="24"/>
+        </w:rPr>
+      </w:pPr>
+    </w:p>
+    <w:p>
+      <w:pPr>
+        <w:spacing w:line="360" w:lineRule="auto"/>
+        <w:jc w:val="both"/>
+        <w:rPr>
+          <w:szCs w:val="24"/>
+        </w:rPr>
+      </w:pPr>
+    </w:p>
+    <w:p>
+      <w:pPr>
+        <w:spacing w:line="360" w:lineRule="auto"/>
+        <w:jc w:val="both"/>
+        <w:rPr>
+          <w:szCs w:val="24"/>
+        </w:rPr>
+      </w:pPr>
+    </w:p>
+    <w:p>
+      <w:pPr>
+        <w:spacing w:line="360" w:lineRule="auto"/>
+        <w:jc w:val="both"/>
+        <w:rPr>
+          <w:szCs w:val="24"/>
+        </w:rPr>
+      </w:pPr>
+    </w:p>
+    <w:p>
+      <w:pPr>
+        <w:spacing w:line="360" w:lineRule="auto"/>
+        <w:jc w:val="both"/>
+        <w:rPr>
+          <w:szCs w:val="24"/>
+        </w:rPr>
+      </w:pPr>
+    </w:p>
+    <w:p>
+      <w:pPr>
+        <w:spacing w:line="360" w:lineRule="auto"/>
+        <w:jc w:val="both"/>
+        <w:rPr>
+          <w:szCs w:val="24"/>
+        </w:rPr>
+      </w:pPr>
+    </w:p>
+    <w:p>
+      <w:pPr>
+        <w:spacing w:line="360" w:lineRule="auto"/>
+        <w:jc w:val="both"/>
+        <w:rPr>
+          <w:szCs w:val="24"/>
+        </w:rPr>
+      </w:pPr>
+    </w:p>
+    <w:p>
+      <w:pPr>
+        <w:spacing w:line="360" w:lineRule="auto"/>
+        <w:jc w:val="both"/>
+        <w:rPr>
+          <w:szCs w:val="24"/>
+        </w:rPr>
+      </w:pPr>
+    </w:p>
+    <w:p>
+      <w:pPr>
+        <w:spacing w:line="360" w:lineRule="auto"/>
+        <w:jc w:val="both"/>
+        <w:rPr>
+          <w:szCs w:val="24"/>
+        </w:rPr>
+      </w:pPr>
+    </w:p>
+    <w:p>
+      <w:pPr>
+        <w:spacing w:line="360" w:lineRule="auto"/>
+        <w:jc w:val="both"/>
+        <w:rPr>
+          <w:szCs w:val="24"/>
+        </w:rPr>
+      </w:pPr>
+    </w:p>
+    <w:p>
+      <w:pPr>
+        <w:spacing w:line="360" w:lineRule="auto"/>
+        <w:jc w:val="both"/>
+        <w:rPr>
+          <w:szCs w:val="24"/>
+        </w:rPr>
+      </w:pPr>
+    </w:p>
+    <w:p>
+      <w:pPr>
+        <w:spacing w:line="360" w:lineRule="auto"/>
+        <w:jc w:val="both"/>
+        <w:rPr>
+          <w:szCs w:val="24"/>
+        </w:rPr>
+      </w:pPr>
+    </w:p>
+    <w:p>
+      <w:pPr>
+        <w:spacing w:line="360" w:lineRule="auto"/>
+        <w:jc w:val="both"/>
+        <w:rPr>
+          <w:szCs w:val="24"/>
+        </w:rPr>
+      </w:pPr>
+    </w:p>
+    <w:p>
+      <w:pPr>
+        <w:spacing w:line="360" w:lineRule="auto"/>
+        <w:jc w:val="both"/>
+        <w:rPr>
+          <w:szCs w:val="24"/>
+        </w:rPr>
+      </w:pPr>
+    </w:p>
+    <w:p>
+      <w:pPr>
+        <w:spacing w:line="360" w:lineRule="auto"/>
+        <w:jc w:val="both"/>
+        <w:rPr>
+          <w:szCs w:val="24"/>
+        </w:rPr>
+      </w:pPr>
+    </w:p>
+    <w:p>
+      <w:pPr>
+        <w:spacing w:line="360" w:lineRule="auto"/>
+        <w:jc w:val="both"/>
+        <w:rPr>
+          <w:szCs w:val="24"/>
+        </w:rPr>
+      </w:pPr>
+    </w:p>
+    <w:p>
+      <w:pPr>
+        <w:spacing w:line="360" w:lineRule="auto"/>
+        <w:jc w:val="both"/>
+        <w:rPr>
+          <w:szCs w:val="24"/>
+        </w:rPr>
+      </w:pPr>
+    </w:p>
+    <w:p>
+      <w:pPr>
+        <w:spacing w:line="360" w:lineRule="auto"/>
+        <w:jc w:val="both"/>
+        <w:rPr>
+          <w:szCs w:val="24"/>
+        </w:rPr>
+      </w:pPr>
+    </w:p>
+    <w:p>
+      <w:pPr>
+        <w:spacing w:line="360" w:lineRule="auto"/>
+        <w:jc w:val="both"/>
+        <w:rPr>
+          <w:szCs w:val="24"/>
+        </w:rPr>
+      </w:pPr>
+    </w:p>
+    <w:p>
+      <w:pPr>
+        <w:spacing w:line="360" w:lineRule="auto"/>
+        <w:jc w:val="both"/>
+        <w:rPr>
+          <w:szCs w:val="24"/>
+        </w:rPr>
+      </w:pPr>
+    </w:p>
+    <w:p>
+      <w:pPr>
+        <w:spacing w:line="360" w:lineRule="auto"/>
+        <w:jc w:val="both"/>
+        <w:rPr>
+          <w:b/>
+          <w:bCs/>
           <w:szCs w:val="24"/>
         </w:rPr>
       </w:pPr>
@@ -10766,19 +12506,12 @@
           <w:szCs w:val="24"/>
         </w:rPr>
         <w:tab/>
-        <w:t xml:space="preserve">O banco de dados do SIGEPI foi projetado seguindo o modelo relacional, com implementação prevista em MySQL. O objetivo da modelagem é garantir </w:t>
-      </w:r>
-      <w:r>
-        <w:rPr>
-          <w:szCs w:val="24"/>
-        </w:rPr>
-        <w:t xml:space="preserve">a </w:t>
-      </w:r>
-      <w:r>
-        <w:rPr>
-          <w:szCs w:val="24"/>
-        </w:rPr>
-        <w:t>integridade dos dados, rastreabilidade das movimentações e suporte eficiente às consultas realizadas pelo sistema.</w:t>
+      </w:r>
+      <w:r>
+        <w:rPr>
+          <w:szCs w:val="24"/>
+        </w:rPr>
+        <w:t>O banco de dados do SIGEPI foi projetado seguindo o modelo relacional e implementado em MySQL. O objetivo da modelagem foi garantir a integridade dos dados, a rastreabilidade das movimentações e o suporte eficiente às consultas realizadas pelo sistema. Um cuidado adotado em todo o modelo foi o uso do tipo ENUM nos campos de status e de tipo (situação de usuários, funcionários, EPIs, empresas, solicitações e entregas), que restringe os valores aceitos apenas aos previamente definidos, impedindo o registro de informações inválidas diretamente no banco — uma camada adicional de segurança e integridade.</w:t>
       </w:r>
     </w:p>
     <w:p>
@@ -10794,7 +12527,7 @@
         <w:rPr>
           <w:szCs w:val="24"/>
         </w:rPr>
-        <w:t>As principais entidades do banco de dados são: empresas, usuários, funcionários, EPIs, movimentações de estoque, entregas e solicitações. Cada entidade é representada por uma tabela, e os relacionamentos entre elas são estabelecidos por meio de chaves primárias e estrangeiras.</w:t>
+        <w:t>As principais entidades do banco de dados são: empresas, usuários, funcionários, setores, EPIs, estoque, movimentações de estoque, entregas, solicitações e logs de auditoria. Somam-se a elas tabelas auxiliares de apoio — cidade, endereço, categoria, tipo de usuário e o vínculo N:N entre EPIs e setores —, totalizando quinze tabelas. Cada entidade é representada por uma tabela, e os relacionamentos entre elas são estabelecidos por meio de chaves primárias e estrangeiras.</w:t>
       </w:r>
     </w:p>
     <w:p>
@@ -10810,7 +12543,7 @@
         <w:rPr>
           <w:szCs w:val="24"/>
         </w:rPr>
-        <w:t>A tabela de empresas é o ponto central do modelo, pois todos os dados cadastrados no sistema pertencem a uma empresa específica. Isso permite que o SIGEPI seja utilizado por múltiplas empresas de forma isolada, sem que os dados de uma organização sejam visíveis para outra.</w:t>
+        <w:t>A tabela de empresas é o ponto central do modelo, pois todos os dados cadastrados no sistema pertencem a uma empresa específica. Isso permite que o SIGEPI seja utilizado por múltiplas empresas de forma isolada, sem que os dados de uma organização sejam visíveis para outra. A empresa possui ainda um código de acesso único, gerado automaticamente, utilizado pelos funcionários para se vincularem a ela.</w:t>
       </w:r>
     </w:p>
     <w:p>
@@ -10826,13 +12559,7 @@
         <w:rPr>
           <w:szCs w:val="24"/>
         </w:rPr>
-        <w:t xml:space="preserve">A tabela de usuários armazena os dados de acesso ao sistema, incluindo e-mail, senha criptografada e perfil (administrador ou funcionário). A tabela </w:t>
-      </w:r>
-      <w:r>
-        <w:rPr>
-          <w:szCs w:val="24"/>
-        </w:rPr>
-        <w:t>de funcionários mantém as informações pessoais e profissionais de cada colaborador, como CPF, nome, cargo e setor.</w:t>
+        <w:t>A tabela de usuários armazena os dados de acesso — nome, e-mail, CPF, data de nascimento, senha criptografada e situação — e associa cada usuário a um perfil (administrador ou funcionário) por meio da tabela de tipos de usuário. O vínculo do usuário com uma empresa é opcional no momento do cadastro, o que permite que a conta exista antes de o usuário criar uma empresa (administrador) ou entrar em uma (funcionário, mediante o código de acesso). A tabela de funcionários complementa esses dados com nome, sobrenome, data de nascimento, setor de atuação e situação; quando um funcionário é inativado, o sistema registra também o motivo e a data da inativação, preservando o histórico por meio de exclusão lógica, sem apagar o registro.</w:t>
       </w:r>
     </w:p>
     <w:p>
@@ -10848,7 +12575,28 @@
         <w:rPr>
           <w:szCs w:val="24"/>
         </w:rPr>
-        <w:t>Os EPIs são cadastrados em uma tabela própria, que contém informações como nome do equipamento, número do Certificado de Aprovação (CA), validade e quantidade em estoque. As movimentações de estoque registram cada entrada ou saída de equipamento, permitindo o controle histórico do fluxo de EPIs.</w:t>
+        <w:t xml:space="preserve">Os EPIs são cadastrados em uma tabela própria, que contém nome, descrição, número e validade do Certificado de Aprovação (CA) e a categoria do equipamento. </w:t>
+      </w:r>
+      <w:r>
+        <w:rPr>
+          <w:szCs w:val="24"/>
+        </w:rPr>
+        <w:lastRenderedPageBreak/>
+        <w:t>As categorias não são criadas pelo usuário: correspondem às oito categorias de proteção previstas na NR-6, inseridas previamente no banco. A validade do CA (</w:t>
+      </w:r>
+      <w:proofErr w:type="spellStart"/>
+      <w:r>
+        <w:rPr>
+          <w:szCs w:val="24"/>
+        </w:rPr>
+        <w:t>dt_validade_ca</w:t>
+      </w:r>
+      <w:proofErr w:type="spellEnd"/>
+      <w:r>
+        <w:rPr>
+          <w:szCs w:val="24"/>
+        </w:rPr>
+        <w:t>) é o campo que alimenta o cálculo de situação dos EPIs — regular, próximo do vencimento ou vencido — exibido nos filtros e no painel de dashboard.</w:t>
       </w:r>
     </w:p>
     <w:p>
@@ -10864,7 +12612,7 @@
         <w:rPr>
           <w:szCs w:val="24"/>
         </w:rPr>
-        <w:t>A tabela de entregas registra cada EPI entregue a um funcionário, com data de entrega, data de devolução (quando aplicável) e referência ao usuário que realizou o registro. Por fim, a tabela de solicitações permite que funcionários solicitem a reposição de EPIs diretamente pelo sistema, com acompanhamento do status da solicitação pelo administrador.</w:t>
+        <w:t>O controle de estoque é feito por duas tabelas complementares: a de estoque, que mantém a quantidade disponível, a quantidade mínima e a validade de cada lote; e a de movimentações, que registra cada entrada ou saída de equipamento. A baixa de estoque segue a lógica FIFO (primeiro que entra, primeiro que sai), priorizando o lote de validade mais próxima, por meio de uma trigger que atualiza o estoque automaticamente a cada entrega registrada.</w:t>
       </w:r>
     </w:p>
     <w:p>
@@ -10880,7 +12628,51 @@
         <w:rPr>
           <w:szCs w:val="24"/>
         </w:rPr>
-        <w:t>O diagrama entidade-relacionamento (DER) do banco de dados será inserido nesta seção após a conclusão da modelagem completa, prevista para o início da fase de desenvolvimento em abril de 2026.</w:t>
+        <w:t>A tabela de entregas registra cada EPI entregue a um funcionário, com data de entrega, data de devolução (quando aplicável) e referência ao usuário que realizou o registro. A tabela de solicitações permite que os funcionários solicitem a reposição de EPIs, com acompanhamento do status (pendente, aprovada ou recusada) pelo administrador.</w:t>
+      </w:r>
+    </w:p>
+    <w:p>
+      <w:pPr>
+        <w:spacing w:line="360" w:lineRule="auto"/>
+        <w:ind w:firstLine="720"/>
+        <w:jc w:val="both"/>
+        <w:rPr>
+          <w:szCs w:val="24"/>
+        </w:rPr>
+      </w:pPr>
+      <w:r>
+        <w:rPr>
+          <w:szCs w:val="24"/>
+        </w:rPr>
+        <w:t>Por fim, a tabela de logs de auditoria é o pilar de rastreabilidade do sistema: nela é registrada automaticamente cada ação relevante — cadastro e inativação de EPIs, entradas e saídas de estoque, entregas, devoluções, edição e inativação de funcionários e a aprovação ou recusa de solicitações. Cada registro guarda o tipo da ação, a data e a hora, uma descrição, o responsável (nome e CPF) e a empresa correspondente, garantindo o histórico completo e auditável de tudo o que ocorre no sistema.</w:t>
+      </w:r>
+    </w:p>
+    <w:p>
+      <w:pPr>
+        <w:spacing w:line="360" w:lineRule="auto"/>
+        <w:ind w:firstLine="720"/>
+        <w:jc w:val="both"/>
+        <w:rPr>
+          <w:szCs w:val="24"/>
+        </w:rPr>
+      </w:pPr>
+      <w:r>
+        <w:rPr>
+          <w:szCs w:val="24"/>
+        </w:rPr>
+        <w:t xml:space="preserve">O diagrama entidade-relacionamento (DER) do banco de dados, apresentado na </w:t>
+      </w:r>
+      <w:r>
+        <w:rPr>
+          <w:szCs w:val="24"/>
+        </w:rPr>
+        <w:t>figura</w:t>
+      </w:r>
+      <w:r>
+        <w:rPr>
+          <w:szCs w:val="24"/>
+        </w:rPr>
+        <w:t xml:space="preserve"> a seguir, ilustra as tabelas do sistema e os relacionamentos estabelecidos entre elas.</w:t>
       </w:r>
     </w:p>
     <w:p>
@@ -11131,7 +12923,19 @@
           <w:szCs w:val="24"/>
         </w:rPr>
         <w:tab/>
-        <w:t>O desenvolvimento do SIGEPI está organizado em etapas ao longo do primeiro semestre de 2026, com previsão de apresentação final em dezembro do mesmo ano.</w:t>
+        <w:t xml:space="preserve">O desenvolvimento do SIGEPI está organizado em etapas ao longo do primeiro semestre de 2026, com previsão de apresentação final </w:t>
+      </w:r>
+      <w:r>
+        <w:rPr>
+          <w:szCs w:val="24"/>
+        </w:rPr>
+        <w:t>no início de</w:t>
+      </w:r>
+      <w:r>
+        <w:rPr>
+          <w:szCs w:val="24"/>
+        </w:rPr>
+        <w:t xml:space="preserve"> dezembro do mesmo ano.</w:t>
       </w:r>
     </w:p>
     <w:p>
@@ -11147,7 +12951,21 @@
           <w:szCs w:val="24"/>
         </w:rPr>
         <w:tab/>
-        <w:t>Entre fevereiro e março de 2026, a equipe concentrou esforços na fase de planejamento: levantamento de requisitos, definição das regras de negócio, elaboração da documentação inicial e criação do protótipo das telas do Figma. Esta etapa já foi concluída.</w:t>
+        <w:t xml:space="preserve">Entre fevereiro e março de 2026, a equipe concentrou esforços na fase de planejamento: levantamento de requisitos, definição das regras de negócio, elaboração da documentação inicial e criação do protótipo das telas do </w:t>
+      </w:r>
+      <w:proofErr w:type="spellStart"/>
+      <w:r>
+        <w:rPr>
+          <w:szCs w:val="24"/>
+        </w:rPr>
+        <w:t>Figma</w:t>
+      </w:r>
+      <w:proofErr w:type="spellEnd"/>
+      <w:r>
+        <w:rPr>
+          <w:szCs w:val="24"/>
+        </w:rPr>
+        <w:t>. Esta etapa já foi concluída.</w:t>
       </w:r>
     </w:p>
     <w:p>
@@ -11168,7 +12986,91 @@
         <w:rPr>
           <w:szCs w:val="24"/>
         </w:rPr>
-        <w:t>Em abril de 2026, teve início o desenvolvimento prático do sistema. A equipe concluiu o desenvolvimento de todas as 18 telas do front-end, com base no protótipo do Figma, sem uso de CSS inline e com script externo unificado. Em paralelo, foi iniciado o desenvolvimento do back-end com Node.js e Express.js, com as rotas de autenticação (cadastro e login com JWT e bcrypt) e cadastro de empresa já implementadas e testadas via Postman.</w:t>
+        <w:t>Em abril de 2026, teve início o desenvolvimento prático do sistema. A equipe concluiu o desenvolvimento de todas as 18 telas do front-</w:t>
+      </w:r>
+      <w:proofErr w:type="spellStart"/>
+      <w:r>
+        <w:rPr>
+          <w:szCs w:val="24"/>
+        </w:rPr>
+        <w:t>end</w:t>
+      </w:r>
+      <w:proofErr w:type="spellEnd"/>
+      <w:r>
+        <w:rPr>
+          <w:szCs w:val="24"/>
+        </w:rPr>
+        <w:t xml:space="preserve">, com base no protótipo do </w:t>
+      </w:r>
+      <w:proofErr w:type="spellStart"/>
+      <w:r>
+        <w:rPr>
+          <w:szCs w:val="24"/>
+        </w:rPr>
+        <w:t>Figma</w:t>
+      </w:r>
+      <w:proofErr w:type="spellEnd"/>
+      <w:r>
+        <w:rPr>
+          <w:szCs w:val="24"/>
+        </w:rPr>
+        <w:t xml:space="preserve">, sem uso de CSS </w:t>
+      </w:r>
+      <w:proofErr w:type="spellStart"/>
+      <w:r>
+        <w:rPr>
+          <w:szCs w:val="24"/>
+        </w:rPr>
+        <w:t>inline</w:t>
+      </w:r>
+      <w:proofErr w:type="spellEnd"/>
+      <w:r>
+        <w:rPr>
+          <w:szCs w:val="24"/>
+        </w:rPr>
+        <w:t xml:space="preserve"> e com script externo unificado. Em paralelo, foi iniciado o desenvolvimento do </w:t>
+      </w:r>
+      <w:proofErr w:type="spellStart"/>
+      <w:r>
+        <w:rPr>
+          <w:szCs w:val="24"/>
+        </w:rPr>
+        <w:t>back-end</w:t>
+      </w:r>
+      <w:proofErr w:type="spellEnd"/>
+      <w:r>
+        <w:rPr>
+          <w:szCs w:val="24"/>
+        </w:rPr>
+        <w:t xml:space="preserve"> com Node.js e Express.js, com as rotas de autenticação (cadastro e login com JWT e </w:t>
+      </w:r>
+      <w:proofErr w:type="spellStart"/>
+      <w:r>
+        <w:rPr>
+          <w:szCs w:val="24"/>
+        </w:rPr>
+        <w:t>bcrypt</w:t>
+      </w:r>
+      <w:proofErr w:type="spellEnd"/>
+      <w:r>
+        <w:rPr>
+          <w:szCs w:val="24"/>
+        </w:rPr>
+        <w:t xml:space="preserve">) e cadastro de empresa já implementadas e testadas via </w:t>
+      </w:r>
+      <w:proofErr w:type="spellStart"/>
+      <w:r>
+        <w:rPr>
+          <w:szCs w:val="24"/>
+        </w:rPr>
+        <w:t>Postman</w:t>
+      </w:r>
+      <w:proofErr w:type="spellEnd"/>
+      <w:r>
+        <w:rPr>
+          <w:szCs w:val="24"/>
+        </w:rPr>
+        <w:t>.</w:t>
       </w:r>
     </w:p>
     <w:p>
@@ -11189,7 +13091,33 @@
         <w:rPr>
           <w:szCs w:val="24"/>
         </w:rPr>
-        <w:t>Entre maio e julho de 2026, estão sendo implementadas as funcionalidades restantes do back-end: cadastro de setores, vinculação de funcionários à empresa, cadastro de EPIs, registro de entregas e devoluções, painel de dashboard e geração de relatórios em PDF. O banco de dados relacional foi finalizado com 1</w:t>
+        <w:t xml:space="preserve">Entre maio e julho de 2026, </w:t>
+      </w:r>
+      <w:r>
+        <w:rPr>
+          <w:szCs w:val="24"/>
+        </w:rPr>
+        <w:t>foram</w:t>
+      </w:r>
+      <w:r>
+        <w:rPr>
+          <w:szCs w:val="24"/>
+        </w:rPr>
+        <w:t xml:space="preserve"> implementadas as funcionalidades restantes do </w:t>
+      </w:r>
+      <w:proofErr w:type="spellStart"/>
+      <w:r>
+        <w:rPr>
+          <w:szCs w:val="24"/>
+        </w:rPr>
+        <w:t>back-end</w:t>
+      </w:r>
+      <w:proofErr w:type="spellEnd"/>
+      <w:r>
+        <w:rPr>
+          <w:szCs w:val="24"/>
+        </w:rPr>
+        <w:t>: cadastro de setores, vinculação de funcionários à empresa, cadastro de EPIs, registro de entregas e devoluções, painel de dashboard e geração de relatórios em PDF. O banco de dados relacional foi finalizado com 1</w:t>
       </w:r>
       <w:r>
         <w:rPr>
@@ -11217,7 +13145,19 @@
           <w:szCs w:val="24"/>
         </w:rPr>
         <w:tab/>
-        <w:t>Em agosto de 2026, será iniciada a adaptação para dispositivos móveis por meio do Progressive Web App (PWA)</w:t>
+        <w:t xml:space="preserve">Em agosto de 2026, </w:t>
+      </w:r>
+      <w:r>
+        <w:rPr>
+          <w:szCs w:val="24"/>
+        </w:rPr>
+        <w:t>foi</w:t>
+      </w:r>
+      <w:r>
+        <w:rPr>
+          <w:szCs w:val="24"/>
+        </w:rPr>
+        <w:t xml:space="preserve"> iniciada a adaptação para dispositivos móveis por meio do Progressive Web App (PWA)</w:t>
       </w:r>
       <w:r>
         <w:rPr>
@@ -11229,7 +13169,35 @@
         <w:rPr>
           <w:szCs w:val="24"/>
         </w:rPr>
-        <w:t>. Essa fase incluirá a configuração do Service Worker, do Web App Manifest e os ajustes de layout necessários para garantir boa usabilidade em telas menores.</w:t>
+        <w:t xml:space="preserve">. Essa fase incluirá a configuração do Service </w:t>
+      </w:r>
+      <w:proofErr w:type="spellStart"/>
+      <w:r>
+        <w:rPr>
+          <w:szCs w:val="24"/>
+        </w:rPr>
+        <w:t>Worker</w:t>
+      </w:r>
+      <w:proofErr w:type="spellEnd"/>
+      <w:r>
+        <w:rPr>
+          <w:szCs w:val="24"/>
+        </w:rPr>
+        <w:t xml:space="preserve">, do Web App </w:t>
+      </w:r>
+      <w:proofErr w:type="spellStart"/>
+      <w:r>
+        <w:rPr>
+          <w:szCs w:val="24"/>
+        </w:rPr>
+        <w:t>Manifest</w:t>
+      </w:r>
+      <w:proofErr w:type="spellEnd"/>
+      <w:r>
+        <w:rPr>
+          <w:szCs w:val="24"/>
+        </w:rPr>
+        <w:t xml:space="preserve"> e os ajustes de layout necessários para garantir boa usabilidade em telas menores.</w:t>
       </w:r>
     </w:p>
     <w:p>
@@ -11245,7 +13213,31 @@
           <w:szCs w:val="24"/>
         </w:rPr>
         <w:tab/>
-        <w:t>Entre setembro e novembro de 2026, serão realizadas as etapas de testes, correções e ajustes finais. Também será concluída a documentação do TCC, incluindo a atualização das seções com os resultados obtidos durante o desenvolvimento.</w:t>
+        <w:t xml:space="preserve">Entre setembro e novembro de 2026, </w:t>
+      </w:r>
+      <w:r>
+        <w:rPr>
+          <w:szCs w:val="24"/>
+        </w:rPr>
+        <w:t>foram</w:t>
+      </w:r>
+      <w:r>
+        <w:rPr>
+          <w:szCs w:val="24"/>
+        </w:rPr>
+        <w:t xml:space="preserve"> realizadas as etapas de testes, correções e ajustes finais. Também </w:t>
+      </w:r>
+      <w:r>
+        <w:rPr>
+          <w:szCs w:val="24"/>
+        </w:rPr>
+        <w:t xml:space="preserve">foi concluída </w:t>
+      </w:r>
+      <w:r>
+        <w:rPr>
+          <w:szCs w:val="24"/>
+        </w:rPr>
+        <w:t>a documentação do TCC, incluindo a atualização das seções com os resultados obtidos durante o desenvolvimento.</w:t>
       </w:r>
     </w:p>
     <w:p>
@@ -11365,7 +13357,6 @@
           <w:bCs/>
           <w:szCs w:val="24"/>
         </w:rPr>
-        <w:lastRenderedPageBreak/>
         <w:t>12 IDENTIDADE VISUAL</w:t>
       </w:r>
     </w:p>
@@ -11419,7 +13410,77 @@
         <w:rPr>
           <w:szCs w:val="24"/>
         </w:rPr>
-        <w:t>A tipografia adotada é a família Poppins, importada do Google Fonts, com três pesos distintos: Semibold (títulos e botões), Regular (corpo de texto e labels) e Light (placeholders e textos secundários). Os tamanhos seguem uma hierarquia de 36px para títulos de página, 24px para subtítulos, 16px para corpo de texto, 14px para labels e 12px para textos secundários.</w:t>
+        <w:t xml:space="preserve">A tipografia adotada é a família Poppins, importada do Google </w:t>
+      </w:r>
+      <w:proofErr w:type="spellStart"/>
+      <w:r>
+        <w:rPr>
+          <w:szCs w:val="24"/>
+        </w:rPr>
+        <w:t>Fonts</w:t>
+      </w:r>
+      <w:proofErr w:type="spellEnd"/>
+      <w:r>
+        <w:rPr>
+          <w:szCs w:val="24"/>
+        </w:rPr>
+        <w:t xml:space="preserve">, com três pesos distintos: </w:t>
+      </w:r>
+      <w:proofErr w:type="spellStart"/>
+      <w:r>
+        <w:rPr>
+          <w:szCs w:val="24"/>
+        </w:rPr>
+        <w:t>Semibold</w:t>
+      </w:r>
+      <w:proofErr w:type="spellEnd"/>
+      <w:r>
+        <w:rPr>
+          <w:szCs w:val="24"/>
+        </w:rPr>
+        <w:t xml:space="preserve"> (títulos e botões), Regular (corpo de texto e </w:t>
+      </w:r>
+      <w:proofErr w:type="spellStart"/>
+      <w:r>
+        <w:rPr>
+          <w:szCs w:val="24"/>
+        </w:rPr>
+        <w:t>labels</w:t>
+      </w:r>
+      <w:proofErr w:type="spellEnd"/>
+      <w:r>
+        <w:rPr>
+          <w:szCs w:val="24"/>
+        </w:rPr>
+        <w:t>) e Light (</w:t>
+      </w:r>
+      <w:proofErr w:type="spellStart"/>
+      <w:r>
+        <w:rPr>
+          <w:szCs w:val="24"/>
+        </w:rPr>
+        <w:t>placeholders</w:t>
+      </w:r>
+      <w:proofErr w:type="spellEnd"/>
+      <w:r>
+        <w:rPr>
+          <w:szCs w:val="24"/>
+        </w:rPr>
+        <w:t xml:space="preserve"> e textos secundários). Os tamanhos seguem uma hierarquia de 36px para títulos de página, 24px para subtítulos, 16px para corpo de texto, 14px para </w:t>
+      </w:r>
+      <w:proofErr w:type="spellStart"/>
+      <w:r>
+        <w:rPr>
+          <w:szCs w:val="24"/>
+        </w:rPr>
+        <w:t>labels</w:t>
+      </w:r>
+      <w:proofErr w:type="spellEnd"/>
+      <w:r>
+        <w:rPr>
+          <w:szCs w:val="24"/>
+        </w:rPr>
+        <w:t xml:space="preserve"> e 12px para textos secundários.</w:t>
       </w:r>
     </w:p>
     <w:p>
@@ -11453,17 +13514,6 @@
         </w:rPr>
         <w:t>A interface foi projetada para ser totalmente responsiva, adaptando-se a diferentes tamanhos de tela. Em dispositivos móveis, o sistema será acessível por meio do Progressive Web App (PWA), mantendo a mesma identidade visual da versão web.</w:t>
       </w:r>
-    </w:p>
-    <w:p>
-      <w:pPr>
-        <w:spacing w:line="360" w:lineRule="auto"/>
-        <w:jc w:val="both"/>
-        <w:rPr>
-          <w:b/>
-          <w:bCs/>
-          <w:szCs w:val="24"/>
-        </w:rPr>
-      </w:pPr>
     </w:p>
     <w:p>
       <w:pPr>
@@ -11604,7 +13654,63 @@
         <w:rPr>
           <w:szCs w:val="24"/>
         </w:rPr>
-        <w:t>Antes do início do desenvolvimento, a equipe elaborou os wireframes das principais telas do SIGEPI utilizando o Figma. Os wireframes serviram como referência inicial para validar o fluxo de navegação e a estrutura das interfaces. A partir dos wireframes, foi desenvolvido o protótipo de alta fidelidade, totalmente alinhado à identidade visual definida.</w:t>
+        <w:t xml:space="preserve">Antes do início do desenvolvimento, a equipe elaborou os </w:t>
+      </w:r>
+      <w:proofErr w:type="spellStart"/>
+      <w:r>
+        <w:rPr>
+          <w:szCs w:val="24"/>
+        </w:rPr>
+        <w:t>wireframes</w:t>
+      </w:r>
+      <w:proofErr w:type="spellEnd"/>
+      <w:r>
+        <w:rPr>
+          <w:szCs w:val="24"/>
+        </w:rPr>
+        <w:t xml:space="preserve"> das principais telas do SIGEPI utilizando o </w:t>
+      </w:r>
+      <w:proofErr w:type="spellStart"/>
+      <w:r>
+        <w:rPr>
+          <w:szCs w:val="24"/>
+        </w:rPr>
+        <w:t>Figma</w:t>
+      </w:r>
+      <w:proofErr w:type="spellEnd"/>
+      <w:r>
+        <w:rPr>
+          <w:szCs w:val="24"/>
+        </w:rPr>
+        <w:t xml:space="preserve">. Os </w:t>
+      </w:r>
+      <w:proofErr w:type="spellStart"/>
+      <w:r>
+        <w:rPr>
+          <w:szCs w:val="24"/>
+        </w:rPr>
+        <w:t>wireframes</w:t>
+      </w:r>
+      <w:proofErr w:type="spellEnd"/>
+      <w:r>
+        <w:rPr>
+          <w:szCs w:val="24"/>
+        </w:rPr>
+        <w:t xml:space="preserve"> serviram como referência inicial para validar o fluxo de navegação e a estrutura das interfaces. A partir dos </w:t>
+      </w:r>
+      <w:proofErr w:type="spellStart"/>
+      <w:r>
+        <w:rPr>
+          <w:szCs w:val="24"/>
+        </w:rPr>
+        <w:t>wireframes</w:t>
+      </w:r>
+      <w:proofErr w:type="spellEnd"/>
+      <w:r>
+        <w:rPr>
+          <w:szCs w:val="24"/>
+        </w:rPr>
+        <w:t>, foi desenvolvido o protótipo de alta fidelidade, totalmente alinhado à identidade visual definida.</w:t>
       </w:r>
     </w:p>
     <w:p>
@@ -11620,7 +13726,21 @@
         <w:rPr>
           <w:szCs w:val="24"/>
         </w:rPr>
-        <w:t>O protótipo final conta com 39 telas exportadas, cobrindo todos os fluxos do sistema: termos e condições, login, cadastro, home, cadastro de empresa, setores, dashboard, EPIs, funcionários, histórico, meus equipamentos, informações complementares e as seções de configuração de empresa e setores. Cada tela foi prototipada com fidelidade à identidade visual, utilizando as cores, tipografia e componentes que foram implementados no front-end.</w:t>
+        <w:t xml:space="preserve">O protótipo final conta com 39 telas exportadas, cobrindo todos os fluxos do sistema: termos e condições, login, cadastro, home, cadastro de empresa, setores, dashboard, EPIs, funcionários, histórico, meus equipamentos, informações complementares e as seções de configuração de empresa e setores. Cada tela foi </w:t>
+      </w:r>
+      <w:proofErr w:type="spellStart"/>
+      <w:r>
+        <w:rPr>
+          <w:szCs w:val="24"/>
+        </w:rPr>
+        <w:t>prototipada</w:t>
+      </w:r>
+      <w:proofErr w:type="spellEnd"/>
+      <w:r>
+        <w:rPr>
+          <w:szCs w:val="24"/>
+        </w:rPr>
+        <w:t xml:space="preserve"> com fidelidade à identidade visual, utilizando as cores, tipografia e componentes que foram implementados no front-end.</w:t>
       </w:r>
     </w:p>
     <w:p>
@@ -11636,74 +13756,78 @@
         <w:rPr>
           <w:szCs w:val="24"/>
         </w:rPr>
-        <w:t>O protótipo foi desenvolvido no Figma com dois fluxos distintos: o fluxo do Administrador, que engloba o cadastro da empresa, gestão de EPIs, acompanhamento de funcionários e visualização do dashboard; e o fluxo do Funcionário, que cobre a entrada na empresa, visualização dos seus EPIs e solicitação de reposição. A prototipação permitiu validar a usabilidade e antecipar decisões de design antes da implementação, servindo como referência direta para o desenvolvimento do front-end.</w:t>
-      </w:r>
-    </w:p>
-    <w:p>
-      <w:pPr>
-        <w:spacing w:line="360" w:lineRule="auto"/>
-        <w:jc w:val="both"/>
-        <w:rPr>
-          <w:b/>
-          <w:bCs/>
-          <w:szCs w:val="24"/>
-        </w:rPr>
-      </w:pPr>
-    </w:p>
-    <w:p>
-      <w:pPr>
-        <w:spacing w:line="360" w:lineRule="auto"/>
-        <w:jc w:val="both"/>
-        <w:rPr>
-          <w:b/>
-          <w:bCs/>
-          <w:szCs w:val="24"/>
-        </w:rPr>
-      </w:pPr>
-    </w:p>
-    <w:p>
-      <w:pPr>
-        <w:spacing w:line="360" w:lineRule="auto"/>
-        <w:jc w:val="both"/>
-        <w:rPr>
-          <w:b/>
-          <w:bCs/>
-          <w:szCs w:val="24"/>
-        </w:rPr>
-      </w:pPr>
-    </w:p>
-    <w:p>
-      <w:pPr>
-        <w:spacing w:line="360" w:lineRule="auto"/>
-        <w:jc w:val="both"/>
-        <w:rPr>
-          <w:b/>
-          <w:bCs/>
-          <w:szCs w:val="24"/>
-        </w:rPr>
-      </w:pPr>
-    </w:p>
-    <w:p>
-      <w:pPr>
-        <w:spacing w:line="360" w:lineRule="auto"/>
-        <w:jc w:val="both"/>
-        <w:rPr>
-          <w:b/>
-          <w:bCs/>
-          <w:szCs w:val="24"/>
-        </w:rPr>
-      </w:pPr>
-    </w:p>
-    <w:p>
-      <w:pPr>
-        <w:spacing w:line="360" w:lineRule="auto"/>
-        <w:jc w:val="both"/>
-        <w:rPr>
-          <w:b/>
-          <w:bCs/>
-          <w:szCs w:val="24"/>
-        </w:rPr>
-      </w:pPr>
+        <w:t xml:space="preserve">Além das telas para desktop, a equipe elaborou, no mesmo período e também no </w:t>
+      </w:r>
+      <w:proofErr w:type="spellStart"/>
+      <w:r>
+        <w:rPr>
+          <w:szCs w:val="24"/>
+        </w:rPr>
+        <w:t>Figma</w:t>
+      </w:r>
+      <w:proofErr w:type="spellEnd"/>
+      <w:r>
+        <w:rPr>
+          <w:szCs w:val="24"/>
+        </w:rPr>
+        <w:t>, as versões responsivas das interfaces, contemplando três formatos de tela: smartphone (mobile), tablet (iPad) e d</w:t>
+      </w:r>
+      <w:r>
+        <w:rPr>
+          <w:szCs w:val="24"/>
+        </w:rPr>
+        <w:t>e</w:t>
+      </w:r>
+      <w:r>
+        <w:rPr>
+          <w:szCs w:val="24"/>
+        </w:rPr>
+        <w:t>sktop de grande porte (Mac). Essa prototipação simultânea garantiu que a identidade visual e o fluxo de navegação se mantivessem consistentes em todos os dispositivos, orientando desde o início a implementação responsiva do front-</w:t>
+      </w:r>
+      <w:proofErr w:type="spellStart"/>
+      <w:r>
+        <w:rPr>
+          <w:szCs w:val="24"/>
+        </w:rPr>
+        <w:t>end</w:t>
+      </w:r>
+      <w:proofErr w:type="spellEnd"/>
+      <w:r>
+        <w:rPr>
+          <w:szCs w:val="24"/>
+        </w:rPr>
+        <w:t xml:space="preserve"> e a futura adaptação para Progressive Web App (PWA).</w:t>
+      </w:r>
+    </w:p>
+    <w:p>
+      <w:pPr>
+        <w:spacing w:line="360" w:lineRule="auto"/>
+        <w:ind w:firstLine="720"/>
+        <w:jc w:val="both"/>
+        <w:rPr>
+          <w:szCs w:val="24"/>
+        </w:rPr>
+      </w:pPr>
+      <w:r>
+        <w:rPr>
+          <w:szCs w:val="24"/>
+        </w:rPr>
+        <w:t xml:space="preserve">O protótipo foi desenvolvido no </w:t>
+      </w:r>
+      <w:proofErr w:type="spellStart"/>
+      <w:r>
+        <w:rPr>
+          <w:szCs w:val="24"/>
+        </w:rPr>
+        <w:t>Figma</w:t>
+      </w:r>
+      <w:proofErr w:type="spellEnd"/>
+      <w:r>
+        <w:rPr>
+          <w:szCs w:val="24"/>
+        </w:rPr>
+        <w:t xml:space="preserve"> com dois fluxos distintos: o fluxo do Administrador, que engloba o cadastro da empresa, gestão de EPIs, acompanhamento de funcionários e visualização do dashboard; e o fluxo do Funcionário, que cobre a entrada na empresa, visualização dos seus EPIs e solicitação de reposição. A prototipação permitiu validar a usabilidade e antecipar decisões de design antes da implementação, servindo como referência direta para o desenvolvimento do front-end.</w:t>
+      </w:r>
     </w:p>
     <w:p>
       <w:pPr>
@@ -11837,7 +13961,15 @@
           <w:bCs/>
           <w:szCs w:val="24"/>
         </w:rPr>
-        <w:t xml:space="preserve"> RESULTADOS ESPERADOS</w:t>
+        <w:t xml:space="preserve"> RESULTADOS </w:t>
+      </w:r>
+      <w:r>
+        <w:rPr>
+          <w:b/>
+          <w:bCs/>
+          <w:szCs w:val="24"/>
+        </w:rPr>
+        <w:t>OBTIDOS</w:t>
       </w:r>
     </w:p>
     <w:p>
@@ -11853,99 +13985,105 @@
           <w:szCs w:val="24"/>
         </w:rPr>
         <w:tab/>
-        <w:t>Ao final do desenvolvimento, espera-se que o SIGEPI esteja operacional como uma aplicação web responsiva, capaz de atender empresas de diferentes portes que necessitem de controle sobre seus Equipamentos de Proteção Individual.</w:t>
-      </w:r>
-    </w:p>
-    <w:p>
-      <w:pPr>
-        <w:spacing w:line="360" w:lineRule="auto"/>
-        <w:jc w:val="both"/>
-        <w:rPr>
-          <w:szCs w:val="24"/>
-        </w:rPr>
-      </w:pPr>
-      <w:r>
-        <w:rPr>
-          <w:szCs w:val="24"/>
-        </w:rPr>
-        <w:tab/>
-      </w:r>
-      <w:r>
-        <w:rPr>
-          <w:szCs w:val="24"/>
-        </w:rPr>
-        <w:t>Do ponto de vista funcional, o sistema deverá ser capaz de realizar o cadastro completo de funcionários e EPIs, registrar entregas e devoluções, monitorar o estoque em tempo real e emitir alertas automáticos quando equipamentos estiverem com validade próxima do vencimento ou com quantidade abaixo do mínimo estabelecido. Além disso, o painel de dashboard deverá apresentar de forma visual os principais indicadores de gestão, como os EPIs mais utilizados e o histórico de movimentações.</w:t>
-      </w:r>
-    </w:p>
-    <w:p>
-      <w:pPr>
-        <w:spacing w:line="360" w:lineRule="auto"/>
-        <w:jc w:val="both"/>
-        <w:rPr>
-          <w:szCs w:val="24"/>
-        </w:rPr>
-      </w:pPr>
-      <w:r>
-        <w:rPr>
-          <w:szCs w:val="24"/>
-        </w:rPr>
-        <w:tab/>
-        <w:t>Do ponto de vista da segurança, espera-se que o sistema implemente corretamente os mecanismos de autenticação, criptografia de senhas e proteção contra acessos não autorizados, garantindo a integridade e a confidencialidade dos dados das empresas cadastradas.</w:t>
-      </w:r>
-    </w:p>
-    <w:p>
-      <w:pPr>
-        <w:spacing w:line="360" w:lineRule="auto"/>
-        <w:jc w:val="both"/>
-        <w:rPr>
-          <w:szCs w:val="24"/>
-        </w:rPr>
-      </w:pPr>
-      <w:r>
-        <w:rPr>
-          <w:szCs w:val="24"/>
-        </w:rPr>
-        <w:tab/>
-        <w:t>Em termos de impacto para as organizações usuárias, espera-se que o SIGEPI reduza o tempo gasto no controle de EPIs, diminua a ocorrência de erros nos registros e aumente a rastreabilidade dos equipamentos. Esses benefícios contribuem diretamente para o cumprimento das obrigações legais das empresas em relação ao NR-6 e para a melhoria das condições de segurança dos trabalhadores.</w:t>
-      </w:r>
-    </w:p>
-    <w:p>
-      <w:pPr>
-        <w:spacing w:line="360" w:lineRule="auto"/>
-        <w:jc w:val="both"/>
-        <w:rPr>
-          <w:szCs w:val="24"/>
-        </w:rPr>
-      </w:pPr>
-      <w:r>
-        <w:rPr>
-          <w:szCs w:val="24"/>
-        </w:rPr>
-        <w:tab/>
-        <w:t>Por fim, espera-se que a versão PWA do sistema amplie o alcance da aplicação, permitindo que supervisores e responsáveis por segurança utilizem o SIGEPI diretamente de seus dispositivos móveis em campo, sem depender de um computador.</w:t>
-      </w:r>
-    </w:p>
-    <w:p>
-      <w:pPr>
-        <w:spacing w:line="360" w:lineRule="auto"/>
-        <w:jc w:val="both"/>
-        <w:rPr>
-          <w:b/>
-          <w:bCs/>
-          <w:szCs w:val="24"/>
-        </w:rPr>
-      </w:pPr>
-    </w:p>
-    <w:p>
-      <w:pPr>
-        <w:spacing w:line="360" w:lineRule="auto"/>
-        <w:jc w:val="both"/>
-        <w:rPr>
-          <w:b/>
-          <w:bCs/>
-          <w:szCs w:val="24"/>
-        </w:rPr>
-      </w:pPr>
+      </w:r>
+      <w:r>
+        <w:rPr>
+          <w:szCs w:val="24"/>
+        </w:rPr>
+        <w:t>Ao final do desenvolvimento, o SIGEPI tornou-se operacional como uma aplicação web responsiva, capaz de atender empresas de diferentes portes que necessitem de controle sobre seus Equipamentos de Proteção Individual.</w:t>
+      </w:r>
+    </w:p>
+    <w:p>
+      <w:pPr>
+        <w:spacing w:line="360" w:lineRule="auto"/>
+        <w:ind w:firstLine="720"/>
+        <w:jc w:val="both"/>
+        <w:rPr>
+          <w:szCs w:val="24"/>
+        </w:rPr>
+      </w:pPr>
+      <w:r>
+        <w:rPr>
+          <w:szCs w:val="24"/>
+        </w:rPr>
+        <w:t xml:space="preserve">Do ponto de vista funcional, o sistema realiza o </w:t>
+      </w:r>
+      <w:proofErr w:type="spellStart"/>
+      <w:r>
+        <w:rPr>
+          <w:szCs w:val="24"/>
+        </w:rPr>
+        <w:t>auto-cadastro</w:t>
+      </w:r>
+      <w:proofErr w:type="spellEnd"/>
+      <w:r>
+        <w:rPr>
+          <w:szCs w:val="24"/>
+        </w:rPr>
+        <w:t xml:space="preserve"> de funcionários e o cadastro de EPIs, registra entregas e devoluções, monitora o estoque em tempo real e emite alertas automáticos quando os equipamentos estão com validade próxima do vencimento ou com quantidade abaixo do mínimo estabelecido. Além disso, o painel de dashboard apresenta de forma visual os principais indicadores de gestão, como os EPIs mais utilizados e o histórico de movimentações.</w:t>
+      </w:r>
+    </w:p>
+    <w:p>
+      <w:pPr>
+        <w:spacing w:line="360" w:lineRule="auto"/>
+        <w:ind w:firstLine="720"/>
+        <w:jc w:val="both"/>
+        <w:rPr>
+          <w:szCs w:val="24"/>
+        </w:rPr>
+      </w:pPr>
+      <w:r>
+        <w:rPr>
+          <w:szCs w:val="24"/>
+        </w:rPr>
+        <w:t xml:space="preserve">Do ponto de vista da segurança, o sistema implementa mecanismos de autenticação (JWT e criptografia de senhas com </w:t>
+      </w:r>
+      <w:proofErr w:type="spellStart"/>
+      <w:r>
+        <w:rPr>
+          <w:szCs w:val="24"/>
+        </w:rPr>
+        <w:t>bcrypt</w:t>
+      </w:r>
+      <w:proofErr w:type="spellEnd"/>
+      <w:r>
+        <w:rPr>
+          <w:szCs w:val="24"/>
+        </w:rPr>
+        <w:t>), verificação de robôs por meio de CAPTCHA, controle de acesso por perfil e proteção contra acessos não autorizados, garantindo a integridade e a confidencialidade dos dados das empresas cadastradas. A rastreabilidade é assegurada por um log de auditoria que registra todas as ações realizadas no sistema.</w:t>
+      </w:r>
+    </w:p>
+    <w:p>
+      <w:pPr>
+        <w:spacing w:line="360" w:lineRule="auto"/>
+        <w:ind w:firstLine="720"/>
+        <w:jc w:val="both"/>
+        <w:rPr>
+          <w:szCs w:val="24"/>
+        </w:rPr>
+      </w:pPr>
+      <w:r>
+        <w:rPr>
+          <w:szCs w:val="24"/>
+        </w:rPr>
+        <w:t>Em termos de impacto para as organizações usuárias, o SIGEPI reduz o tempo gasto no controle de EPIs, diminui a ocorrência de erros nos registros e aumenta a rastreabilidade dos equipamentos. Esses benefícios contribuem diretamente para o cumprimento das obrigações legais das empresas em relação à NR-6 e para a melhoria das condições de segurança dos trabalhadores.</w:t>
+      </w:r>
+    </w:p>
+    <w:p>
+      <w:pPr>
+        <w:spacing w:line="360" w:lineRule="auto"/>
+        <w:ind w:firstLine="720"/>
+        <w:jc w:val="both"/>
+        <w:rPr>
+          <w:szCs w:val="24"/>
+        </w:rPr>
+      </w:pPr>
+      <w:r>
+        <w:rPr>
+          <w:szCs w:val="24"/>
+        </w:rPr>
+        <w:t>Por fim, com a futura disponibilização da versão PWA, espera-se ampliar o alcance da aplicação, permitindo que supervisores e responsáveis por segurança utilizem o SIGEPI diretamente de seus dispositivos móveis em campo, sem depender de um computador.</w:t>
+      </w:r>
     </w:p>
     <w:p>
       <w:pPr>
@@ -12102,132 +14240,169 @@
         <w:rPr>
           <w:szCs w:val="24"/>
         </w:rPr>
-        <w:t>Com a documentação</w:t>
-      </w:r>
-      <w:r>
-        <w:rPr>
-          <w:b/>
-          <w:bCs/>
-          <w:szCs w:val="24"/>
-        </w:rPr>
-        <w:t xml:space="preserve"> </w:t>
-      </w:r>
-      <w:r>
-        <w:rPr>
-          <w:szCs w:val="24"/>
-        </w:rPr>
-        <w:t>inicial</w:t>
-      </w:r>
-      <w:r>
-        <w:rPr>
-          <w:szCs w:val="24"/>
-        </w:rPr>
-        <w:t xml:space="preserve"> concluída e o protótipo de telas desenvolvido no Figma, a equipe está preparada para iniciar a fase de desenvolvimento do sistema em abril de 2026.</w:t>
-      </w:r>
-    </w:p>
-    <w:p>
-      <w:pPr>
-        <w:spacing w:line="360" w:lineRule="auto"/>
-        <w:jc w:val="both"/>
-        <w:rPr>
-          <w:szCs w:val="24"/>
-        </w:rPr>
-      </w:pPr>
-      <w:r>
-        <w:rPr>
-          <w:szCs w:val="24"/>
-        </w:rPr>
-        <w:tab/>
-        <w:t>O primeiro passo será a configuração do ambiente de desenvolvimento: criação do repositório no GitHub para controle de versão, configuração do servidor Node.js com Express.js e criação do banco de dados MySQL com as tabelas definidas na modelagem. Essa etapa é essencial para garantir que todos os integrantes da equipe trabalhem sobre a mesma base.</w:t>
-      </w:r>
-    </w:p>
-    <w:p>
-      <w:pPr>
-        <w:spacing w:line="360" w:lineRule="auto"/>
-        <w:jc w:val="both"/>
-        <w:rPr>
-          <w:szCs w:val="24"/>
-        </w:rPr>
-      </w:pPr>
-      <w:r>
-        <w:rPr>
-          <w:szCs w:val="24"/>
-        </w:rPr>
-        <w:tab/>
-        <w:t>Em seguida, serão implementadas as funcionalidades do módulo de autenticação, incluindo login, validação de CAPTCHA e controle de perfis de acesso. Esse módulo é a porta de entrada dos sistemas e precisa estar funcional antes do desenvolvimento das demais telas.</w:t>
-      </w:r>
-    </w:p>
-    <w:p>
-      <w:pPr>
-        <w:spacing w:line="360" w:lineRule="auto"/>
-        <w:jc w:val="both"/>
-        <w:rPr>
-          <w:szCs w:val="24"/>
-        </w:rPr>
-      </w:pPr>
-      <w:r>
-        <w:rPr>
-          <w:szCs w:val="24"/>
-        </w:rPr>
-        <w:tab/>
-        <w:t>Após a autenticação, o desenvolvimento seguirá a ordem de prioridade definida nos requisitos: cadastro de funcionários e EPIs, controle de estoque, registro de entregas e devoluções, e por fim o dashboard e geração de relatórios. Cada funcionalidade será testada individualmente antes de avançar para a próxima.</w:t>
-      </w:r>
-    </w:p>
-    <w:p>
-      <w:pPr>
-        <w:spacing w:line="360" w:lineRule="auto"/>
-        <w:jc w:val="both"/>
-        <w:rPr>
-          <w:szCs w:val="24"/>
-        </w:rPr>
-      </w:pPr>
-      <w:r>
-        <w:rPr>
-          <w:szCs w:val="24"/>
-        </w:rPr>
-        <w:tab/>
-        <w:t>Paralelamente no desenvolvimento, a documentação no TCC será atualizada continuamente, incorporando os resultados obtidos em cada etapa. O diagrama entidade-relacionamento do banco de dados e o diagrama de casos de uso também serão finalizados e incluídos na documentação durante essa fase.</w:t>
-      </w:r>
-    </w:p>
-    <w:p>
-      <w:pPr>
-        <w:spacing w:line="360" w:lineRule="auto"/>
-        <w:jc w:val="both"/>
-        <w:rPr>
-          <w:szCs w:val="24"/>
-        </w:rPr>
-      </w:pPr>
-      <w:r>
-        <w:rPr>
-          <w:szCs w:val="24"/>
-        </w:rPr>
-        <w:tab/>
-        <w:t xml:space="preserve">Após a conclusão da versão web, prevista para </w:t>
-      </w:r>
-      <w:r>
-        <w:rPr>
-          <w:szCs w:val="24"/>
-        </w:rPr>
-        <w:t>julho</w:t>
-      </w:r>
-      <w:r>
-        <w:rPr>
-          <w:szCs w:val="24"/>
-        </w:rPr>
-        <w:t xml:space="preserve"> de 2026, será iniciada a adaptação para PWA e os testes finais de usabilidade e segurança. A apresentação final do projeto </w:t>
-      </w:r>
-      <w:r>
-        <w:rPr>
-          <w:szCs w:val="24"/>
-        </w:rPr>
-        <w:t>está agendada entre o meio de novembro e o início</w:t>
-      </w:r>
-      <w:r>
-        <w:rPr>
-          <w:szCs w:val="24"/>
-        </w:rPr>
-        <w:t xml:space="preserve"> de dezembro de 2026.</w:t>
-      </w:r>
+        <w:t xml:space="preserve">Com o sistema web finalizado — </w:t>
+      </w:r>
+      <w:proofErr w:type="spellStart"/>
+      <w:r>
+        <w:rPr>
+          <w:szCs w:val="24"/>
+        </w:rPr>
+        <w:t>back-end</w:t>
+      </w:r>
+      <w:proofErr w:type="spellEnd"/>
+      <w:r>
+        <w:rPr>
+          <w:szCs w:val="24"/>
+        </w:rPr>
+        <w:t xml:space="preserve"> e front-</w:t>
+      </w:r>
+      <w:proofErr w:type="spellStart"/>
+      <w:r>
+        <w:rPr>
+          <w:szCs w:val="24"/>
+        </w:rPr>
+        <w:t>end</w:t>
+      </w:r>
+      <w:proofErr w:type="spellEnd"/>
+      <w:r>
+        <w:rPr>
+          <w:szCs w:val="24"/>
+        </w:rPr>
+        <w:t xml:space="preserve"> integrados e a camada de responsividade concluída para diferentes tamanhos de tela —, a equipe concentra-se agora nas etapas finais do projeto.</w:t>
+      </w:r>
+    </w:p>
+    <w:p>
+      <w:pPr>
+        <w:spacing w:line="360" w:lineRule="auto"/>
+        <w:ind w:firstLine="720"/>
+        <w:jc w:val="both"/>
+        <w:rPr>
+          <w:szCs w:val="24"/>
+        </w:rPr>
+      </w:pPr>
+      <w:r>
+        <w:rPr>
+          <w:szCs w:val="24"/>
+        </w:rPr>
+        <w:t xml:space="preserve">O próximo passo é a transformação do sistema em um Progressive Web App (PWA), por meio da configuração do Service </w:t>
+      </w:r>
+      <w:proofErr w:type="spellStart"/>
+      <w:r>
+        <w:rPr>
+          <w:szCs w:val="24"/>
+        </w:rPr>
+        <w:t>Worker</w:t>
+      </w:r>
+      <w:proofErr w:type="spellEnd"/>
+      <w:r>
+        <w:rPr>
+          <w:szCs w:val="24"/>
+        </w:rPr>
+        <w:t xml:space="preserve">, do Web App </w:t>
+      </w:r>
+      <w:proofErr w:type="spellStart"/>
+      <w:r>
+        <w:rPr>
+          <w:szCs w:val="24"/>
+        </w:rPr>
+        <w:t>Manifest</w:t>
+      </w:r>
+      <w:proofErr w:type="spellEnd"/>
+      <w:r>
+        <w:rPr>
+          <w:szCs w:val="24"/>
+        </w:rPr>
+        <w:t xml:space="preserve"> e dos ícones de instalação, permitindo que o SIGEPI seja instalado em dispositivos móveis como um aplicativo, sem depender de lojas como Google Play ou App Store.</w:t>
+      </w:r>
+    </w:p>
+    <w:p>
+      <w:pPr>
+        <w:spacing w:line="360" w:lineRule="auto"/>
+        <w:ind w:firstLine="720"/>
+        <w:jc w:val="both"/>
+        <w:rPr>
+          <w:szCs w:val="24"/>
+        </w:rPr>
+      </w:pPr>
+      <w:r>
+        <w:rPr>
+          <w:szCs w:val="24"/>
+        </w:rPr>
+        <w:t>Em paralelo, será realizada a elaboração e a execução dos casos de teste, com base nos requisitos funcionais e não funcionais definidos na documentação. Essa etapa, conduzida sob a disciplina de Qualidade e Teste de Software, tem como objetivo validar o comportamento do sistema, identificar eventuais falhas e assegurar que cada funcionalidade atenda ao que foi especificado.</w:t>
+      </w:r>
+    </w:p>
+    <w:p>
+      <w:pPr>
+        <w:spacing w:line="360" w:lineRule="auto"/>
+        <w:ind w:firstLine="720"/>
+        <w:jc w:val="both"/>
+        <w:rPr>
+          <w:szCs w:val="24"/>
+        </w:rPr>
+      </w:pPr>
+      <w:r>
+        <w:rPr>
+          <w:szCs w:val="24"/>
+        </w:rPr>
+        <w:t xml:space="preserve">Concluídos os testes, o sistema será hospedado em ambiente de produção, com a publicação do </w:t>
+      </w:r>
+      <w:proofErr w:type="spellStart"/>
+      <w:r>
+        <w:rPr>
+          <w:szCs w:val="24"/>
+        </w:rPr>
+        <w:t>back-end</w:t>
+      </w:r>
+      <w:proofErr w:type="spellEnd"/>
+      <w:r>
+        <w:rPr>
+          <w:szCs w:val="24"/>
+        </w:rPr>
+        <w:t xml:space="preserve"> e do banco de dados MySQL em plataformas de hospedagem gratuitas, como Railway ou Render, seguida do registro e da configuração de um domínio próprio, tornando a aplicação acessível publicamente pela internet.</w:t>
+      </w:r>
+    </w:p>
+    <w:p>
+      <w:pPr>
+        <w:spacing w:line="360" w:lineRule="auto"/>
+        <w:ind w:firstLine="720"/>
+        <w:jc w:val="both"/>
+        <w:rPr>
+          <w:szCs w:val="24"/>
+        </w:rPr>
+      </w:pPr>
+      <w:r>
+        <w:rPr>
+          <w:szCs w:val="24"/>
+        </w:rPr>
+        <w:t>Por fim, a partir do retorno obtido nos testes e na hospedagem, serão realizados os retoques e ajustes finais de usabilidade e segurança, além da preparação dos slides e do material para a apresentação final do Trabalho de Conclusão de Curso, prevista para o início de dezembro de 2026.</w:t>
+      </w:r>
+    </w:p>
+    <w:p>
+      <w:pPr>
+        <w:spacing w:line="360" w:lineRule="auto"/>
+        <w:jc w:val="both"/>
+        <w:rPr>
+          <w:szCs w:val="24"/>
+        </w:rPr>
+      </w:pPr>
+    </w:p>
+    <w:p>
+      <w:pPr>
+        <w:spacing w:line="360" w:lineRule="auto"/>
+        <w:jc w:val="both"/>
+        <w:rPr>
+          <w:szCs w:val="24"/>
+        </w:rPr>
+      </w:pPr>
+    </w:p>
+    <w:p>
+      <w:pPr>
+        <w:spacing w:line="360" w:lineRule="auto"/>
+        <w:jc w:val="both"/>
+        <w:rPr>
+          <w:szCs w:val="24"/>
+        </w:rPr>
+      </w:pPr>
     </w:p>
     <w:p>
       <w:pPr>
@@ -13666,7 +15841,6 @@
   <w:style w:type="character" w:default="1" w:styleId="Fontepargpadro">
     <w:name w:val="Default Paragraph Font"/>
     <w:uiPriority w:val="1"/>
-    <w:semiHidden/>
     <w:unhideWhenUsed/>
   </w:style>
   <w:style w:type="table" w:default="1" w:styleId="Tabelanormal">

</xml_diff>

<commit_message>
Atualizando Viabilidade Financeira e Tecnologias Adotadas na Documentação
</commit_message>
<xml_diff>
--- a/Documentação/Terceira Edição/TCC - Documentação.docx
+++ b/Documentação/Terceira Edição/TCC - Documentação.docx
@@ -1662,6 +1662,90 @@
           <w:bCs/>
           <w:szCs w:val="24"/>
         </w:rPr>
+        <w:t>8</w:t>
+      </w:r>
+    </w:p>
+    <w:p>
+      <w:pPr>
+        <w:spacing w:line="360" w:lineRule="auto"/>
+        <w:rPr>
+          <w:b/>
+          <w:bCs/>
+          <w:szCs w:val="24"/>
+        </w:rPr>
+      </w:pPr>
+      <w:r>
+        <w:rPr>
+          <w:b/>
+          <w:bCs/>
+          <w:szCs w:val="24"/>
+        </w:rPr>
+        <w:t>8 DIAGRAMA DE CASOS DE USO</w:t>
+      </w:r>
+      <w:r>
+        <w:rPr>
+          <w:b/>
+          <w:bCs/>
+          <w:szCs w:val="24"/>
+        </w:rPr>
+        <w:ptab w:relativeTo="margin" w:alignment="right" w:leader="dot"/>
+      </w:r>
+      <w:r>
+        <w:rPr>
+          <w:b/>
+          <w:bCs/>
+          <w:szCs w:val="24"/>
+        </w:rPr>
+        <w:t>1</w:t>
+      </w:r>
+      <w:r>
+        <w:rPr>
+          <w:b/>
+          <w:bCs/>
+          <w:szCs w:val="24"/>
+        </w:rPr>
+        <w:t>6</w:t>
+      </w:r>
+    </w:p>
+    <w:p>
+      <w:pPr>
+        <w:spacing w:line="360" w:lineRule="auto"/>
+        <w:rPr>
+          <w:b/>
+          <w:bCs/>
+          <w:szCs w:val="24"/>
+        </w:rPr>
+      </w:pPr>
+      <w:r>
+        <w:rPr>
+          <w:b/>
+          <w:bCs/>
+          <w:szCs w:val="24"/>
+        </w:rPr>
+        <w:t>9 TECNOLOGIAS ADOTADAS</w:t>
+      </w:r>
+      <w:r>
+        <w:rPr>
+          <w:b/>
+          <w:bCs/>
+          <w:szCs w:val="24"/>
+        </w:rPr>
+        <w:ptab w:relativeTo="margin" w:alignment="right" w:leader="dot"/>
+      </w:r>
+      <w:r>
+        <w:rPr>
+          <w:b/>
+          <w:bCs/>
+          <w:szCs w:val="24"/>
+        </w:rPr>
+        <w:t>1</w:t>
+      </w:r>
+      <w:r>
+        <w:rPr>
+          <w:b/>
+          <w:bCs/>
+          <w:szCs w:val="24"/>
+        </w:rPr>
         <w:t>7</w:t>
       </w:r>
     </w:p>
@@ -1680,7 +1764,23 @@
           <w:bCs/>
           <w:szCs w:val="24"/>
         </w:rPr>
-        <w:t>8 DIAGRAMA DE CASOS DE USO</w:t>
+        <w:t>10</w:t>
+      </w:r>
+      <w:r>
+        <w:rPr>
+          <w:b/>
+          <w:bCs/>
+          <w:szCs w:val="24"/>
+        </w:rPr>
+        <w:t xml:space="preserve"> </w:t>
+      </w:r>
+      <w:r>
+        <w:rPr>
+          <w:b/>
+          <w:bCs/>
+          <w:szCs w:val="24"/>
+        </w:rPr>
+        <w:t>MODELO DO BANCO DE DADOS</w:t>
       </w:r>
       <w:r>
         <w:rPr>
@@ -1704,6 +1804,230 @@
           <w:bCs/>
           <w:szCs w:val="24"/>
         </w:rPr>
+        <w:t>9</w:t>
+      </w:r>
+    </w:p>
+    <w:p>
+      <w:pPr>
+        <w:spacing w:line="360" w:lineRule="auto"/>
+        <w:rPr>
+          <w:b/>
+          <w:bCs/>
+          <w:szCs w:val="24"/>
+        </w:rPr>
+      </w:pPr>
+      <w:r>
+        <w:rPr>
+          <w:b/>
+          <w:bCs/>
+          <w:szCs w:val="24"/>
+        </w:rPr>
+        <w:t xml:space="preserve">11 </w:t>
+      </w:r>
+      <w:r>
+        <w:rPr>
+          <w:b/>
+          <w:bCs/>
+          <w:szCs w:val="24"/>
+        </w:rPr>
+        <w:t>CRONOGRAMA</w:t>
+      </w:r>
+      <w:r>
+        <w:rPr>
+          <w:b/>
+          <w:bCs/>
+          <w:szCs w:val="24"/>
+        </w:rPr>
+        <w:ptab w:relativeTo="margin" w:alignment="right" w:leader="dot"/>
+      </w:r>
+      <w:r>
+        <w:rPr>
+          <w:b/>
+          <w:bCs/>
+          <w:szCs w:val="24"/>
+        </w:rPr>
+        <w:t>2</w:t>
+      </w:r>
+      <w:r>
+        <w:rPr>
+          <w:b/>
+          <w:bCs/>
+          <w:szCs w:val="24"/>
+        </w:rPr>
+        <w:t>2</w:t>
+      </w:r>
+    </w:p>
+    <w:p>
+      <w:pPr>
+        <w:spacing w:line="360" w:lineRule="auto"/>
+        <w:rPr>
+          <w:b/>
+          <w:bCs/>
+          <w:szCs w:val="24"/>
+        </w:rPr>
+      </w:pPr>
+      <w:r>
+        <w:rPr>
+          <w:b/>
+          <w:bCs/>
+          <w:szCs w:val="24"/>
+        </w:rPr>
+        <w:t>12</w:t>
+      </w:r>
+      <w:r>
+        <w:rPr>
+          <w:b/>
+          <w:bCs/>
+          <w:szCs w:val="24"/>
+        </w:rPr>
+        <w:t xml:space="preserve"> </w:t>
+      </w:r>
+      <w:r>
+        <w:rPr>
+          <w:b/>
+          <w:bCs/>
+          <w:szCs w:val="24"/>
+        </w:rPr>
+        <w:t>IDENTIDADE VISUAL</w:t>
+      </w:r>
+      <w:r>
+        <w:rPr>
+          <w:b/>
+          <w:bCs/>
+          <w:szCs w:val="24"/>
+        </w:rPr>
+        <w:ptab w:relativeTo="margin" w:alignment="right" w:leader="dot"/>
+      </w:r>
+      <w:r>
+        <w:rPr>
+          <w:b/>
+          <w:bCs/>
+          <w:szCs w:val="24"/>
+        </w:rPr>
+        <w:t>2</w:t>
+      </w:r>
+      <w:r>
+        <w:rPr>
+          <w:b/>
+          <w:bCs/>
+          <w:szCs w:val="24"/>
+        </w:rPr>
+        <w:t>3</w:t>
+      </w:r>
+    </w:p>
+    <w:p>
+      <w:pPr>
+        <w:spacing w:line="360" w:lineRule="auto"/>
+        <w:rPr>
+          <w:b/>
+          <w:bCs/>
+          <w:szCs w:val="24"/>
+        </w:rPr>
+      </w:pPr>
+      <w:r>
+        <w:rPr>
+          <w:b/>
+          <w:bCs/>
+          <w:szCs w:val="24"/>
+        </w:rPr>
+        <w:t>13 WIREFRAMES</w:t>
+      </w:r>
+      <w:r>
+        <w:rPr>
+          <w:b/>
+          <w:bCs/>
+          <w:szCs w:val="24"/>
+        </w:rPr>
+        <w:t xml:space="preserve"> E PROTOTIPAÇÃO</w:t>
+      </w:r>
+      <w:r>
+        <w:rPr>
+          <w:b/>
+          <w:bCs/>
+          <w:szCs w:val="24"/>
+        </w:rPr>
+        <w:ptab w:relativeTo="margin" w:alignment="right" w:leader="dot"/>
+      </w:r>
+      <w:r>
+        <w:rPr>
+          <w:b/>
+          <w:bCs/>
+          <w:szCs w:val="24"/>
+        </w:rPr>
+        <w:t>2</w:t>
+      </w:r>
+      <w:r>
+        <w:rPr>
+          <w:b/>
+          <w:bCs/>
+          <w:szCs w:val="24"/>
+        </w:rPr>
+        <w:t>4</w:t>
+      </w:r>
+    </w:p>
+    <w:p>
+      <w:pPr>
+        <w:spacing w:line="360" w:lineRule="auto"/>
+        <w:rPr>
+          <w:b/>
+          <w:bCs/>
+          <w:szCs w:val="24"/>
+        </w:rPr>
+      </w:pPr>
+      <w:r>
+        <w:rPr>
+          <w:b/>
+          <w:bCs/>
+          <w:szCs w:val="24"/>
+        </w:rPr>
+        <w:t>14</w:t>
+      </w:r>
+      <w:r>
+        <w:rPr>
+          <w:b/>
+          <w:bCs/>
+          <w:szCs w:val="24"/>
+        </w:rPr>
+        <w:t xml:space="preserve"> </w:t>
+      </w:r>
+      <w:r>
+        <w:rPr>
+          <w:b/>
+          <w:bCs/>
+          <w:szCs w:val="24"/>
+        </w:rPr>
+        <w:t xml:space="preserve">RESULTADOS </w:t>
+      </w:r>
+      <w:r>
+        <w:rPr>
+          <w:b/>
+          <w:bCs/>
+          <w:szCs w:val="24"/>
+        </w:rPr>
+        <w:t>OBTIDOS</w:t>
+      </w:r>
+      <w:r>
+        <w:rPr>
+          <w:b/>
+          <w:bCs/>
+          <w:szCs w:val="24"/>
+        </w:rPr>
+        <w:ptab w:relativeTo="margin" w:alignment="right" w:leader="dot"/>
+      </w:r>
+      <w:r>
+        <w:rPr>
+          <w:b/>
+          <w:bCs/>
+          <w:szCs w:val="24"/>
+        </w:rPr>
+        <w:t>2</w:t>
+      </w:r>
+      <w:r>
+        <w:rPr>
+          <w:b/>
+          <w:bCs/>
+          <w:szCs w:val="24"/>
+        </w:rPr>
         <w:t>5</w:t>
       </w:r>
     </w:p>
@@ -1722,7 +2046,7 @@
           <w:bCs/>
           <w:szCs w:val="24"/>
         </w:rPr>
-        <w:t>9 TECNOLOGIAS ADOTADAS</w:t>
+        <w:t>15 PRÓXIMOS PASSOS</w:t>
       </w:r>
       <w:r>
         <w:rPr>
@@ -1738,7 +2062,7 @@
           <w:bCs/>
           <w:szCs w:val="24"/>
         </w:rPr>
-        <w:t>1</w:t>
+        <w:t>2</w:t>
       </w:r>
       <w:r>
         <w:rPr>
@@ -1764,23 +2088,7 @@
           <w:bCs/>
           <w:szCs w:val="24"/>
         </w:rPr>
-        <w:t>10</w:t>
-      </w:r>
-      <w:r>
-        <w:rPr>
-          <w:b/>
-          <w:bCs/>
-          <w:szCs w:val="24"/>
-        </w:rPr>
-        <w:t xml:space="preserve"> </w:t>
-      </w:r>
-      <w:r>
-        <w:rPr>
-          <w:b/>
-          <w:bCs/>
-          <w:szCs w:val="24"/>
-        </w:rPr>
-        <w:t>MODELO DO BANCO DE DADOS</w:t>
+        <w:t>16 REFERÊNCIAS</w:t>
       </w:r>
       <w:r>
         <w:rPr>
@@ -1796,275 +2104,15 @@
           <w:bCs/>
           <w:szCs w:val="24"/>
         </w:rPr>
-        <w:t>1</w:t>
-      </w:r>
-      <w:r>
-        <w:rPr>
-          <w:b/>
-          <w:bCs/>
-          <w:szCs w:val="24"/>
-        </w:rPr>
-        <w:t>8</w:t>
-      </w:r>
-    </w:p>
-    <w:p>
-      <w:pPr>
-        <w:spacing w:line="360" w:lineRule="auto"/>
-        <w:rPr>
-          <w:b/>
-          <w:bCs/>
-          <w:szCs w:val="24"/>
-        </w:rPr>
-      </w:pPr>
-      <w:r>
-        <w:rPr>
-          <w:b/>
-          <w:bCs/>
-          <w:szCs w:val="24"/>
-        </w:rPr>
-        <w:t xml:space="preserve">11 </w:t>
-      </w:r>
-      <w:r>
-        <w:rPr>
-          <w:b/>
-          <w:bCs/>
-          <w:szCs w:val="24"/>
-        </w:rPr>
-        <w:t>CRONOGRAMA</w:t>
-      </w:r>
-      <w:r>
-        <w:rPr>
-          <w:b/>
-          <w:bCs/>
-          <w:szCs w:val="24"/>
-        </w:rPr>
-        <w:ptab w:relativeTo="margin" w:alignment="right" w:leader="dot"/>
-      </w:r>
-      <w:r>
-        <w:rPr>
-          <w:b/>
-          <w:bCs/>
-          <w:szCs w:val="24"/>
-        </w:rPr>
-        <w:t>21</w:t>
-      </w:r>
-    </w:p>
-    <w:p>
-      <w:pPr>
-        <w:spacing w:line="360" w:lineRule="auto"/>
-        <w:rPr>
-          <w:b/>
-          <w:bCs/>
-          <w:szCs w:val="24"/>
-        </w:rPr>
-      </w:pPr>
-      <w:r>
-        <w:rPr>
-          <w:b/>
-          <w:bCs/>
-          <w:szCs w:val="24"/>
-        </w:rPr>
-        <w:t>12</w:t>
-      </w:r>
-      <w:r>
-        <w:rPr>
-          <w:b/>
-          <w:bCs/>
-          <w:szCs w:val="24"/>
-        </w:rPr>
-        <w:t xml:space="preserve"> </w:t>
-      </w:r>
-      <w:r>
-        <w:rPr>
-          <w:b/>
-          <w:bCs/>
-          <w:szCs w:val="24"/>
-        </w:rPr>
-        <w:t>IDENTIDADE VISUAL</w:t>
-      </w:r>
-      <w:r>
-        <w:rPr>
-          <w:b/>
-          <w:bCs/>
-          <w:szCs w:val="24"/>
-        </w:rPr>
-        <w:ptab w:relativeTo="margin" w:alignment="right" w:leader="dot"/>
-      </w:r>
-      <w:r>
-        <w:rPr>
-          <w:b/>
-          <w:bCs/>
-          <w:szCs w:val="24"/>
-        </w:rPr>
-        <w:t>22</w:t>
-      </w:r>
-    </w:p>
-    <w:p>
-      <w:pPr>
-        <w:spacing w:line="360" w:lineRule="auto"/>
-        <w:rPr>
-          <w:b/>
-          <w:bCs/>
-          <w:szCs w:val="24"/>
-        </w:rPr>
-      </w:pPr>
-      <w:r>
-        <w:rPr>
-          <w:b/>
-          <w:bCs/>
-          <w:szCs w:val="24"/>
-        </w:rPr>
-        <w:t>13 WIREFRAMES</w:t>
-      </w:r>
-      <w:r>
-        <w:rPr>
-          <w:b/>
-          <w:bCs/>
-          <w:szCs w:val="24"/>
-        </w:rPr>
-        <w:t xml:space="preserve"> E PROTOTIPAÇÃO</w:t>
-      </w:r>
-      <w:r>
-        <w:rPr>
-          <w:b/>
-          <w:bCs/>
-          <w:szCs w:val="24"/>
-        </w:rPr>
-        <w:ptab w:relativeTo="margin" w:alignment="right" w:leader="dot"/>
-      </w:r>
-      <w:r>
-        <w:rPr>
-          <w:b/>
-          <w:bCs/>
-          <w:szCs w:val="24"/>
-        </w:rPr>
-        <w:t>23</w:t>
-      </w:r>
-    </w:p>
-    <w:p>
-      <w:pPr>
-        <w:spacing w:line="360" w:lineRule="auto"/>
-        <w:rPr>
-          <w:b/>
-          <w:bCs/>
-          <w:szCs w:val="24"/>
-        </w:rPr>
-      </w:pPr>
-      <w:r>
-        <w:rPr>
-          <w:b/>
-          <w:bCs/>
-          <w:szCs w:val="24"/>
-        </w:rPr>
-        <w:t>14</w:t>
-      </w:r>
-      <w:r>
-        <w:rPr>
-          <w:b/>
-          <w:bCs/>
-          <w:szCs w:val="24"/>
-        </w:rPr>
-        <w:t xml:space="preserve"> </w:t>
-      </w:r>
-      <w:r>
-        <w:rPr>
-          <w:b/>
-          <w:bCs/>
-          <w:szCs w:val="24"/>
-        </w:rPr>
-        <w:t xml:space="preserve">RESULTADOS </w:t>
-      </w:r>
-      <w:r>
-        <w:rPr>
-          <w:b/>
-          <w:bCs/>
-          <w:szCs w:val="24"/>
-        </w:rPr>
-        <w:t>OBTIDOS</w:t>
-      </w:r>
-      <w:r>
-        <w:rPr>
-          <w:b/>
-          <w:bCs/>
-          <w:szCs w:val="24"/>
-        </w:rPr>
-        <w:ptab w:relativeTo="margin" w:alignment="right" w:leader="dot"/>
-      </w:r>
-      <w:r>
-        <w:rPr>
-          <w:b/>
-          <w:bCs/>
-          <w:szCs w:val="24"/>
-        </w:rPr>
-        <w:t>24</w:t>
-      </w:r>
-    </w:p>
-    <w:p>
-      <w:pPr>
-        <w:spacing w:line="360" w:lineRule="auto"/>
-        <w:rPr>
-          <w:b/>
-          <w:bCs/>
-          <w:szCs w:val="24"/>
-        </w:rPr>
-      </w:pPr>
-      <w:r>
-        <w:rPr>
-          <w:b/>
-          <w:bCs/>
-          <w:szCs w:val="24"/>
-        </w:rPr>
-        <w:t>15 PRÓXIMOS PASSOS</w:t>
-      </w:r>
-      <w:r>
-        <w:rPr>
-          <w:b/>
-          <w:bCs/>
-          <w:szCs w:val="24"/>
-        </w:rPr>
-        <w:ptab w:relativeTo="margin" w:alignment="right" w:leader="dot"/>
-      </w:r>
-      <w:r>
-        <w:rPr>
-          <w:b/>
-          <w:bCs/>
-          <w:szCs w:val="24"/>
-        </w:rPr>
-        <w:t>25</w:t>
-      </w:r>
-    </w:p>
-    <w:p>
-      <w:pPr>
-        <w:spacing w:line="360" w:lineRule="auto"/>
-        <w:rPr>
-          <w:b/>
-          <w:bCs/>
-          <w:szCs w:val="24"/>
-        </w:rPr>
-      </w:pPr>
-      <w:r>
-        <w:rPr>
-          <w:b/>
-          <w:bCs/>
-          <w:szCs w:val="24"/>
-        </w:rPr>
-        <w:t>16 REFERÊNCIAS</w:t>
-      </w:r>
-      <w:r>
-        <w:rPr>
-          <w:b/>
-          <w:bCs/>
-          <w:szCs w:val="24"/>
-        </w:rPr>
-        <w:ptab w:relativeTo="margin" w:alignment="right" w:leader="dot"/>
-      </w:r>
-      <w:r>
-        <w:rPr>
-          <w:b/>
-          <w:bCs/>
-          <w:szCs w:val="24"/>
-        </w:rPr>
-        <w:t>26</w:t>
+        <w:t>2</w:t>
+      </w:r>
+      <w:r>
+        <w:rPr>
+          <w:b/>
+          <w:bCs/>
+          <w:szCs w:val="24"/>
+        </w:rPr>
+        <w:t>7</w:t>
       </w:r>
     </w:p>
     <w:p>
@@ -3845,7 +3893,7 @@
         <w:rPr>
           <w:szCs w:val="24"/>
         </w:rPr>
-        <w:t xml:space="preserve">O projeto apresenta alta viabilidade financeira. Todas as tecnologias e ferramentas previstas para o desenvolvimento são gratuitas ou de código aberto: Node.js, Express.js, MySQL, Visual Studio </w:t>
+        <w:t xml:space="preserve">O desenvolvimento do SIGEPI foi realizado integralmente com ferramentas gratuitas: o Visual Studio </w:t>
       </w:r>
       <w:proofErr w:type="spellStart"/>
       <w:r>
@@ -3859,13 +3907,27 @@
         <w:rPr>
           <w:szCs w:val="24"/>
         </w:rPr>
-        <w:t xml:space="preserve">, </w:t>
+        <w:t xml:space="preserve"> como ambiente de desenvolvimento, o MySQL Community </w:t>
       </w:r>
       <w:proofErr w:type="spellStart"/>
       <w:r>
         <w:rPr>
           <w:szCs w:val="24"/>
         </w:rPr>
+        <w:t>Edition</w:t>
+      </w:r>
+      <w:proofErr w:type="spellEnd"/>
+      <w:r>
+        <w:rPr>
+          <w:szCs w:val="24"/>
+        </w:rPr>
+        <w:t xml:space="preserve"> como banco de dados, o </w:t>
+      </w:r>
+      <w:proofErr w:type="spellStart"/>
+      <w:r>
+        <w:rPr>
+          <w:szCs w:val="24"/>
+        </w:rPr>
         <w:t>Figma</w:t>
       </w:r>
       <w:proofErr w:type="spellEnd"/>
@@ -3873,7 +3935,7 @@
         <w:rPr>
           <w:szCs w:val="24"/>
         </w:rPr>
-        <w:t xml:space="preserve"> (plano gratuito) e </w:t>
+        <w:t xml:space="preserve"> na versão gratuita para a prototipação, o </w:t>
       </w:r>
       <w:proofErr w:type="spellStart"/>
       <w:r>
@@ -3887,7 +3949,7 @@
         <w:rPr>
           <w:szCs w:val="24"/>
         </w:rPr>
-        <w:t xml:space="preserve"> são exemplos disso.</w:t>
+        <w:t xml:space="preserve"> para os testes da API e o GitHub para o versionamento do código. Não houve, portanto, custo de licenças de software em nenhuma etapa da construção do sistema.</w:t>
       </w:r>
     </w:p>
     <w:p>
@@ -3903,25 +3965,42 @@
         <w:rPr>
           <w:szCs w:val="24"/>
         </w:rPr>
-        <w:t xml:space="preserve">Para hospedagem e testes gratuitos durante o desenvolvimento, serão </w:t>
-      </w:r>
-      <w:r>
-        <w:rPr>
-          <w:szCs w:val="24"/>
-        </w:rPr>
-        <w:t>utilizadas</w:t>
-      </w:r>
-      <w:r>
-        <w:rPr>
-          <w:szCs w:val="24"/>
-        </w:rPr>
-        <w:t xml:space="preserve"> </w:t>
-      </w:r>
-      <w:r>
-        <w:rPr>
-          <w:szCs w:val="24"/>
-        </w:rPr>
-        <w:t>opções de hospedagem gratuita disponíveis no mercado, como Railway e Render, que suportam aplicações Node.js com banco de dados MySQL.</w:t>
+        <w:t>O único custo identificado no projeto refere-se à hospedagem em ambiente de produção. O front-</w:t>
+      </w:r>
+      <w:proofErr w:type="spellStart"/>
+      <w:r>
+        <w:rPr>
+          <w:szCs w:val="24"/>
+        </w:rPr>
+        <w:t>end</w:t>
+      </w:r>
+      <w:proofErr w:type="spellEnd"/>
+      <w:r>
+        <w:rPr>
+          <w:szCs w:val="24"/>
+        </w:rPr>
+        <w:t xml:space="preserve">, por ser composto exclusivamente por arquivos estáticos, é hospedado em plataforma de distribuição gratuita, com certificado HTTPS incluído e sem prazo de expiração. Já o </w:t>
+      </w:r>
+      <w:proofErr w:type="spellStart"/>
+      <w:r>
+        <w:rPr>
+          <w:szCs w:val="24"/>
+        </w:rPr>
+        <w:t>back-end</w:t>
+      </w:r>
+      <w:proofErr w:type="spellEnd"/>
+      <w:r>
+        <w:rPr>
+          <w:szCs w:val="24"/>
+        </w:rPr>
+        <w:t xml:space="preserve"> e o banco de dados exigem um servidor em execução contínua, cujo custo é de aproximadamente cinco dólares mensais na </w:t>
+      </w:r>
+      <w:r>
+        <w:rPr>
+          <w:szCs w:val="24"/>
+        </w:rPr>
+        <w:lastRenderedPageBreak/>
+        <w:t>plataforma adotada — valor equivalente a cerca de vinte e cinco reais por mês, rateado entre os quatro integrantes da equipe.</w:t>
       </w:r>
     </w:p>
     <w:p>
@@ -3937,8 +4016,248 @@
         <w:rPr>
           <w:szCs w:val="24"/>
         </w:rPr>
-        <w:t>Dessa forma, o projeto pode ser desenvolvido integralmente sem nenhum investimento financeiro, tornando-o viável dentro das condições de um trabalho de conclusão de curso.</w:t>
-      </w:r>
+        <w:t>Conclui-se que o projeto é financeiramente viável: o custo total de manutenção da aplicação em produção até a apresentação final representa despesa reduzida, compatível com um trabalho acadêmico, e demonstra que uma solução com este porte pode ser mantida por uma pequena empresa a um custo bastante inferior ao das perdas decorrentes do controle manual de EPIs.</w:t>
+      </w:r>
+    </w:p>
+    <w:p>
+      <w:pPr>
+        <w:spacing w:line="360" w:lineRule="auto"/>
+        <w:ind w:firstLine="720"/>
+        <w:jc w:val="both"/>
+        <w:rPr>
+          <w:szCs w:val="24"/>
+        </w:rPr>
+      </w:pPr>
+    </w:p>
+    <w:p>
+      <w:pPr>
+        <w:spacing w:line="360" w:lineRule="auto"/>
+        <w:ind w:firstLine="720"/>
+        <w:jc w:val="both"/>
+        <w:rPr>
+          <w:szCs w:val="24"/>
+        </w:rPr>
+      </w:pPr>
+    </w:p>
+    <w:p>
+      <w:pPr>
+        <w:spacing w:line="360" w:lineRule="auto"/>
+        <w:ind w:firstLine="720"/>
+        <w:jc w:val="both"/>
+        <w:rPr>
+          <w:szCs w:val="24"/>
+        </w:rPr>
+      </w:pPr>
+    </w:p>
+    <w:p>
+      <w:pPr>
+        <w:spacing w:line="360" w:lineRule="auto"/>
+        <w:ind w:firstLine="720"/>
+        <w:jc w:val="both"/>
+        <w:rPr>
+          <w:szCs w:val="24"/>
+        </w:rPr>
+      </w:pPr>
+    </w:p>
+    <w:p>
+      <w:pPr>
+        <w:spacing w:line="360" w:lineRule="auto"/>
+        <w:ind w:firstLine="720"/>
+        <w:jc w:val="both"/>
+        <w:rPr>
+          <w:szCs w:val="24"/>
+        </w:rPr>
+      </w:pPr>
+    </w:p>
+    <w:p>
+      <w:pPr>
+        <w:spacing w:line="360" w:lineRule="auto"/>
+        <w:ind w:firstLine="720"/>
+        <w:jc w:val="both"/>
+        <w:rPr>
+          <w:szCs w:val="24"/>
+        </w:rPr>
+      </w:pPr>
+    </w:p>
+    <w:p>
+      <w:pPr>
+        <w:spacing w:line="360" w:lineRule="auto"/>
+        <w:ind w:firstLine="720"/>
+        <w:jc w:val="both"/>
+        <w:rPr>
+          <w:szCs w:val="24"/>
+        </w:rPr>
+      </w:pPr>
+    </w:p>
+    <w:p>
+      <w:pPr>
+        <w:spacing w:line="360" w:lineRule="auto"/>
+        <w:ind w:firstLine="720"/>
+        <w:jc w:val="both"/>
+        <w:rPr>
+          <w:szCs w:val="24"/>
+        </w:rPr>
+      </w:pPr>
+    </w:p>
+    <w:p>
+      <w:pPr>
+        <w:spacing w:line="360" w:lineRule="auto"/>
+        <w:ind w:firstLine="720"/>
+        <w:jc w:val="both"/>
+        <w:rPr>
+          <w:szCs w:val="24"/>
+        </w:rPr>
+      </w:pPr>
+    </w:p>
+    <w:p>
+      <w:pPr>
+        <w:spacing w:line="360" w:lineRule="auto"/>
+        <w:ind w:firstLine="720"/>
+        <w:jc w:val="both"/>
+        <w:rPr>
+          <w:szCs w:val="24"/>
+        </w:rPr>
+      </w:pPr>
+    </w:p>
+    <w:p>
+      <w:pPr>
+        <w:spacing w:line="360" w:lineRule="auto"/>
+        <w:ind w:firstLine="720"/>
+        <w:jc w:val="both"/>
+        <w:rPr>
+          <w:szCs w:val="24"/>
+        </w:rPr>
+      </w:pPr>
+    </w:p>
+    <w:p>
+      <w:pPr>
+        <w:spacing w:line="360" w:lineRule="auto"/>
+        <w:ind w:firstLine="720"/>
+        <w:jc w:val="both"/>
+        <w:rPr>
+          <w:szCs w:val="24"/>
+        </w:rPr>
+      </w:pPr>
+    </w:p>
+    <w:p>
+      <w:pPr>
+        <w:spacing w:line="360" w:lineRule="auto"/>
+        <w:ind w:firstLine="720"/>
+        <w:jc w:val="both"/>
+        <w:rPr>
+          <w:szCs w:val="24"/>
+        </w:rPr>
+      </w:pPr>
+    </w:p>
+    <w:p>
+      <w:pPr>
+        <w:spacing w:line="360" w:lineRule="auto"/>
+        <w:ind w:firstLine="720"/>
+        <w:jc w:val="both"/>
+        <w:rPr>
+          <w:szCs w:val="24"/>
+        </w:rPr>
+      </w:pPr>
+    </w:p>
+    <w:p>
+      <w:pPr>
+        <w:spacing w:line="360" w:lineRule="auto"/>
+        <w:ind w:firstLine="720"/>
+        <w:jc w:val="both"/>
+        <w:rPr>
+          <w:szCs w:val="24"/>
+        </w:rPr>
+      </w:pPr>
+    </w:p>
+    <w:p>
+      <w:pPr>
+        <w:spacing w:line="360" w:lineRule="auto"/>
+        <w:ind w:firstLine="720"/>
+        <w:jc w:val="both"/>
+        <w:rPr>
+          <w:szCs w:val="24"/>
+        </w:rPr>
+      </w:pPr>
+    </w:p>
+    <w:p>
+      <w:pPr>
+        <w:spacing w:line="360" w:lineRule="auto"/>
+        <w:ind w:firstLine="720"/>
+        <w:jc w:val="both"/>
+        <w:rPr>
+          <w:szCs w:val="24"/>
+        </w:rPr>
+      </w:pPr>
+    </w:p>
+    <w:p>
+      <w:pPr>
+        <w:spacing w:line="360" w:lineRule="auto"/>
+        <w:ind w:firstLine="720"/>
+        <w:jc w:val="both"/>
+        <w:rPr>
+          <w:szCs w:val="24"/>
+        </w:rPr>
+      </w:pPr>
+    </w:p>
+    <w:p>
+      <w:pPr>
+        <w:spacing w:line="360" w:lineRule="auto"/>
+        <w:ind w:firstLine="720"/>
+        <w:jc w:val="both"/>
+        <w:rPr>
+          <w:szCs w:val="24"/>
+        </w:rPr>
+      </w:pPr>
+    </w:p>
+    <w:p>
+      <w:pPr>
+        <w:spacing w:line="360" w:lineRule="auto"/>
+        <w:ind w:firstLine="720"/>
+        <w:jc w:val="both"/>
+        <w:rPr>
+          <w:szCs w:val="24"/>
+        </w:rPr>
+      </w:pPr>
+    </w:p>
+    <w:p>
+      <w:pPr>
+        <w:spacing w:line="360" w:lineRule="auto"/>
+        <w:ind w:firstLine="720"/>
+        <w:jc w:val="both"/>
+        <w:rPr>
+          <w:szCs w:val="24"/>
+        </w:rPr>
+      </w:pPr>
+    </w:p>
+    <w:p>
+      <w:pPr>
+        <w:spacing w:line="360" w:lineRule="auto"/>
+        <w:ind w:firstLine="720"/>
+        <w:jc w:val="both"/>
+        <w:rPr>
+          <w:szCs w:val="24"/>
+        </w:rPr>
+      </w:pPr>
+    </w:p>
+    <w:p>
+      <w:pPr>
+        <w:spacing w:line="360" w:lineRule="auto"/>
+        <w:ind w:firstLine="720"/>
+        <w:jc w:val="both"/>
+        <w:rPr>
+          <w:szCs w:val="24"/>
+        </w:rPr>
+      </w:pPr>
+    </w:p>
+    <w:p>
+      <w:pPr>
+        <w:spacing w:line="360" w:lineRule="auto"/>
+        <w:ind w:firstLine="720"/>
+        <w:jc w:val="both"/>
+        <w:rPr>
+          <w:szCs w:val="24"/>
+        </w:rPr>
+      </w:pPr>
     </w:p>
     <w:p>
       <w:pPr>
@@ -10542,15 +10861,7 @@
                 <w:bCs/>
                 <w:szCs w:val="24"/>
               </w:rPr>
-              <w:t>F1</w:t>
-            </w:r>
-            <w:r>
-              <w:rPr>
-                <w:b/>
-                <w:bCs/>
-                <w:szCs w:val="24"/>
-              </w:rPr>
-              <w:t>4</w:t>
+              <w:t>F14</w:t>
             </w:r>
           </w:p>
         </w:tc>
@@ -11026,15 +11337,7 @@
                 <w:bCs/>
                 <w:szCs w:val="24"/>
               </w:rPr>
-              <w:t>F1</w:t>
-            </w:r>
-            <w:r>
-              <w:rPr>
-                <w:b/>
-                <w:bCs/>
-                <w:szCs w:val="24"/>
-              </w:rPr>
-              <w:t>5</w:t>
+              <w:t>F15</w:t>
             </w:r>
           </w:p>
         </w:tc>
@@ -12225,217 +12528,195 @@
         <w:spacing w:line="360" w:lineRule="auto"/>
         <w:jc w:val="both"/>
         <w:rPr>
-          <w:szCs w:val="24"/>
-        </w:rPr>
-      </w:pPr>
-    </w:p>
-    <w:p>
-      <w:pPr>
-        <w:spacing w:line="360" w:lineRule="auto"/>
-        <w:jc w:val="both"/>
-        <w:rPr>
-          <w:szCs w:val="24"/>
-        </w:rPr>
-      </w:pPr>
-    </w:p>
-    <w:p>
-      <w:pPr>
-        <w:spacing w:line="360" w:lineRule="auto"/>
-        <w:jc w:val="both"/>
-        <w:rPr>
-          <w:szCs w:val="24"/>
-        </w:rPr>
-      </w:pPr>
-    </w:p>
-    <w:p>
-      <w:pPr>
-        <w:spacing w:line="360" w:lineRule="auto"/>
-        <w:jc w:val="both"/>
-        <w:rPr>
-          <w:szCs w:val="24"/>
-        </w:rPr>
-      </w:pPr>
-    </w:p>
-    <w:p>
-      <w:pPr>
-        <w:spacing w:line="360" w:lineRule="auto"/>
-        <w:jc w:val="both"/>
-        <w:rPr>
-          <w:szCs w:val="24"/>
-        </w:rPr>
-      </w:pPr>
-    </w:p>
-    <w:p>
-      <w:pPr>
-        <w:spacing w:line="360" w:lineRule="auto"/>
-        <w:jc w:val="both"/>
-        <w:rPr>
-          <w:szCs w:val="24"/>
-        </w:rPr>
-      </w:pPr>
-    </w:p>
-    <w:p>
-      <w:pPr>
-        <w:spacing w:line="360" w:lineRule="auto"/>
-        <w:jc w:val="both"/>
-        <w:rPr>
-          <w:szCs w:val="24"/>
-        </w:rPr>
-      </w:pPr>
-    </w:p>
-    <w:p>
-      <w:pPr>
-        <w:spacing w:line="360" w:lineRule="auto"/>
-        <w:jc w:val="both"/>
-        <w:rPr>
-          <w:szCs w:val="24"/>
-        </w:rPr>
-      </w:pPr>
-    </w:p>
-    <w:p>
-      <w:pPr>
-        <w:spacing w:line="360" w:lineRule="auto"/>
-        <w:jc w:val="both"/>
-        <w:rPr>
-          <w:szCs w:val="24"/>
-        </w:rPr>
-      </w:pPr>
-    </w:p>
-    <w:p>
-      <w:pPr>
-        <w:spacing w:line="360" w:lineRule="auto"/>
-        <w:jc w:val="both"/>
-        <w:rPr>
-          <w:szCs w:val="24"/>
-        </w:rPr>
-      </w:pPr>
-    </w:p>
-    <w:p>
-      <w:pPr>
-        <w:spacing w:line="360" w:lineRule="auto"/>
-        <w:jc w:val="both"/>
-        <w:rPr>
-          <w:szCs w:val="24"/>
-        </w:rPr>
-      </w:pPr>
-    </w:p>
-    <w:p>
-      <w:pPr>
-        <w:spacing w:line="360" w:lineRule="auto"/>
-        <w:jc w:val="both"/>
-        <w:rPr>
-          <w:szCs w:val="24"/>
-        </w:rPr>
-      </w:pPr>
-    </w:p>
-    <w:p>
-      <w:pPr>
-        <w:spacing w:line="360" w:lineRule="auto"/>
-        <w:jc w:val="both"/>
-        <w:rPr>
-          <w:szCs w:val="24"/>
-        </w:rPr>
-      </w:pPr>
-    </w:p>
-    <w:p>
-      <w:pPr>
-        <w:spacing w:line="360" w:lineRule="auto"/>
-        <w:jc w:val="both"/>
-        <w:rPr>
-          <w:szCs w:val="24"/>
-        </w:rPr>
-      </w:pPr>
-    </w:p>
-    <w:p>
-      <w:pPr>
-        <w:spacing w:line="360" w:lineRule="auto"/>
-        <w:jc w:val="both"/>
-        <w:rPr>
-          <w:szCs w:val="24"/>
-        </w:rPr>
-      </w:pPr>
-    </w:p>
-    <w:p>
-      <w:pPr>
-        <w:spacing w:line="360" w:lineRule="auto"/>
-        <w:jc w:val="both"/>
-        <w:rPr>
-          <w:szCs w:val="24"/>
-        </w:rPr>
-      </w:pPr>
-    </w:p>
-    <w:p>
-      <w:pPr>
-        <w:spacing w:line="360" w:lineRule="auto"/>
-        <w:jc w:val="both"/>
-        <w:rPr>
-          <w:szCs w:val="24"/>
-        </w:rPr>
-      </w:pPr>
-    </w:p>
-    <w:p>
-      <w:pPr>
-        <w:spacing w:line="360" w:lineRule="auto"/>
-        <w:jc w:val="both"/>
-        <w:rPr>
-          <w:szCs w:val="24"/>
-        </w:rPr>
-      </w:pPr>
-    </w:p>
-    <w:p>
-      <w:pPr>
-        <w:spacing w:line="360" w:lineRule="auto"/>
-        <w:jc w:val="both"/>
-        <w:rPr>
-          <w:szCs w:val="24"/>
-        </w:rPr>
-      </w:pPr>
-    </w:p>
-    <w:p>
-      <w:pPr>
-        <w:spacing w:line="360" w:lineRule="auto"/>
-        <w:jc w:val="both"/>
-        <w:rPr>
-          <w:szCs w:val="24"/>
-        </w:rPr>
-      </w:pPr>
-    </w:p>
-    <w:p>
-      <w:pPr>
-        <w:spacing w:line="360" w:lineRule="auto"/>
-        <w:jc w:val="both"/>
-        <w:rPr>
-          <w:szCs w:val="24"/>
-        </w:rPr>
-      </w:pPr>
-    </w:p>
-    <w:p>
-      <w:pPr>
-        <w:spacing w:line="360" w:lineRule="auto"/>
-        <w:jc w:val="both"/>
-        <w:rPr>
-          <w:szCs w:val="24"/>
-        </w:rPr>
-      </w:pPr>
-    </w:p>
-    <w:p>
-      <w:pPr>
-        <w:spacing w:line="360" w:lineRule="auto"/>
-        <w:jc w:val="both"/>
-        <w:rPr>
-          <w:b/>
-          <w:bCs/>
-          <w:szCs w:val="24"/>
-        </w:rPr>
-      </w:pPr>
-    </w:p>
-    <w:p>
-      <w:pPr>
-        <w:spacing w:line="360" w:lineRule="auto"/>
-        <w:jc w:val="both"/>
-        <w:rPr>
-          <w:b/>
-          <w:bCs/>
+          <w:b/>
+          <w:bCs/>
+          <w:szCs w:val="24"/>
+        </w:rPr>
+      </w:pPr>
+      <w:r>
+        <w:rPr>
+          <w:b/>
+          <w:bCs/>
+          <w:szCs w:val="24"/>
+        </w:rPr>
+        <w:t>Hospedagem</w:t>
+      </w:r>
+    </w:p>
+    <w:p>
+      <w:pPr>
+        <w:spacing w:line="360" w:lineRule="auto"/>
+        <w:jc w:val="both"/>
+        <w:rPr>
+          <w:b/>
+          <w:bCs/>
+          <w:szCs w:val="24"/>
+        </w:rPr>
+      </w:pPr>
+      <w:r>
+        <w:rPr>
+          <w:b/>
+          <w:bCs/>
+          <w:szCs w:val="24"/>
+        </w:rPr>
+        <w:tab/>
+      </w:r>
+      <w:r>
+        <w:rPr>
+          <w:szCs w:val="24"/>
+        </w:rPr>
+        <w:t>Para a disponibilização do sistema em ambiente de produção, adotou-se uma arquitetura de hospedagem dividida. O front-</w:t>
+      </w:r>
+      <w:proofErr w:type="spellStart"/>
+      <w:r>
+        <w:rPr>
+          <w:szCs w:val="24"/>
+        </w:rPr>
+        <w:t>end</w:t>
+      </w:r>
+      <w:proofErr w:type="spellEnd"/>
+      <w:r>
+        <w:rPr>
+          <w:szCs w:val="24"/>
+        </w:rPr>
+        <w:t xml:space="preserve">, composto por arquivos estáticos, foi publicado em plataforma de hospedagem de sites estáticos com certificado HTTPS automático. O </w:t>
+      </w:r>
+      <w:proofErr w:type="spellStart"/>
+      <w:r>
+        <w:rPr>
+          <w:szCs w:val="24"/>
+        </w:rPr>
+        <w:t>back-end</w:t>
+      </w:r>
+      <w:proofErr w:type="spellEnd"/>
+      <w:r>
+        <w:rPr>
+          <w:szCs w:val="24"/>
+        </w:rPr>
+        <w:t>, desenvolvido em Node.js, e o banco de dados MySQL foram hospedados em plataforma de aplicações que mantém o servidor em execução contínua, permitindo o acesso à API a qualquer momento. A adoção de HTTPS não é apenas uma exigência de segurança para o tráfego de credenciais: é também requisito técnico para o funcionamento do Progressive Web App, uma vez que os navegadores só permitem o registro de Service Workers em conexões seguras.</w:t>
+      </w:r>
+    </w:p>
+    <w:p>
+      <w:pPr>
+        <w:spacing w:line="360" w:lineRule="auto"/>
+        <w:jc w:val="both"/>
+        <w:rPr>
+          <w:szCs w:val="24"/>
+        </w:rPr>
+      </w:pPr>
+    </w:p>
+    <w:p>
+      <w:pPr>
+        <w:spacing w:line="360" w:lineRule="auto"/>
+        <w:jc w:val="both"/>
+        <w:rPr>
+          <w:szCs w:val="24"/>
+        </w:rPr>
+      </w:pPr>
+    </w:p>
+    <w:p>
+      <w:pPr>
+        <w:spacing w:line="360" w:lineRule="auto"/>
+        <w:jc w:val="both"/>
+        <w:rPr>
+          <w:szCs w:val="24"/>
+        </w:rPr>
+      </w:pPr>
+    </w:p>
+    <w:p>
+      <w:pPr>
+        <w:spacing w:line="360" w:lineRule="auto"/>
+        <w:jc w:val="both"/>
+        <w:rPr>
+          <w:szCs w:val="24"/>
+        </w:rPr>
+      </w:pPr>
+    </w:p>
+    <w:p>
+      <w:pPr>
+        <w:spacing w:line="360" w:lineRule="auto"/>
+        <w:jc w:val="both"/>
+        <w:rPr>
+          <w:szCs w:val="24"/>
+        </w:rPr>
+      </w:pPr>
+    </w:p>
+    <w:p>
+      <w:pPr>
+        <w:spacing w:line="360" w:lineRule="auto"/>
+        <w:jc w:val="both"/>
+        <w:rPr>
+          <w:szCs w:val="24"/>
+        </w:rPr>
+      </w:pPr>
+    </w:p>
+    <w:p>
+      <w:pPr>
+        <w:spacing w:line="360" w:lineRule="auto"/>
+        <w:jc w:val="both"/>
+        <w:rPr>
+          <w:szCs w:val="24"/>
+        </w:rPr>
+      </w:pPr>
+    </w:p>
+    <w:p>
+      <w:pPr>
+        <w:spacing w:line="360" w:lineRule="auto"/>
+        <w:jc w:val="both"/>
+        <w:rPr>
+          <w:szCs w:val="24"/>
+        </w:rPr>
+      </w:pPr>
+    </w:p>
+    <w:p>
+      <w:pPr>
+        <w:spacing w:line="360" w:lineRule="auto"/>
+        <w:jc w:val="both"/>
+        <w:rPr>
+          <w:szCs w:val="24"/>
+        </w:rPr>
+      </w:pPr>
+    </w:p>
+    <w:p>
+      <w:pPr>
+        <w:spacing w:line="360" w:lineRule="auto"/>
+        <w:jc w:val="both"/>
+        <w:rPr>
+          <w:szCs w:val="24"/>
+        </w:rPr>
+      </w:pPr>
+    </w:p>
+    <w:p>
+      <w:pPr>
+        <w:spacing w:line="360" w:lineRule="auto"/>
+        <w:jc w:val="both"/>
+        <w:rPr>
+          <w:szCs w:val="24"/>
+        </w:rPr>
+      </w:pPr>
+    </w:p>
+    <w:p>
+      <w:pPr>
+        <w:spacing w:line="360" w:lineRule="auto"/>
+        <w:jc w:val="both"/>
+        <w:rPr>
+          <w:szCs w:val="24"/>
+        </w:rPr>
+      </w:pPr>
+    </w:p>
+    <w:p>
+      <w:pPr>
+        <w:spacing w:line="360" w:lineRule="auto"/>
+        <w:jc w:val="both"/>
+        <w:rPr>
+          <w:szCs w:val="24"/>
+        </w:rPr>
+      </w:pPr>
+    </w:p>
+    <w:p>
+      <w:pPr>
+        <w:spacing w:line="360" w:lineRule="auto"/>
+        <w:jc w:val="both"/>
+        <w:rPr>
           <w:szCs w:val="24"/>
         </w:rPr>
       </w:pPr>
@@ -13340,23 +13621,13 @@
           <w:szCs w:val="24"/>
         </w:rPr>
       </w:pPr>
-    </w:p>
-    <w:p>
-      <w:pPr>
-        <w:spacing w:line="360" w:lineRule="auto"/>
-        <w:jc w:val="both"/>
-        <w:rPr>
-          <w:b/>
-          <w:bCs/>
-          <w:szCs w:val="24"/>
-        </w:rPr>
-      </w:pPr>
-      <w:r>
-        <w:rPr>
-          <w:b/>
-          <w:bCs/>
-          <w:szCs w:val="24"/>
-        </w:rPr>
+      <w:r>
+        <w:rPr>
+          <w:b/>
+          <w:bCs/>
+          <w:szCs w:val="24"/>
+        </w:rPr>
+        <w:lastRenderedPageBreak/>
         <w:t>12 IDENTIDADE VISUAL</w:t>
       </w:r>
     </w:p>
@@ -13514,6 +13785,17 @@
         </w:rPr>
         <w:t>A interface foi projetada para ser totalmente responsiva, adaptando-se a diferentes tamanhos de tela. Em dispositivos móveis, o sistema será acessível por meio do Progressive Web App (PWA), mantendo a mesma identidade visual da versão web.</w:t>
       </w:r>
+    </w:p>
+    <w:p>
+      <w:pPr>
+        <w:spacing w:line="360" w:lineRule="auto"/>
+        <w:jc w:val="both"/>
+        <w:rPr>
+          <w:b/>
+          <w:bCs/>
+          <w:szCs w:val="24"/>
+        </w:rPr>
+      </w:pPr>
     </w:p>
     <w:p>
       <w:pPr>

</xml_diff>